<commit_message>
Pack 47.2: Sber statement v2 — category + running_balance + Sber formatter
</commit_message>
<xml_diff>
--- a/templates/docx/bank_statement_template_044525225.docx
+++ b/templates/docx/bank_statement_template_044525225.docx
@@ -89,100 +89,18 @@
               <w:spacing w:before="0" w:after="40"/>
             </w:pPr>
             <w:r>
-              <w:drawing>
-                <wp:inline xmlns:a="http://schemas.openxmlformats.org/drawingml/2006/main" xmlns:pic="http://schemas.openxmlformats.org/drawingml/2006/picture">
-                  <wp:extent cx="79083" cy="114300"/>
-                  <wp:docPr id="2" name="Picture 2"/>
-                  <wp:cNvGraphicFramePr>
-                    <a:graphicFrameLocks noChangeAspect="1"/>
-                  </wp:cNvGraphicFramePr>
-                  <a:graphic>
-                    <a:graphicData uri="http://schemas.openxmlformats.org/drawingml/2006/picture">
-                      <pic:pic>
-                        <pic:nvPicPr>
-                          <pic:cNvPr id="0" name="icon_phone.png"/>
-                          <pic:cNvPicPr/>
-                        </pic:nvPicPr>
-                        <pic:blipFill>
-                          <a:blip r:embed="rId10"/>
-                          <a:stretch>
-                            <a:fillRect/>
-                          </a:stretch>
-                        </pic:blipFill>
-                        <pic:spPr>
-                          <a:xfrm>
-                            <a:off x="0" y="0"/>
-                            <a:ext cx="79083" cy="114300"/>
-                          </a:xfrm>
-                          <a:prstGeom prst="rect"/>
-                        </pic:spPr>
-                      </pic:pic>
-                    </a:graphicData>
-                  </a:graphic>
-                </wp:inline>
-              </w:drawing>
-            </w:r>
-            <w:r>
-              <w:t xml:space="preserve">  </w:t>
-            </w:r>
-            <w:r>
               <w:rPr>
                 <w:rFonts w:ascii="Arial" w:hAnsi="Arial" w:cs="Arial"/>
                 <w:color w:val="1A1A1A"/>
                 <w:sz w:val="16"/>
               </w:rPr>
-              <w:t xml:space="preserve">900   </w:t>
-            </w:r>
-            <w:r>
-              <w:rPr>
-                <w:rFonts w:ascii="Arial" w:hAnsi="Arial" w:cs="Arial"/>
-                <w:color w:val="1A1A1A"/>
-                <w:sz w:val="16"/>
-              </w:rPr>
-              <w:t>www.sberbank.ru</w:t>
+              <w:t>900    www.sberbank.ru</w:t>
             </w:r>
           </w:p>
           <w:p>
             <w:pPr>
               <w:spacing w:before="40" w:after="0"/>
             </w:pPr>
-            <w:r>
-              <w:drawing>
-                <wp:inline xmlns:a="http://schemas.openxmlformats.org/drawingml/2006/main" xmlns:pic="http://schemas.openxmlformats.org/drawingml/2006/picture">
-                  <wp:extent cx="91440" cy="114300"/>
-                  <wp:docPr id="3" name="Picture 3"/>
-                  <wp:cNvGraphicFramePr>
-                    <a:graphicFrameLocks noChangeAspect="1"/>
-                  </wp:cNvGraphicFramePr>
-                  <a:graphic>
-                    <a:graphicData uri="http://schemas.openxmlformats.org/drawingml/2006/picture">
-                      <pic:pic>
-                        <pic:nvPicPr>
-                          <pic:cNvPr id="0" name="icon_pin.png"/>
-                          <pic:cNvPicPr/>
-                        </pic:nvPicPr>
-                        <pic:blipFill>
-                          <a:blip r:embed="rId11"/>
-                          <a:stretch>
-                            <a:fillRect/>
-                          </a:stretch>
-                        </pic:blipFill>
-                        <pic:spPr>
-                          <a:xfrm>
-                            <a:off x="0" y="0"/>
-                            <a:ext cx="91440" cy="114300"/>
-                          </a:xfrm>
-                          <a:prstGeom prst="rect"/>
-                        </pic:spPr>
-                      </pic:pic>
-                    </a:graphicData>
-                  </a:graphic>
-                </wp:inline>
-              </w:drawing>
-            </w:r>
-            <w:r>
-              <w:t xml:space="preserve">  </w:t>
-            </w:r>
             <w:r>
               <w:rPr>
                 <w:rFonts w:ascii="Arial" w:hAnsi="Arial" w:cs="Arial"/>
@@ -223,28 +141,28 @@
     </w:tbl>
     <w:p>
       <w:pPr>
-        <w:spacing w:before="480" w:after="120"/>
+        <w:spacing w:before="360" w:after="80"/>
       </w:pPr>
       <w:r>
         <w:rPr>
           <w:rFonts w:ascii="Arial" w:hAnsi="Arial" w:cs="Arial"/>
           <w:b/>
           <w:color w:val="1A1A1A"/>
-          <w:sz w:val="44"/>
+          <w:sz w:val="32"/>
         </w:rPr>
         <w:t>Выписка по платёжному счёту</w:t>
       </w:r>
     </w:p>
     <w:p>
       <w:pPr>
-        <w:spacing w:before="0" w:after="360"/>
+        <w:spacing w:before="0" w:after="240"/>
       </w:pPr>
       <w:r>
         <w:rPr>
           <w:rFonts w:ascii="Arial" w:hAnsi="Arial" w:cs="Arial"/>
           <w:b/>
           <w:color w:val="1A1A1A"/>
-          <w:sz w:val="20"/>
+          <w:sz w:val="18"/>
         </w:rPr>
         <w:t>За период {{ bank.period_start_formatted }} — {{ bank.period_end_formatted }}</w:t>
       </w:r>
@@ -272,10 +190,10 @@
           <w:tcPr>
             <w:tcW w:type="dxa" w:w="5385"/>
             <w:tcMar>
-              <w:top w:w="140" w:type="dxa"/>
-              <w:bottom w:w="140" w:type="dxa"/>
-              <w:left w:w="160" w:type="dxa"/>
-              <w:right w:w="160" w:type="dxa"/>
+              <w:top w:w="120" w:type="dxa"/>
+              <w:bottom w:w="120" w:type="dxa"/>
+              <w:left w:w="140" w:type="dxa"/>
+              <w:right w:w="140" w:type="dxa"/>
             </w:tcMar>
             <w:shd w:val="clear" w:color="auto" w:fill="F5F5F5"/>
             <w:vAlign w:val="top"/>
@@ -295,7 +213,7 @@
           </w:p>
           <w:p>
             <w:pPr>
-              <w:spacing w:before="0" w:after="160"/>
+              <w:spacing w:before="0" w:after="120"/>
             </w:pPr>
             <w:r>
               <w:rPr>
@@ -309,7 +227,7 @@
           </w:p>
           <w:p>
             <w:pPr>
-              <w:spacing w:before="0" w:after="200"/>
+              <w:spacing w:before="0" w:after="160"/>
               <w:pBdr>
                 <w:bottom w:val="single" w:sz="4" w:space="1" w:color="D8D8D8"/>
               </w:pBdr>
@@ -330,7 +248,7 @@
           </w:p>
           <w:p>
             <w:pPr>
-              <w:spacing w:before="0" w:after="160"/>
+              <w:spacing w:before="0" w:after="120"/>
             </w:pPr>
             <w:r>
               <w:rPr>
@@ -357,7 +275,7 @@
           </w:p>
           <w:p>
             <w:pPr>
-              <w:spacing w:before="0" w:after="160"/>
+              <w:spacing w:before="0" w:after="120"/>
             </w:pPr>
             <w:r>
               <w:rPr>
@@ -383,7 +301,7 @@
           </w:p>
           <w:p>
             <w:pPr>
-              <w:spacing w:before="0" w:after="160"/>
+              <w:spacing w:before="0" w:after="120"/>
             </w:pPr>
             <w:r>
               <w:rPr>
@@ -409,7 +327,7 @@
           </w:p>
           <w:p>
             <w:pPr>
-              <w:spacing w:before="0" w:after="160"/>
+              <w:spacing w:before="0" w:after="120"/>
             </w:pPr>
             <w:r>
               <w:rPr>
@@ -425,10 +343,10 @@
           <w:tcPr>
             <w:tcW w:type="dxa" w:w="4818"/>
             <w:tcMar>
-              <w:top w:w="140" w:type="dxa"/>
-              <w:bottom w:w="140" w:type="dxa"/>
-              <w:left w:w="160" w:type="dxa"/>
-              <w:right w:w="160" w:type="dxa"/>
+              <w:top w:w="120" w:type="dxa"/>
+              <w:bottom w:w="120" w:type="dxa"/>
+              <w:left w:w="140" w:type="dxa"/>
+              <w:right w:w="140" w:type="dxa"/>
             </w:tcMar>
             <w:vAlign w:val="top"/>
           </w:tcPr>
@@ -448,7 +366,7 @@
           </w:p>
           <w:p>
             <w:pPr>
-              <w:spacing w:before="0" w:after="160"/>
+              <w:spacing w:before="0" w:after="120"/>
               <w:pBdr>
                 <w:bottom w:val="single" w:sz="6" w:space="1" w:color="21A038"/>
               </w:pBdr>
@@ -673,7 +591,7 @@
           <w:p/>
           <w:p>
             <w:pPr>
-              <w:spacing w:before="80" w:after="80"/>
+              <w:spacing w:before="40" w:after="40"/>
               <w:pBdr>
                 <w:bottom w:val="single" w:sz="4" w:space="1" w:color="BDBDBD"/>
               </w:pBdr>
@@ -757,7 +675,7 @@
     </w:tbl>
     <w:p>
       <w:pPr>
-        <w:spacing w:before="480" w:after="200"/>
+        <w:spacing w:before="400" w:after="160"/>
         <w:keepNext/>
       </w:pPr>
       <w:r>
@@ -772,10 +690,10 @@
     </w:p>
     <w:tbl>
       <w:tblGrid>
-        <w:gridCol w:w="1814"/>
-        <w:gridCol w:w="4422"/>
+        <w:gridCol w:w="1587"/>
+        <w:gridCol w:w="4535"/>
         <w:gridCol w:w="2040"/>
-        <w:gridCol w:w="1927"/>
+        <w:gridCol w:w="2040"/>
       </w:tblGrid>
       <w:tblPr>
         <w:tblW w:type="auto" w:w="0"/>
@@ -793,12 +711,12 @@
       <w:tr>
         <w:tc>
           <w:tcPr>
-            <w:tcW w:type="dxa" w:w="1814"/>
+            <w:tcW w:type="dxa" w:w="1587"/>
             <w:tcMar>
               <w:top w:w="40" w:type="dxa"/>
-              <w:bottom w:w="40" w:type="dxa"/>
+              <w:bottom w:w="60" w:type="dxa"/>
               <w:left w:w="0" w:type="dxa"/>
-              <w:right w:w="80" w:type="dxa"/>
+              <w:right w:w="60" w:type="dxa"/>
             </w:tcMar>
             <w:tcBorders>
               <w:bottom w:val="single" w:sz="4" w:color="BDBDBD" w:space="0"/>
@@ -856,12 +774,12 @@
         </w:tc>
         <w:tc>
           <w:tcPr>
-            <w:tcW w:type="dxa" w:w="4422"/>
+            <w:tcW w:type="dxa" w:w="4535"/>
             <w:tcMar>
               <w:top w:w="40" w:type="dxa"/>
-              <w:bottom w:w="40" w:type="dxa"/>
+              <w:bottom w:w="60" w:type="dxa"/>
               <w:left w:w="0" w:type="dxa"/>
-              <w:right w:w="80" w:type="dxa"/>
+              <w:right w:w="60" w:type="dxa"/>
             </w:tcMar>
             <w:tcBorders>
               <w:bottom w:val="single" w:sz="4" w:color="BDBDBD" w:space="0"/>
@@ -900,9 +818,9 @@
             <w:tcW w:type="dxa" w:w="2040"/>
             <w:tcMar>
               <w:top w:w="40" w:type="dxa"/>
-              <w:bottom w:w="40" w:type="dxa"/>
+              <w:bottom w:w="60" w:type="dxa"/>
               <w:left w:w="0" w:type="dxa"/>
-              <w:right w:w="80" w:type="dxa"/>
+              <w:right w:w="60" w:type="dxa"/>
             </w:tcMar>
             <w:tcBorders>
               <w:bottom w:val="single" w:sz="4" w:color="BDBDBD" w:space="0"/>
@@ -963,12 +881,12 @@
         </w:tc>
         <w:tc>
           <w:tcPr>
-            <w:tcW w:type="dxa" w:w="1927"/>
+            <w:tcW w:type="dxa" w:w="2040"/>
             <w:tcMar>
               <w:top w:w="40" w:type="dxa"/>
-              <w:bottom w:w="40" w:type="dxa"/>
+              <w:bottom w:w="60" w:type="dxa"/>
               <w:left w:w="0" w:type="dxa"/>
-              <w:right w:w="80" w:type="dxa"/>
+              <w:right w:w="60" w:type="dxa"/>
             </w:tcMar>
             <w:tcBorders>
               <w:bottom w:val="single" w:sz="4" w:color="BDBDBD" w:space="0"/>
@@ -1008,17 +926,17 @@
       <w:tr>
         <w:tc>
           <w:tcPr>
-            <w:tcW w:type="dxa" w:w="1814"/>
+            <w:tcW w:type="dxa" w:w="1587"/>
             <w:tcMar>
-              <w:top w:w="80" w:type="dxa"/>
-              <w:bottom w:w="80" w:type="dxa"/>
+              <w:top w:w="140" w:type="dxa"/>
+              <w:bottom w:w="140" w:type="dxa"/>
               <w:left w:w="0" w:type="dxa"/>
-              <w:right w:w="80" w:type="dxa"/>
+              <w:right w:w="60" w:type="dxa"/>
             </w:tcMar>
           </w:tcPr>
           <w:p>
             <w:pPr>
-              <w:spacing w:before="0" w:after="0"/>
+              <w:spacing w:before="0" w:after="40"/>
             </w:pPr>
             <w:r>
               <w:rPr>
@@ -1046,14 +964,28 @@
         </w:tc>
         <w:tc>
           <w:tcPr>
-            <w:tcW w:type="dxa" w:w="4422"/>
+            <w:tcW w:type="dxa" w:w="4535"/>
             <w:tcMar>
-              <w:top w:w="80" w:type="dxa"/>
-              <w:bottom w:w="80" w:type="dxa"/>
+              <w:top w:w="140" w:type="dxa"/>
+              <w:bottom w:w="140" w:type="dxa"/>
               <w:left w:w="0" w:type="dxa"/>
-              <w:right w:w="80" w:type="dxa"/>
+              <w:right w:w="60" w:type="dxa"/>
             </w:tcMar>
           </w:tcPr>
+          <w:p>
+            <w:pPr>
+              <w:spacing w:before="0" w:after="40"/>
+            </w:pPr>
+            <w:r>
+              <w:rPr>
+                <w:rFonts w:ascii="Arial" w:hAnsi="Arial" w:cs="Arial"/>
+                <w:b/>
+                <w:color w:val="1A1A1A"/>
+                <w:sz w:val="18"/>
+              </w:rPr>
+              <w:t>__TX_CATEGORY__</w:t>
+            </w:r>
+          </w:p>
           <w:p>
             <w:pPr>
               <w:spacing w:before="0" w:after="0"/>
@@ -1062,7 +994,7 @@
               <w:rPr>
                 <w:rFonts w:ascii="Arial" w:hAnsi="Arial" w:cs="Arial"/>
                 <w:color w:val="1A1A1A"/>
-                <w:sz w:val="18"/>
+                <w:sz w:val="16"/>
               </w:rPr>
               <w:t>__TX_DESCRIPTION__</w:t>
             </w:r>
@@ -1072,10 +1004,10 @@
           <w:tcPr>
             <w:tcW w:type="dxa" w:w="2040"/>
             <w:tcMar>
-              <w:top w:w="80" w:type="dxa"/>
-              <w:bottom w:w="80" w:type="dxa"/>
+              <w:top w:w="140" w:type="dxa"/>
+              <w:bottom w:w="140" w:type="dxa"/>
               <w:left w:w="0" w:type="dxa"/>
-              <w:right w:w="80" w:type="dxa"/>
+              <w:right w:w="60" w:type="dxa"/>
             </w:tcMar>
           </w:tcPr>
           <w:p>
@@ -1095,12 +1027,12 @@
         </w:tc>
         <w:tc>
           <w:tcPr>
-            <w:tcW w:type="dxa" w:w="1927"/>
+            <w:tcW w:type="dxa" w:w="2040"/>
             <w:tcMar>
-              <w:top w:w="80" w:type="dxa"/>
-              <w:bottom w:w="80" w:type="dxa"/>
+              <w:top w:w="140" w:type="dxa"/>
+              <w:bottom w:w="140" w:type="dxa"/>
               <w:left w:w="0" w:type="dxa"/>
-              <w:right w:w="80" w:type="dxa"/>
+              <w:right w:w="60" w:type="dxa"/>
             </w:tcMar>
           </w:tcPr>
           <w:p>
@@ -1114,6 +1046,7 @@
                 <w:color w:val="1A1A1A"/>
                 <w:sz w:val="18"/>
               </w:rPr>
+              <w:t>__TX_BALANCE__</w:t>
             </w:r>
           </w:p>
         </w:tc>
@@ -1122,7 +1055,7 @@
     <w:p>
       <w:pPr>
         <w:jc w:val="center"/>
-        <w:spacing w:before="160" w:after="160"/>
+        <w:spacing w:before="240" w:after="160"/>
         <w:pBdr>
           <w:bottom w:val="single" w:sz="4" w:space="1" w:color="D8D8D8"/>
         </w:pBdr>
@@ -1134,14 +1067,6 @@
           <w:sz w:val="16"/>
         </w:rPr>
         <w:t>Продолжение на следующей странице</w:t>
-      </w:r>
-    </w:p>
-    <w:p>
-      <w:pPr>
-        <w:spacing w:before="360" w:after="120"/>
-      </w:pPr>
-      <w:r>
-        <w:br/>
       </w:r>
     </w:p>
     <w:tbl>
@@ -1176,7 +1101,7 @@
           </w:tcPr>
           <w:p>
             <w:pPr>
-              <w:spacing w:before="360" w:after="0"/>
+              <w:spacing w:before="240" w:after="0"/>
             </w:pPr>
             <w:r>
               <w:rPr>
@@ -1252,7 +1177,7 @@
                     <w:drawing>
                       <wp:inline xmlns:a="http://schemas.openxmlformats.org/drawingml/2006/main" xmlns:pic="http://schemas.openxmlformats.org/drawingml/2006/picture">
                         <wp:extent cx="576000" cy="156646"/>
-                        <wp:docPr id="4" name="Picture 4"/>
+                        <wp:docPr id="2" name="Picture 2"/>
                         <wp:cNvGraphicFramePr>
                           <a:graphicFrameLocks noChangeAspect="1"/>
                         </wp:cNvGraphicFramePr>
@@ -1618,7 +1543,7 @@
     </w:tbl>
     <w:p>
       <w:pPr>
-        <w:spacing w:before="480" w:after="160"/>
+        <w:spacing w:before="360" w:after="120"/>
         <w:pBdr>
           <w:bottom w:val="single" w:sz="4" w:space="1" w:color="BDBDBD"/>
         </w:pBdr>

</xml_diff>

<commit_message>
Pack 47.3: Sber statement v3 cosmetics (border, dashed, EP frame, header, no gray shading)
</commit_message>
<xml_diff>
--- a/templates/docx/bank_statement_template_044525225.docx
+++ b/templates/docx/bank_statement_template_044525225.docx
@@ -53,7 +53,7 @@
                           <pic:cNvPicPr/>
                         </pic:nvPicPr>
                         <pic:blipFill>
-                          <a:blip r:embed="rId9"/>
+                          <a:blip r:embed="rId11"/>
                           <a:stretch>
                             <a:fillRect/>
                           </a:stretch>
@@ -192,10 +192,16 @@
             <w:tcMar>
               <w:top w:w="120" w:type="dxa"/>
               <w:bottom w:w="120" w:type="dxa"/>
-              <w:left w:w="140" w:type="dxa"/>
-              <w:right w:w="140" w:type="dxa"/>
+              <w:left w:w="160" w:type="dxa"/>
+              <w:right w:w="160" w:type="dxa"/>
             </w:tcMar>
             <w:shd w:val="clear" w:color="auto" w:fill="F5F5F5"/>
+            <w:tcBorders>
+              <w:top w:val="single" w:sz="4" w:color="D8D8D8" w:space="0"/>
+              <w:bottom w:val="single" w:sz="4" w:color="D8D8D8" w:space="0"/>
+              <w:left w:val="single" w:sz="4" w:color="D8D8D8" w:space="0"/>
+              <w:right w:val="single" w:sz="4" w:color="D8D8D8" w:space="0"/>
+            </w:tcBorders>
             <w:vAlign w:val="top"/>
           </w:tcPr>
           <w:p>
@@ -227,9 +233,9 @@
           </w:p>
           <w:p>
             <w:pPr>
-              <w:spacing w:before="0" w:after="160"/>
+              <w:spacing w:before="0" w:after="200"/>
               <w:pBdr>
-                <w:bottom w:val="single" w:sz="4" w:space="1" w:color="D8D8D8"/>
+                <w:bottom w:val="dashed" w:sz="4" w:space="1" w:color="808080"/>
               </w:pBdr>
             </w:pPr>
           </w:p>
@@ -345,8 +351,8 @@
             <w:tcMar>
               <w:top w:w="120" w:type="dxa"/>
               <w:bottom w:w="120" w:type="dxa"/>
-              <w:left w:w="140" w:type="dxa"/>
-              <w:right w:w="140" w:type="dxa"/>
+              <w:left w:w="160" w:type="dxa"/>
+              <w:right w:w="160" w:type="dxa"/>
             </w:tcMar>
             <w:vAlign w:val="top"/>
           </w:tcPr>
@@ -1141,128 +1147,6 @@
           <w:p/>
           <w:tbl>
             <w:tblGrid>
-              <w:gridCol w:w="1247"/>
-              <w:gridCol w:w="4422"/>
-            </w:tblGrid>
-            <w:tblPr>
-              <w:tblW w:type="auto" w:w="0"/>
-              <w:tblLayout w:type="fixed"/>
-              <w:tblLook w:firstColumn="1" w:firstRow="1" w:lastColumn="0" w:lastRow="0" w:noHBand="0" w:noVBand="1" w:val="04A0"/>
-              <w:tblBorders>
-                <w:top w:val="nil"/>
-                <w:left w:val="nil"/>
-                <w:bottom w:val="nil"/>
-                <w:right w:val="nil"/>
-                <w:insideH w:val="nil"/>
-                <w:insideV w:val="nil"/>
-              </w:tblBorders>
-            </w:tblPr>
-            <w:tr>
-              <w:tc>
-                <w:tcPr>
-                  <w:tcW w:type="dxa" w:w="1247"/>
-                  <w:shd w:val="clear" w:color="auto" w:fill="EAF3FA"/>
-                  <w:tcMar>
-                    <w:top w:w="60" w:type="dxa"/>
-                    <w:bottom w:w="60" w:type="dxa"/>
-                    <w:left w:w="80" w:type="dxa"/>
-                    <w:right w:w="40" w:type="dxa"/>
-                  </w:tcMar>
-                </w:tcPr>
-                <w:p>
-                  <w:pPr>
-                    <w:spacing w:before="0" w:after="0"/>
-                  </w:pPr>
-                  <w:r>
-                    <w:drawing>
-                      <wp:inline xmlns:a="http://schemas.openxmlformats.org/drawingml/2006/main" xmlns:pic="http://schemas.openxmlformats.org/drawingml/2006/picture">
-                        <wp:extent cx="576000" cy="156646"/>
-                        <wp:docPr id="2" name="Picture 2"/>
-                        <wp:cNvGraphicFramePr>
-                          <a:graphicFrameLocks noChangeAspect="1"/>
-                        </wp:cNvGraphicFramePr>
-                        <a:graphic>
-                          <a:graphicData uri="http://schemas.openxmlformats.org/drawingml/2006/picture">
-                            <pic:pic>
-                              <pic:nvPicPr>
-                                <pic:cNvPr id="0" name="sber_logo.png"/>
-                                <pic:cNvPicPr/>
-                              </pic:nvPicPr>
-                              <pic:blipFill>
-                                <a:blip r:embed="rId9"/>
-                                <a:stretch>
-                                  <a:fillRect/>
-                                </a:stretch>
-                              </pic:blipFill>
-                              <pic:spPr>
-                                <a:xfrm>
-                                  <a:off x="0" y="0"/>
-                                  <a:ext cx="576000" cy="156646"/>
-                                </a:xfrm>
-                                <a:prstGeom prst="rect"/>
-                              </pic:spPr>
-                            </pic:pic>
-                          </a:graphicData>
-                        </a:graphic>
-                      </wp:inline>
-                    </w:drawing>
-                  </w:r>
-                </w:p>
-              </w:tc>
-              <w:tc>
-                <w:tcPr>
-                  <w:tcW w:type="dxa" w:w="4422"/>
-                  <w:shd w:val="clear" w:color="auto" w:fill="EAF3FA"/>
-                  <w:tcMar>
-                    <w:top w:w="60" w:type="dxa"/>
-                    <w:bottom w:w="60" w:type="dxa"/>
-                    <w:left w:w="40" w:type="dxa"/>
-                    <w:right w:w="80" w:type="dxa"/>
-                  </w:tcMar>
-                </w:tcPr>
-                <w:p>
-                  <w:pPr>
-                    <w:spacing w:before="0" w:after="0"/>
-                  </w:pPr>
-                  <w:r>
-                    <w:rPr>
-                      <w:rFonts w:ascii="Arial" w:hAnsi="Arial" w:cs="Arial"/>
-                      <w:b/>
-                      <w:color w:val="296FCE"/>
-                      <w:sz w:val="16"/>
-                    </w:rPr>
-                    <w:t>Документ подписан</w:t>
-                  </w:r>
-                </w:p>
-                <w:p>
-                  <w:pPr>
-                    <w:spacing w:before="0" w:after="0"/>
-                  </w:pPr>
-                  <w:r>
-                    <w:rPr>
-                      <w:rFonts w:ascii="Arial" w:hAnsi="Arial" w:cs="Arial"/>
-                      <w:b/>
-                      <w:color w:val="296FCE"/>
-                      <w:sz w:val="16"/>
-                    </w:rPr>
-                    <w:t>электронной подписью</w:t>
-                  </w:r>
-                  <w:r>
-                    <w:rPr>
-                      <w:rFonts w:ascii="Arial" w:hAnsi="Arial" w:cs="Arial"/>
-                      <w:color w:val="296FCE"/>
-                      <w:sz w:val="12"/>
-                      <w:vertAlign w:val="superscript"/>
-                    </w:rPr>
-                    <w:t>*</w:t>
-                  </w:r>
-                </w:p>
-              </w:tc>
-            </w:tr>
-          </w:tbl>
-          <w:p/>
-          <w:tbl>
-            <w:tblGrid>
               <w:gridCol w:w="5669"/>
             </w:tblGrid>
             <w:tblPr>
@@ -1270,10 +1154,10 @@
               <w:tblLayout w:type="fixed"/>
               <w:tblLook w:firstColumn="1" w:firstRow="1" w:lastColumn="0" w:lastRow="0" w:noHBand="0" w:noVBand="1" w:val="04A0"/>
               <w:tblBorders>
-                <w:top w:val="nil"/>
-                <w:left w:val="nil"/>
-                <w:bottom w:val="nil"/>
-                <w:right w:val="nil"/>
+                <w:top w:val="single" w:sz="6" w:space="0" w:color="296FCE"/>
+                <w:left w:val="single" w:sz="6" w:space="0" w:color="296FCE"/>
+                <w:bottom w:val="single" w:sz="6" w:space="0" w:color="296FCE"/>
+                <w:right w:val="single" w:sz="6" w:space="0" w:color="296FCE"/>
                 <w:insideH w:val="nil"/>
                 <w:insideV w:val="nil"/>
               </w:tblBorders>
@@ -1282,258 +1166,413 @@
               <w:tc>
                 <w:tcPr>
                   <w:tcW w:type="dxa" w:w="5669"/>
-                  <w:shd w:val="clear" w:color="auto" w:fill="296FCE"/>
                   <w:tcMar>
-                    <w:top w:w="40" w:type="dxa"/>
-                    <w:bottom w:w="40" w:type="dxa"/>
-                    <w:left w:w="80" w:type="dxa"/>
-                    <w:right w:w="80" w:type="dxa"/>
+                    <w:top w:w="0" w:type="dxa"/>
+                    <w:bottom w:w="0" w:type="dxa"/>
+                    <w:left w:w="0" w:type="dxa"/>
+                    <w:right w:w="0" w:type="dxa"/>
                   </w:tcMar>
                 </w:tcPr>
-                <w:p>
-                  <w:pPr>
-                    <w:jc w:val="center"/>
-                    <w:spacing w:before="0" w:after="0"/>
-                  </w:pPr>
-                  <w:r>
-                    <w:rPr>
-                      <w:rFonts w:ascii="Arial" w:hAnsi="Arial" w:cs="Arial"/>
-                      <w:b/>
-                      <w:color w:val="FFFFFF"/>
-                      <w:sz w:val="16"/>
-                    </w:rPr>
-                    <w:t>СВЕДЕНИЯ О СЕРТИФИКАТЕ ЭП</w:t>
-                  </w:r>
-                </w:p>
-              </w:tc>
-            </w:tr>
-          </w:tbl>
-          <w:p/>
-          <w:tbl>
-            <w:tblGrid>
-              <w:gridCol w:w="1587"/>
-              <w:gridCol w:w="4081"/>
-            </w:tblGrid>
-            <w:tblPr>
-              <w:tblW w:type="auto" w:w="0"/>
-              <w:tblLayout w:type="fixed"/>
-              <w:tblLook w:firstColumn="1" w:firstRow="1" w:lastColumn="0" w:lastRow="0" w:noHBand="0" w:noVBand="1" w:val="04A0"/>
-              <w:tblBorders>
-                <w:top w:val="nil"/>
-                <w:left w:val="nil"/>
-                <w:bottom w:val="nil"/>
-                <w:right w:val="nil"/>
-                <w:insideH w:val="nil"/>
-                <w:insideV w:val="nil"/>
-              </w:tblBorders>
-            </w:tblPr>
-            <w:tr>
-              <w:tc>
-                <w:tcPr>
-                  <w:tcW w:type="dxa" w:w="1587"/>
-                  <w:tcMar>
-                    <w:top w:w="20" w:type="dxa"/>
-                    <w:bottom w:w="20" w:type="dxa"/>
-                    <w:left w:w="80" w:type="dxa"/>
-                    <w:right w:w="80" w:type="dxa"/>
-                  </w:tcMar>
-                  <w:shd w:val="clear" w:color="auto" w:fill="EAF3FA"/>
-                </w:tcPr>
-                <w:p>
-                  <w:pPr>
-                    <w:spacing w:before="0" w:after="0"/>
-                  </w:pPr>
-                  <w:r>
-                    <w:rPr>
-                      <w:rFonts w:ascii="Arial" w:hAnsi="Arial" w:cs="Arial"/>
-                      <w:color w:val="296FCE"/>
-                      <w:sz w:val="16"/>
-                    </w:rPr>
-                    <w:t>Сертификат:</w:t>
-                  </w:r>
-                </w:p>
-              </w:tc>
-              <w:tc>
-                <w:tcPr>
-                  <w:tcW w:type="dxa" w:w="4081"/>
-                  <w:tcMar>
-                    <w:top w:w="20" w:type="dxa"/>
-                    <w:bottom w:w="20" w:type="dxa"/>
-                    <w:left w:w="80" w:type="dxa"/>
-                    <w:right w:w="80" w:type="dxa"/>
-                  </w:tcMar>
-                  <w:shd w:val="clear" w:color="auto" w:fill="EAF3FA"/>
-                </w:tcPr>
-                <w:p>
-                  <w:pPr>
-                    <w:spacing w:before="0" w:after="0"/>
-                  </w:pPr>
-                  <w:r>
-                    <w:rPr>
-                      <w:rFonts w:ascii="Arial" w:hAnsi="Arial" w:cs="Arial"/>
-                      <w:color w:val="1A1A1A"/>
-                      <w:sz w:val="16"/>
-                    </w:rPr>
-                    <w:t>40601D00C08FCE2CD999F93A68651986</w:t>
-                  </w:r>
-                </w:p>
-              </w:tc>
-            </w:tr>
-            <w:tr>
-              <w:tc>
-                <w:tcPr>
-                  <w:tcW w:type="dxa" w:w="1587"/>
-                  <w:tcMar>
-                    <w:top w:w="20" w:type="dxa"/>
-                    <w:bottom w:w="20" w:type="dxa"/>
-                    <w:left w:w="80" w:type="dxa"/>
-                    <w:right w:w="80" w:type="dxa"/>
-                  </w:tcMar>
-                  <w:shd w:val="clear" w:color="auto" w:fill="EAF3FA"/>
-                </w:tcPr>
-                <w:p>
-                  <w:pPr>
-                    <w:spacing w:before="0" w:after="0"/>
-                  </w:pPr>
-                  <w:r>
-                    <w:rPr>
-                      <w:rFonts w:ascii="Arial" w:hAnsi="Arial" w:cs="Arial"/>
-                      <w:color w:val="296FCE"/>
-                      <w:sz w:val="16"/>
-                    </w:rPr>
-                    <w:t>Владелец:</w:t>
-                  </w:r>
-                </w:p>
-              </w:tc>
-              <w:tc>
-                <w:tcPr>
-                  <w:tcW w:type="dxa" w:w="4081"/>
-                  <w:tcMar>
-                    <w:top w:w="20" w:type="dxa"/>
-                    <w:bottom w:w="20" w:type="dxa"/>
-                    <w:left w:w="80" w:type="dxa"/>
-                    <w:right w:w="80" w:type="dxa"/>
-                  </w:tcMar>
-                  <w:shd w:val="clear" w:color="auto" w:fill="EAF3FA"/>
-                </w:tcPr>
-                <w:p>
-                  <w:pPr>
-                    <w:spacing w:before="0" w:after="0"/>
-                  </w:pPr>
-                  <w:r>
-                    <w:rPr>
-                      <w:rFonts w:ascii="Arial" w:hAnsi="Arial" w:cs="Arial"/>
-                      <w:b/>
-                      <w:color w:val="1A1A1A"/>
-                      <w:sz w:val="16"/>
-                    </w:rPr>
-                    <w:t>ПАО Сбербанк России</w:t>
-                  </w:r>
-                </w:p>
-              </w:tc>
-            </w:tr>
-            <w:tr>
-              <w:tc>
-                <w:tcPr>
-                  <w:tcW w:type="dxa" w:w="1587"/>
-                  <w:tcMar>
-                    <w:top w:w="20" w:type="dxa"/>
-                    <w:bottom w:w="20" w:type="dxa"/>
-                    <w:left w:w="80" w:type="dxa"/>
-                    <w:right w:w="80" w:type="dxa"/>
-                  </w:tcMar>
-                  <w:shd w:val="clear" w:color="auto" w:fill="EAF3FA"/>
-                </w:tcPr>
-                <w:p>
-                  <w:pPr>
-                    <w:spacing w:before="0" w:after="0"/>
-                  </w:pPr>
-                  <w:r>
-                    <w:rPr>
-                      <w:rFonts w:ascii="Arial" w:hAnsi="Arial" w:cs="Arial"/>
-                      <w:color w:val="296FCE"/>
-                      <w:sz w:val="16"/>
-                    </w:rPr>
-                    <w:t>Действителен:</w:t>
-                  </w:r>
-                </w:p>
-              </w:tc>
-              <w:tc>
-                <w:tcPr>
-                  <w:tcW w:type="dxa" w:w="4081"/>
-                  <w:tcMar>
-                    <w:top w:w="20" w:type="dxa"/>
-                    <w:bottom w:w="20" w:type="dxa"/>
-                    <w:left w:w="80" w:type="dxa"/>
-                    <w:right w:w="80" w:type="dxa"/>
-                  </w:tcMar>
-                  <w:shd w:val="clear" w:color="auto" w:fill="EAF3FA"/>
-                </w:tcPr>
-                <w:p>
-                  <w:pPr>
-                    <w:spacing w:before="0" w:after="0"/>
-                  </w:pPr>
-                  <w:r>
-                    <w:rPr>
-                      <w:rFonts w:ascii="Arial" w:hAnsi="Arial" w:cs="Arial"/>
-                      <w:color w:val="1A1A1A"/>
-                      <w:sz w:val="16"/>
-                    </w:rPr>
-                    <w:t>с 02.07.2025 по 02.10.2026</w:t>
-                  </w:r>
-                </w:p>
-              </w:tc>
-            </w:tr>
-            <w:tr>
-              <w:tc>
-                <w:tcPr>
-                  <w:tcW w:type="dxa" w:w="1587"/>
-                  <w:tcMar>
-                    <w:top w:w="20" w:type="dxa"/>
-                    <w:bottom w:w="20" w:type="dxa"/>
-                    <w:left w:w="80" w:type="dxa"/>
-                    <w:right w:w="80" w:type="dxa"/>
-                  </w:tcMar>
-                  <w:shd w:val="clear" w:color="auto" w:fill="EAF3FA"/>
-                </w:tcPr>
-                <w:p>
-                  <w:pPr>
-                    <w:spacing w:before="0" w:after="0"/>
-                  </w:pPr>
-                  <w:r>
-                    <w:rPr>
-                      <w:rFonts w:ascii="Arial" w:hAnsi="Arial" w:cs="Arial"/>
-                      <w:color w:val="296FCE"/>
-                      <w:sz w:val="16"/>
-                    </w:rPr>
-                    <w:t>Дата подписи:</w:t>
-                  </w:r>
-                </w:p>
-              </w:tc>
-              <w:tc>
-                <w:tcPr>
-                  <w:tcW w:type="dxa" w:w="4081"/>
-                  <w:tcMar>
-                    <w:top w:w="20" w:type="dxa"/>
-                    <w:bottom w:w="20" w:type="dxa"/>
-                    <w:left w:w="80" w:type="dxa"/>
-                    <w:right w:w="80" w:type="dxa"/>
-                  </w:tcMar>
-                  <w:shd w:val="clear" w:color="auto" w:fill="EAF3FA"/>
-                </w:tcPr>
-                <w:p>
-                  <w:pPr>
-                    <w:spacing w:before="0" w:after="0"/>
-                  </w:pPr>
-                  <w:r>
-                    <w:rPr>
-                      <w:rFonts w:ascii="Arial" w:hAnsi="Arial" w:cs="Arial"/>
-                      <w:color w:val="1A1A1A"/>
-                      <w:sz w:val="16"/>
-                    </w:rPr>
-                    <w:t>{{ bank.statement_date_formatted }}</w:t>
-                  </w:r>
-                </w:p>
+                <w:p/>
+                <w:tbl>
+                  <w:tblGrid>
+                    <w:gridCol w:w="1247"/>
+                    <w:gridCol w:w="4422"/>
+                  </w:tblGrid>
+                  <w:tblPr>
+                    <w:tblW w:type="auto" w:w="0"/>
+                    <w:tblLayout w:type="fixed"/>
+                    <w:tblLook w:firstColumn="1" w:firstRow="1" w:lastColumn="0" w:lastRow="0" w:noHBand="0" w:noVBand="1" w:val="04A0"/>
+                    <w:tblBorders>
+                      <w:top w:val="nil"/>
+                      <w:left w:val="nil"/>
+                      <w:bottom w:val="nil"/>
+                      <w:right w:val="nil"/>
+                      <w:insideH w:val="nil"/>
+                      <w:insideV w:val="nil"/>
+                    </w:tblBorders>
+                  </w:tblPr>
+                  <w:tr>
+                    <w:tc>
+                      <w:tcPr>
+                        <w:tcW w:type="dxa" w:w="1247"/>
+                        <w:shd w:val="clear" w:color="auto" w:fill="EAF3FA"/>
+                        <w:tcMar>
+                          <w:top w:w="60" w:type="dxa"/>
+                          <w:bottom w:w="60" w:type="dxa"/>
+                          <w:left w:w="80" w:type="dxa"/>
+                          <w:right w:w="40" w:type="dxa"/>
+                        </w:tcMar>
+                      </w:tcPr>
+                      <w:p>
+                        <w:pPr>
+                          <w:spacing w:before="0" w:after="0"/>
+                        </w:pPr>
+                        <w:r>
+                          <w:drawing>
+                            <wp:inline xmlns:a="http://schemas.openxmlformats.org/drawingml/2006/main" xmlns:pic="http://schemas.openxmlformats.org/drawingml/2006/picture">
+                              <wp:extent cx="576000" cy="156646"/>
+                              <wp:docPr id="2" name="Picture 2"/>
+                              <wp:cNvGraphicFramePr>
+                                <a:graphicFrameLocks noChangeAspect="1"/>
+                              </wp:cNvGraphicFramePr>
+                              <a:graphic>
+                                <a:graphicData uri="http://schemas.openxmlformats.org/drawingml/2006/picture">
+                                  <pic:pic>
+                                    <pic:nvPicPr>
+                                      <pic:cNvPr id="0" name="sber_logo.png"/>
+                                      <pic:cNvPicPr/>
+                                    </pic:nvPicPr>
+                                    <pic:blipFill>
+                                      <a:blip r:embed="rId11"/>
+                                      <a:stretch>
+                                        <a:fillRect/>
+                                      </a:stretch>
+                                    </pic:blipFill>
+                                    <pic:spPr>
+                                      <a:xfrm>
+                                        <a:off x="0" y="0"/>
+                                        <a:ext cx="576000" cy="156646"/>
+                                      </a:xfrm>
+                                      <a:prstGeom prst="rect"/>
+                                    </pic:spPr>
+                                  </pic:pic>
+                                </a:graphicData>
+                              </a:graphic>
+                            </wp:inline>
+                          </w:drawing>
+                        </w:r>
+                      </w:p>
+                    </w:tc>
+                    <w:tc>
+                      <w:tcPr>
+                        <w:tcW w:type="dxa" w:w="4422"/>
+                        <w:shd w:val="clear" w:color="auto" w:fill="EAF3FA"/>
+                        <w:tcMar>
+                          <w:top w:w="60" w:type="dxa"/>
+                          <w:bottom w:w="60" w:type="dxa"/>
+                          <w:left w:w="40" w:type="dxa"/>
+                          <w:right w:w="80" w:type="dxa"/>
+                        </w:tcMar>
+                      </w:tcPr>
+                      <w:p>
+                        <w:pPr>
+                          <w:spacing w:before="0" w:after="0"/>
+                        </w:pPr>
+                        <w:r>
+                          <w:rPr>
+                            <w:rFonts w:ascii="Arial" w:hAnsi="Arial" w:cs="Arial"/>
+                            <w:b/>
+                            <w:color w:val="296FCE"/>
+                            <w:sz w:val="16"/>
+                          </w:rPr>
+                          <w:t>Документ подписан</w:t>
+                        </w:r>
+                      </w:p>
+                      <w:p>
+                        <w:pPr>
+                          <w:spacing w:before="0" w:after="0"/>
+                        </w:pPr>
+                        <w:r>
+                          <w:rPr>
+                            <w:rFonts w:ascii="Arial" w:hAnsi="Arial" w:cs="Arial"/>
+                            <w:b/>
+                            <w:color w:val="296FCE"/>
+                            <w:sz w:val="16"/>
+                          </w:rPr>
+                          <w:t>электронной подписью</w:t>
+                        </w:r>
+                        <w:r>
+                          <w:rPr>
+                            <w:rFonts w:ascii="Arial" w:hAnsi="Arial" w:cs="Arial"/>
+                            <w:color w:val="296FCE"/>
+                            <w:sz w:val="12"/>
+                            <w:vertAlign w:val="superscript"/>
+                          </w:rPr>
+                          <w:t>*</w:t>
+                        </w:r>
+                      </w:p>
+                    </w:tc>
+                  </w:tr>
+                </w:tbl>
+                <w:p/>
+                <w:tbl>
+                  <w:tblGrid>
+                    <w:gridCol w:w="5669"/>
+                  </w:tblGrid>
+                  <w:tblPr>
+                    <w:tblW w:type="auto" w:w="0"/>
+                    <w:tblLayout w:type="fixed"/>
+                    <w:tblLook w:firstColumn="1" w:firstRow="1" w:lastColumn="0" w:lastRow="0" w:noHBand="0" w:noVBand="1" w:val="04A0"/>
+                    <w:tblBorders>
+                      <w:top w:val="nil"/>
+                      <w:left w:val="nil"/>
+                      <w:bottom w:val="nil"/>
+                      <w:right w:val="nil"/>
+                      <w:insideH w:val="nil"/>
+                      <w:insideV w:val="nil"/>
+                    </w:tblBorders>
+                  </w:tblPr>
+                  <w:tr>
+                    <w:tc>
+                      <w:tcPr>
+                        <w:tcW w:type="dxa" w:w="5669"/>
+                        <w:shd w:val="clear" w:color="auto" w:fill="296FCE"/>
+                        <w:tcMar>
+                          <w:top w:w="40" w:type="dxa"/>
+                          <w:bottom w:w="40" w:type="dxa"/>
+                          <w:left w:w="80" w:type="dxa"/>
+                          <w:right w:w="80" w:type="dxa"/>
+                        </w:tcMar>
+                      </w:tcPr>
+                      <w:p>
+                        <w:pPr>
+                          <w:jc w:val="center"/>
+                          <w:spacing w:before="0" w:after="0"/>
+                        </w:pPr>
+                        <w:r>
+                          <w:rPr>
+                            <w:rFonts w:ascii="Arial" w:hAnsi="Arial" w:cs="Arial"/>
+                            <w:b/>
+                            <w:color w:val="FFFFFF"/>
+                            <w:sz w:val="16"/>
+                          </w:rPr>
+                          <w:t>СВЕДЕНИЯ О СЕРТИФИКАТЕ ЭП</w:t>
+                        </w:r>
+                      </w:p>
+                    </w:tc>
+                  </w:tr>
+                </w:tbl>
+                <w:p/>
+                <w:tbl>
+                  <w:tblGrid>
+                    <w:gridCol w:w="1587"/>
+                    <w:gridCol w:w="4081"/>
+                  </w:tblGrid>
+                  <w:tblPr>
+                    <w:tblW w:type="auto" w:w="0"/>
+                    <w:tblLayout w:type="fixed"/>
+                    <w:tblLook w:firstColumn="1" w:firstRow="1" w:lastColumn="0" w:lastRow="0" w:noHBand="0" w:noVBand="1" w:val="04A0"/>
+                    <w:tblBorders>
+                      <w:top w:val="nil"/>
+                      <w:left w:val="nil"/>
+                      <w:bottom w:val="nil"/>
+                      <w:right w:val="nil"/>
+                      <w:insideH w:val="nil"/>
+                      <w:insideV w:val="nil"/>
+                    </w:tblBorders>
+                  </w:tblPr>
+                  <w:tr>
+                    <w:tc>
+                      <w:tcPr>
+                        <w:tcW w:type="dxa" w:w="1587"/>
+                        <w:tcMar>
+                          <w:top w:w="20" w:type="dxa"/>
+                          <w:bottom w:w="20" w:type="dxa"/>
+                          <w:left w:w="80" w:type="dxa"/>
+                          <w:right w:w="80" w:type="dxa"/>
+                        </w:tcMar>
+                        <w:shd w:val="clear" w:color="auto" w:fill="EAF3FA"/>
+                      </w:tcPr>
+                      <w:p>
+                        <w:pPr>
+                          <w:spacing w:before="0" w:after="0"/>
+                        </w:pPr>
+                        <w:r>
+                          <w:rPr>
+                            <w:rFonts w:ascii="Arial" w:hAnsi="Arial" w:cs="Arial"/>
+                            <w:color w:val="296FCE"/>
+                            <w:sz w:val="16"/>
+                          </w:rPr>
+                          <w:t>Сертификат:</w:t>
+                        </w:r>
+                      </w:p>
+                    </w:tc>
+                    <w:tc>
+                      <w:tcPr>
+                        <w:tcW w:type="dxa" w:w="4081"/>
+                        <w:tcMar>
+                          <w:top w:w="20" w:type="dxa"/>
+                          <w:bottom w:w="20" w:type="dxa"/>
+                          <w:left w:w="80" w:type="dxa"/>
+                          <w:right w:w="80" w:type="dxa"/>
+                        </w:tcMar>
+                        <w:shd w:val="clear" w:color="auto" w:fill="EAF3FA"/>
+                      </w:tcPr>
+                      <w:p>
+                        <w:pPr>
+                          <w:spacing w:before="0" w:after="0"/>
+                        </w:pPr>
+                        <w:r>
+                          <w:rPr>
+                            <w:rFonts w:ascii="Arial" w:hAnsi="Arial" w:cs="Arial"/>
+                            <w:color w:val="1A1A1A"/>
+                            <w:sz w:val="16"/>
+                          </w:rPr>
+                          <w:t>40601D00C08FCE2CD999F93A68651986</w:t>
+                        </w:r>
+                      </w:p>
+                    </w:tc>
+                  </w:tr>
+                  <w:tr>
+                    <w:tc>
+                      <w:tcPr>
+                        <w:tcW w:type="dxa" w:w="1587"/>
+                        <w:tcMar>
+                          <w:top w:w="20" w:type="dxa"/>
+                          <w:bottom w:w="20" w:type="dxa"/>
+                          <w:left w:w="80" w:type="dxa"/>
+                          <w:right w:w="80" w:type="dxa"/>
+                        </w:tcMar>
+                        <w:shd w:val="clear" w:color="auto" w:fill="EAF3FA"/>
+                      </w:tcPr>
+                      <w:p>
+                        <w:pPr>
+                          <w:spacing w:before="0" w:after="0"/>
+                        </w:pPr>
+                        <w:r>
+                          <w:rPr>
+                            <w:rFonts w:ascii="Arial" w:hAnsi="Arial" w:cs="Arial"/>
+                            <w:color w:val="296FCE"/>
+                            <w:sz w:val="16"/>
+                          </w:rPr>
+                          <w:t>Владелец:</w:t>
+                        </w:r>
+                      </w:p>
+                    </w:tc>
+                    <w:tc>
+                      <w:tcPr>
+                        <w:tcW w:type="dxa" w:w="4081"/>
+                        <w:tcMar>
+                          <w:top w:w="20" w:type="dxa"/>
+                          <w:bottom w:w="20" w:type="dxa"/>
+                          <w:left w:w="80" w:type="dxa"/>
+                          <w:right w:w="80" w:type="dxa"/>
+                        </w:tcMar>
+                        <w:shd w:val="clear" w:color="auto" w:fill="EAF3FA"/>
+                      </w:tcPr>
+                      <w:p>
+                        <w:pPr>
+                          <w:spacing w:before="0" w:after="0"/>
+                        </w:pPr>
+                        <w:r>
+                          <w:rPr>
+                            <w:rFonts w:ascii="Arial" w:hAnsi="Arial" w:cs="Arial"/>
+                            <w:b/>
+                            <w:color w:val="1A1A1A"/>
+                            <w:sz w:val="16"/>
+                          </w:rPr>
+                          <w:t>ПАО Сбербанк России</w:t>
+                        </w:r>
+                      </w:p>
+                    </w:tc>
+                  </w:tr>
+                  <w:tr>
+                    <w:tc>
+                      <w:tcPr>
+                        <w:tcW w:type="dxa" w:w="1587"/>
+                        <w:tcMar>
+                          <w:top w:w="20" w:type="dxa"/>
+                          <w:bottom w:w="20" w:type="dxa"/>
+                          <w:left w:w="80" w:type="dxa"/>
+                          <w:right w:w="80" w:type="dxa"/>
+                        </w:tcMar>
+                        <w:shd w:val="clear" w:color="auto" w:fill="EAF3FA"/>
+                      </w:tcPr>
+                      <w:p>
+                        <w:pPr>
+                          <w:spacing w:before="0" w:after="0"/>
+                        </w:pPr>
+                        <w:r>
+                          <w:rPr>
+                            <w:rFonts w:ascii="Arial" w:hAnsi="Arial" w:cs="Arial"/>
+                            <w:color w:val="296FCE"/>
+                            <w:sz w:val="16"/>
+                          </w:rPr>
+                          <w:t>Действителен:</w:t>
+                        </w:r>
+                      </w:p>
+                    </w:tc>
+                    <w:tc>
+                      <w:tcPr>
+                        <w:tcW w:type="dxa" w:w="4081"/>
+                        <w:tcMar>
+                          <w:top w:w="20" w:type="dxa"/>
+                          <w:bottom w:w="20" w:type="dxa"/>
+                          <w:left w:w="80" w:type="dxa"/>
+                          <w:right w:w="80" w:type="dxa"/>
+                        </w:tcMar>
+                        <w:shd w:val="clear" w:color="auto" w:fill="EAF3FA"/>
+                      </w:tcPr>
+                      <w:p>
+                        <w:pPr>
+                          <w:spacing w:before="0" w:after="0"/>
+                        </w:pPr>
+                        <w:r>
+                          <w:rPr>
+                            <w:rFonts w:ascii="Arial" w:hAnsi="Arial" w:cs="Arial"/>
+                            <w:color w:val="1A1A1A"/>
+                            <w:sz w:val="16"/>
+                          </w:rPr>
+                          <w:t>с 02.07.2025 по 02.10.2026</w:t>
+                        </w:r>
+                      </w:p>
+                    </w:tc>
+                  </w:tr>
+                  <w:tr>
+                    <w:tc>
+                      <w:tcPr>
+                        <w:tcW w:type="dxa" w:w="1587"/>
+                        <w:tcMar>
+                          <w:top w:w="20" w:type="dxa"/>
+                          <w:bottom w:w="20" w:type="dxa"/>
+                          <w:left w:w="80" w:type="dxa"/>
+                          <w:right w:w="80" w:type="dxa"/>
+                        </w:tcMar>
+                        <w:shd w:val="clear" w:color="auto" w:fill="EAF3FA"/>
+                      </w:tcPr>
+                      <w:p>
+                        <w:pPr>
+                          <w:spacing w:before="0" w:after="0"/>
+                        </w:pPr>
+                        <w:r>
+                          <w:rPr>
+                            <w:rFonts w:ascii="Arial" w:hAnsi="Arial" w:cs="Arial"/>
+                            <w:color w:val="296FCE"/>
+                            <w:sz w:val="16"/>
+                          </w:rPr>
+                          <w:t>Дата подписи:</w:t>
+                        </w:r>
+                      </w:p>
+                    </w:tc>
+                    <w:tc>
+                      <w:tcPr>
+                        <w:tcW w:type="dxa" w:w="4081"/>
+                        <w:tcMar>
+                          <w:top w:w="20" w:type="dxa"/>
+                          <w:bottom w:w="20" w:type="dxa"/>
+                          <w:left w:w="80" w:type="dxa"/>
+                          <w:right w:w="80" w:type="dxa"/>
+                        </w:tcMar>
+                        <w:shd w:val="clear" w:color="auto" w:fill="EAF3FA"/>
+                      </w:tcPr>
+                      <w:p>
+                        <w:pPr>
+                          <w:spacing w:before="0" w:after="0"/>
+                        </w:pPr>
+                        <w:r>
+                          <w:rPr>
+                            <w:rFonts w:ascii="Arial" w:hAnsi="Arial" w:cs="Arial"/>
+                            <w:color w:val="1A1A1A"/>
+                            <w:sz w:val="16"/>
+                          </w:rPr>
+                          <w:t>{{ bank.statement_date_formatted }}</w:t>
+                        </w:r>
+                      </w:p>
+                    </w:tc>
+                  </w:tr>
+                </w:tbl>
+                <w:p/>
               </w:tc>
             </w:tr>
           </w:tbl>
@@ -1664,13 +1703,86 @@
       </w:r>
     </w:p>
     <w:sectPr>
+      <w:headerReference w:type="first" r:id="rId9"/>
+      <w:headerReference w:type="default" r:id="rId10"/>
       <w:pgSz w:w="11906" w:h="16838"/>
       <w:pgMar w:top="850" w:right="850" w:bottom="850" w:left="850" w:header="720" w:footer="720" w:gutter="0"/>
       <w:cols w:space="720"/>
+      <w:titlePg/>
       <w:docGrid w:linePitch="360"/>
     </w:sectPr>
   </w:body>
 </w:document>
+</file>
+
+<file path=word/header1.xml><?xml version="1.0" encoding="utf-8"?>
+<w:hdr xmlns:m="http://schemas.openxmlformats.org/officeDocument/2006/math" xmlns:mc="http://schemas.openxmlformats.org/markup-compatibility/2006" xmlns:mo="http://schemas.microsoft.com/office/mac/office/2008/main" xmlns:mv="urn:schemas-microsoft-com:mac:vml" xmlns:o="urn:schemas-microsoft-com:office:office" xmlns:r="http://schemas.openxmlformats.org/officeDocument/2006/relationships" xmlns:v="urn:schemas-microsoft-com:vml" xmlns:w10="urn:schemas-microsoft-com:office:word" xmlns:w14="http://schemas.microsoft.com/office/word/2010/wordml" xmlns:w="http://schemas.openxmlformats.org/wordprocessingml/2006/main" xmlns:wne="http://schemas.microsoft.com/office/word/2006/wordml" xmlns:wp14="http://schemas.microsoft.com/office/word/2010/wordprocessingDrawing" xmlns:wp="http://schemas.openxmlformats.org/drawingml/2006/wordprocessingDrawing" xmlns:wpc="http://schemas.microsoft.com/office/word/2010/wordprocessingCanvas" xmlns:wpg="http://schemas.microsoft.com/office/word/2010/wordprocessingGroup" xmlns:wpi="http://schemas.microsoft.com/office/word/2010/wordprocessingInk" xmlns:wps="http://schemas.microsoft.com/office/word/2010/wordprocessingShape" mc:Ignorable="w14 wp14">
+  <w:p>
+    <w:pPr>
+      <w:pStyle w:val="Header"/>
+    </w:pPr>
+    <w:r/>
+  </w:p>
+</w:hdr>
+</file>
+
+<file path=word/header2.xml><?xml version="1.0" encoding="utf-8"?>
+<w:hdr xmlns:m="http://schemas.openxmlformats.org/officeDocument/2006/math" xmlns:mc="http://schemas.openxmlformats.org/markup-compatibility/2006" xmlns:mo="http://schemas.microsoft.com/office/mac/office/2008/main" xmlns:mv="urn:schemas-microsoft-com:mac:vml" xmlns:o="urn:schemas-microsoft-com:office:office" xmlns:r="http://schemas.openxmlformats.org/officeDocument/2006/relationships" xmlns:v="urn:schemas-microsoft-com:vml" xmlns:w10="urn:schemas-microsoft-com:office:word" xmlns:w14="http://schemas.microsoft.com/office/word/2010/wordml" xmlns:w="http://schemas.openxmlformats.org/wordprocessingml/2006/main" xmlns:wne="http://schemas.microsoft.com/office/word/2006/wordml" xmlns:wp14="http://schemas.microsoft.com/office/word/2010/wordprocessingDrawing" xmlns:wp="http://schemas.openxmlformats.org/drawingml/2006/wordprocessingDrawing" xmlns:wpc="http://schemas.microsoft.com/office/word/2010/wordprocessingCanvas" xmlns:wpg="http://schemas.microsoft.com/office/word/2010/wordprocessingGroup" xmlns:wpi="http://schemas.microsoft.com/office/word/2010/wordprocessingInk" xmlns:wps="http://schemas.microsoft.com/office/word/2010/wordprocessingShape" mc:Ignorable="w14 wp14">
+  <w:p>
+    <w:pPr>
+      <w:pStyle w:val="Header"/>
+      <w:tabs>
+        <w:tab w:val="right" w:pos="9355"/>
+      </w:tabs>
+    </w:pPr>
+    <w:r>
+      <w:rPr>
+        <w:rFonts w:ascii="Arial" w:hAnsi="Arial" w:cs="Arial"/>
+        <w:b/>
+        <w:color w:val="1A1A1A"/>
+        <w:sz w:val="16"/>
+      </w:rPr>
+      <w:t>Выписка по платёжному счёту</w:t>
+    </w:r>
+    <w:r>
+      <w:tab/>
+    </w:r>
+    <w:r>
+      <w:rPr>
+        <w:rFonts w:ascii="Arial" w:hAnsi="Arial" w:cs="Arial"/>
+        <w:color w:val="1A1A1A"/>
+        <w:sz w:val="16"/>
+      </w:rPr>
+      <w:t xml:space="preserve">Страница </w:t>
+    </w:r>
+    <w:r>
+      <w:fldChar w:fldCharType="begin"/>
+    </w:r>
+    <w:r>
+      <w:instrText>PAGE</w:instrText>
+    </w:r>
+    <w:r>
+      <w:fldChar w:fldCharType="end"/>
+    </w:r>
+    <w:r>
+      <w:rPr>
+        <w:rFonts w:ascii="Arial" w:hAnsi="Arial" w:cs="Arial"/>
+        <w:color w:val="1A1A1A"/>
+        <w:sz w:val="16"/>
+      </w:rPr>
+      <w:t xml:space="preserve"> из </w:t>
+    </w:r>
+    <w:r>
+      <w:fldChar w:fldCharType="begin"/>
+    </w:r>
+    <w:r>
+      <w:instrText>NUMPAGES</w:instrText>
+    </w:r>
+    <w:r>
+      <w:fldChar w:fldCharType="end"/>
+    </w:r>
+  </w:p>
+</w:hdr>
 </file>
 
 <file path=word/numbering.xml><?xml version="1.0" encoding="utf-8"?>

</xml_diff>

<commit_message>
Pack 47.4: Sber statement v4 — header fields + EP block compact + heights aligned + period style
</commit_message>
<xml_diff>
--- a/templates/docx/bank_statement_template_044525225.docx
+++ b/templates/docx/bank_statement_template_044525225.docx
@@ -161,8 +161,8 @@
         <w:rPr>
           <w:rFonts w:ascii="Arial" w:hAnsi="Arial" w:cs="Arial"/>
           <w:b/>
-          <w:color w:val="1A1A1A"/>
-          <w:sz w:val="18"/>
+          <w:color w:val="5A5A5A"/>
+          <w:sz w:val="16"/>
         </w:rPr>
         <w:t>За период {{ bank.period_start_formatted }} — {{ bank.period_end_formatted }}</w:t>
       </w:r>
@@ -174,7 +174,6 @@
       </w:tblGrid>
       <w:tblPr>
         <w:tblW w:type="auto" w:w="0"/>
-        <w:tblLayout w:type="fixed"/>
         <w:tblLook w:firstColumn="1" w:firstRow="1" w:lastColumn="0" w:lastRow="0" w:noHBand="0" w:noVBand="1" w:val="04A0"/>
         <w:tblBorders>
           <w:top w:val="nil"/>
@@ -184,8 +183,12 @@
           <w:insideH w:val="nil"/>
           <w:insideV w:val="nil"/>
         </w:tblBorders>
+        <w:tblLayout w:type="fixed"/>
       </w:tblPr>
       <w:tr>
+        <w:trPr>
+          <w:trHeight w:val="4800" w:hRule="atLeast"/>
+        </w:trPr>
         <w:tc>
           <w:tcPr>
             <w:tcW w:type="dxa" w:w="5385"/>
@@ -1077,8 +1080,8 @@
     </w:p>
     <w:tbl>
       <w:tblGrid>
+        <w:gridCol w:w="5669"/>
         <w:gridCol w:w="4535"/>
-        <w:gridCol w:w="5669"/>
       </w:tblGrid>
       <w:tblPr>
         <w:tblW w:type="auto" w:w="0"/>
@@ -1096,7 +1099,7 @@
       <w:tr>
         <w:tc>
           <w:tcPr>
-            <w:tcW w:type="dxa" w:w="4535"/>
+            <w:tcW w:type="dxa" w:w="5669"/>
             <w:tcMar>
               <w:top w:w="0" w:type="dxa"/>
               <w:bottom w:w="0" w:type="dxa"/>
@@ -1115,13 +1118,8 @@
                 <w:color w:val="1A1A1A"/>
                 <w:sz w:val="16"/>
               </w:rPr>
-              <w:t>Дата формирования документа</w:t>
+              <w:t xml:space="preserve">Дата формирования документа    </w:t>
             </w:r>
-          </w:p>
-          <w:p>
-            <w:pPr>
-              <w:spacing w:before="0" w:after="0"/>
-            </w:pPr>
             <w:r>
               <w:rPr>
                 <w:rFonts w:ascii="Arial" w:hAnsi="Arial" w:cs="Arial"/>
@@ -1135,7 +1133,7 @@
         </w:tc>
         <w:tc>
           <w:tcPr>
-            <w:tcW w:type="dxa" w:w="5669"/>
+            <w:tcW w:type="dxa" w:w="4535"/>
             <w:tcMar>
               <w:top w:w="0" w:type="dxa"/>
               <w:bottom w:w="0" w:type="dxa"/>
@@ -1147,7 +1145,7 @@
           <w:p/>
           <w:tbl>
             <w:tblGrid>
-              <w:gridCol w:w="5669"/>
+              <w:gridCol w:w="4535"/>
             </w:tblGrid>
             <w:tblPr>
               <w:tblW w:type="auto" w:w="0"/>
@@ -1165,7 +1163,7 @@
             <w:tr>
               <w:tc>
                 <w:tcPr>
-                  <w:tcW w:type="dxa" w:w="5669"/>
+                  <w:tcW w:type="dxa" w:w="4535"/>
                   <w:tcMar>
                     <w:top w:w="0" w:type="dxa"/>
                     <w:bottom w:w="0" w:type="dxa"/>
@@ -1176,8 +1174,8 @@
                 <w:p/>
                 <w:tbl>
                   <w:tblGrid>
-                    <w:gridCol w:w="1247"/>
-                    <w:gridCol w:w="4422"/>
+                    <w:gridCol w:w="1020"/>
+                    <w:gridCol w:w="3514"/>
                   </w:tblGrid>
                   <w:tblPr>
                     <w:tblW w:type="auto" w:w="0"/>
@@ -1195,14 +1193,15 @@
                   <w:tr>
                     <w:tc>
                       <w:tcPr>
-                        <w:tcW w:type="dxa" w:w="1247"/>
+                        <w:tcW w:type="dxa" w:w="1020"/>
                         <w:shd w:val="clear" w:color="auto" w:fill="EAF3FA"/>
                         <w:tcMar>
-                          <w:top w:w="60" w:type="dxa"/>
-                          <w:bottom w:w="60" w:type="dxa"/>
-                          <w:left w:w="80" w:type="dxa"/>
-                          <w:right w:w="40" w:type="dxa"/>
+                          <w:top w:w="40" w:type="dxa"/>
+                          <w:bottom w:w="40" w:type="dxa"/>
+                          <w:left w:w="60" w:type="dxa"/>
+                          <w:right w:w="20" w:type="dxa"/>
                         </w:tcMar>
+                        <w:vAlign w:val="center"/>
                       </w:tcPr>
                       <w:p>
                         <w:pPr>
@@ -1211,7 +1210,7 @@
                         <w:r>
                           <w:drawing>
                             <wp:inline xmlns:a="http://schemas.openxmlformats.org/drawingml/2006/main" xmlns:pic="http://schemas.openxmlformats.org/drawingml/2006/picture">
-                              <wp:extent cx="576000" cy="156646"/>
+                              <wp:extent cx="468000" cy="127275"/>
                               <wp:docPr id="2" name="Picture 2"/>
                               <wp:cNvGraphicFramePr>
                                 <a:graphicFrameLocks noChangeAspect="1"/>
@@ -1232,7 +1231,7 @@
                                     <pic:spPr>
                                       <a:xfrm>
                                         <a:off x="0" y="0"/>
-                                        <a:ext cx="576000" cy="156646"/>
+                                        <a:ext cx="468000" cy="127275"/>
                                       </a:xfrm>
                                       <a:prstGeom prst="rect"/>
                                     </pic:spPr>
@@ -1246,14 +1245,15 @@
                     </w:tc>
                     <w:tc>
                       <w:tcPr>
-                        <w:tcW w:type="dxa" w:w="4422"/>
+                        <w:tcW w:type="dxa" w:w="3514"/>
                         <w:shd w:val="clear" w:color="auto" w:fill="EAF3FA"/>
                         <w:tcMar>
-                          <w:top w:w="60" w:type="dxa"/>
-                          <w:bottom w:w="60" w:type="dxa"/>
-                          <w:left w:w="40" w:type="dxa"/>
-                          <w:right w:w="80" w:type="dxa"/>
+                          <w:top w:w="40" w:type="dxa"/>
+                          <w:bottom w:w="40" w:type="dxa"/>
+                          <w:left w:w="20" w:type="dxa"/>
+                          <w:right w:w="60" w:type="dxa"/>
                         </w:tcMar>
+                        <w:vAlign w:val="center"/>
                       </w:tcPr>
                       <w:p>
                         <w:pPr>
@@ -1264,7 +1264,7 @@
                             <w:rFonts w:ascii="Arial" w:hAnsi="Arial" w:cs="Arial"/>
                             <w:b/>
                             <w:color w:val="296FCE"/>
-                            <w:sz w:val="16"/>
+                            <w:sz w:val="14"/>
                           </w:rPr>
                           <w:t>Документ подписан</w:t>
                         </w:r>
@@ -1278,7 +1278,7 @@
                             <w:rFonts w:ascii="Arial" w:hAnsi="Arial" w:cs="Arial"/>
                             <w:b/>
                             <w:color w:val="296FCE"/>
-                            <w:sz w:val="16"/>
+                            <w:sz w:val="14"/>
                           </w:rPr>
                           <w:t>электронной подписью</w:t>
                         </w:r>
@@ -1286,7 +1286,7 @@
                           <w:rPr>
                             <w:rFonts w:ascii="Arial" w:hAnsi="Arial" w:cs="Arial"/>
                             <w:color w:val="296FCE"/>
-                            <w:sz w:val="12"/>
+                            <w:sz w:val="10"/>
                             <w:vertAlign w:val="superscript"/>
                           </w:rPr>
                           <w:t>*</w:t>
@@ -1298,7 +1298,7 @@
                 <w:p/>
                 <w:tbl>
                   <w:tblGrid>
-                    <w:gridCol w:w="5669"/>
+                    <w:gridCol w:w="4535"/>
                   </w:tblGrid>
                   <w:tblPr>
                     <w:tblW w:type="auto" w:w="0"/>
@@ -1316,13 +1316,13 @@
                   <w:tr>
                     <w:tc>
                       <w:tcPr>
-                        <w:tcW w:type="dxa" w:w="5669"/>
+                        <w:tcW w:type="dxa" w:w="4535"/>
                         <w:shd w:val="clear" w:color="auto" w:fill="296FCE"/>
                         <w:tcMar>
-                          <w:top w:w="40" w:type="dxa"/>
-                          <w:bottom w:w="40" w:type="dxa"/>
-                          <w:left w:w="80" w:type="dxa"/>
-                          <w:right w:w="80" w:type="dxa"/>
+                          <w:top w:w="30" w:type="dxa"/>
+                          <w:bottom w:w="30" w:type="dxa"/>
+                          <w:left w:w="60" w:type="dxa"/>
+                          <w:right w:w="60" w:type="dxa"/>
                         </w:tcMar>
                       </w:tcPr>
                       <w:p>
@@ -1335,7 +1335,7 @@
                             <w:rFonts w:ascii="Arial" w:hAnsi="Arial" w:cs="Arial"/>
                             <w:b/>
                             <w:color w:val="FFFFFF"/>
-                            <w:sz w:val="16"/>
+                            <w:sz w:val="14"/>
                           </w:rPr>
                           <w:t>СВЕДЕНИЯ О СЕРТИФИКАТЕ ЭП</w:t>
                         </w:r>
@@ -1346,8 +1346,8 @@
                 <w:p/>
                 <w:tbl>
                   <w:tblGrid>
-                    <w:gridCol w:w="1587"/>
-                    <w:gridCol w:w="4081"/>
+                    <w:gridCol w:w="1360"/>
+                    <w:gridCol w:w="3174"/>
                   </w:tblGrid>
                   <w:tblPr>
                     <w:tblW w:type="auto" w:w="0"/>
@@ -1365,12 +1365,12 @@
                   <w:tr>
                     <w:tc>
                       <w:tcPr>
-                        <w:tcW w:type="dxa" w:w="1587"/>
+                        <w:tcW w:type="dxa" w:w="1360"/>
                         <w:tcMar>
-                          <w:top w:w="20" w:type="dxa"/>
-                          <w:bottom w:w="20" w:type="dxa"/>
-                          <w:left w:w="80" w:type="dxa"/>
-                          <w:right w:w="80" w:type="dxa"/>
+                          <w:top w:w="15" w:type="dxa"/>
+                          <w:bottom w:w="15" w:type="dxa"/>
+                          <w:left w:w="60" w:type="dxa"/>
+                          <w:right w:w="60" w:type="dxa"/>
                         </w:tcMar>
                         <w:shd w:val="clear" w:color="auto" w:fill="EAF3FA"/>
                       </w:tcPr>
@@ -1382,7 +1382,7 @@
                           <w:rPr>
                             <w:rFonts w:ascii="Arial" w:hAnsi="Arial" w:cs="Arial"/>
                             <w:color w:val="296FCE"/>
-                            <w:sz w:val="16"/>
+                            <w:sz w:val="14"/>
                           </w:rPr>
                           <w:t>Сертификат:</w:t>
                         </w:r>
@@ -1390,12 +1390,12 @@
                     </w:tc>
                     <w:tc>
                       <w:tcPr>
-                        <w:tcW w:type="dxa" w:w="4081"/>
+                        <w:tcW w:type="dxa" w:w="3174"/>
                         <w:tcMar>
-                          <w:top w:w="20" w:type="dxa"/>
-                          <w:bottom w:w="20" w:type="dxa"/>
-                          <w:left w:w="80" w:type="dxa"/>
-                          <w:right w:w="80" w:type="dxa"/>
+                          <w:top w:w="15" w:type="dxa"/>
+                          <w:bottom w:w="15" w:type="dxa"/>
+                          <w:left w:w="60" w:type="dxa"/>
+                          <w:right w:w="60" w:type="dxa"/>
                         </w:tcMar>
                         <w:shd w:val="clear" w:color="auto" w:fill="EAF3FA"/>
                       </w:tcPr>
@@ -1407,7 +1407,7 @@
                           <w:rPr>
                             <w:rFonts w:ascii="Arial" w:hAnsi="Arial" w:cs="Arial"/>
                             <w:color w:val="1A1A1A"/>
-                            <w:sz w:val="16"/>
+                            <w:sz w:val="14"/>
                           </w:rPr>
                           <w:t>40601D00C08FCE2CD999F93A68651986</w:t>
                         </w:r>
@@ -1417,12 +1417,12 @@
                   <w:tr>
                     <w:tc>
                       <w:tcPr>
-                        <w:tcW w:type="dxa" w:w="1587"/>
+                        <w:tcW w:type="dxa" w:w="1360"/>
                         <w:tcMar>
-                          <w:top w:w="20" w:type="dxa"/>
-                          <w:bottom w:w="20" w:type="dxa"/>
-                          <w:left w:w="80" w:type="dxa"/>
-                          <w:right w:w="80" w:type="dxa"/>
+                          <w:top w:w="15" w:type="dxa"/>
+                          <w:bottom w:w="15" w:type="dxa"/>
+                          <w:left w:w="60" w:type="dxa"/>
+                          <w:right w:w="60" w:type="dxa"/>
                         </w:tcMar>
                         <w:shd w:val="clear" w:color="auto" w:fill="EAF3FA"/>
                       </w:tcPr>
@@ -1434,7 +1434,7 @@
                           <w:rPr>
                             <w:rFonts w:ascii="Arial" w:hAnsi="Arial" w:cs="Arial"/>
                             <w:color w:val="296FCE"/>
-                            <w:sz w:val="16"/>
+                            <w:sz w:val="14"/>
                           </w:rPr>
                           <w:t>Владелец:</w:t>
                         </w:r>
@@ -1442,12 +1442,12 @@
                     </w:tc>
                     <w:tc>
                       <w:tcPr>
-                        <w:tcW w:type="dxa" w:w="4081"/>
+                        <w:tcW w:type="dxa" w:w="3174"/>
                         <w:tcMar>
-                          <w:top w:w="20" w:type="dxa"/>
-                          <w:bottom w:w="20" w:type="dxa"/>
-                          <w:left w:w="80" w:type="dxa"/>
-                          <w:right w:w="80" w:type="dxa"/>
+                          <w:top w:w="15" w:type="dxa"/>
+                          <w:bottom w:w="15" w:type="dxa"/>
+                          <w:left w:w="60" w:type="dxa"/>
+                          <w:right w:w="60" w:type="dxa"/>
                         </w:tcMar>
                         <w:shd w:val="clear" w:color="auto" w:fill="EAF3FA"/>
                       </w:tcPr>
@@ -1460,7 +1460,7 @@
                             <w:rFonts w:ascii="Arial" w:hAnsi="Arial" w:cs="Arial"/>
                             <w:b/>
                             <w:color w:val="1A1A1A"/>
-                            <w:sz w:val="16"/>
+                            <w:sz w:val="14"/>
                           </w:rPr>
                           <w:t>ПАО Сбербанк России</w:t>
                         </w:r>
@@ -1470,12 +1470,12 @@
                   <w:tr>
                     <w:tc>
                       <w:tcPr>
-                        <w:tcW w:type="dxa" w:w="1587"/>
+                        <w:tcW w:type="dxa" w:w="1360"/>
                         <w:tcMar>
-                          <w:top w:w="20" w:type="dxa"/>
-                          <w:bottom w:w="20" w:type="dxa"/>
-                          <w:left w:w="80" w:type="dxa"/>
-                          <w:right w:w="80" w:type="dxa"/>
+                          <w:top w:w="15" w:type="dxa"/>
+                          <w:bottom w:w="15" w:type="dxa"/>
+                          <w:left w:w="60" w:type="dxa"/>
+                          <w:right w:w="60" w:type="dxa"/>
                         </w:tcMar>
                         <w:shd w:val="clear" w:color="auto" w:fill="EAF3FA"/>
                       </w:tcPr>
@@ -1487,7 +1487,7 @@
                           <w:rPr>
                             <w:rFonts w:ascii="Arial" w:hAnsi="Arial" w:cs="Arial"/>
                             <w:color w:val="296FCE"/>
-                            <w:sz w:val="16"/>
+                            <w:sz w:val="14"/>
                           </w:rPr>
                           <w:t>Действителен:</w:t>
                         </w:r>
@@ -1495,12 +1495,12 @@
                     </w:tc>
                     <w:tc>
                       <w:tcPr>
-                        <w:tcW w:type="dxa" w:w="4081"/>
+                        <w:tcW w:type="dxa" w:w="3174"/>
                         <w:tcMar>
-                          <w:top w:w="20" w:type="dxa"/>
-                          <w:bottom w:w="20" w:type="dxa"/>
-                          <w:left w:w="80" w:type="dxa"/>
-                          <w:right w:w="80" w:type="dxa"/>
+                          <w:top w:w="15" w:type="dxa"/>
+                          <w:bottom w:w="15" w:type="dxa"/>
+                          <w:left w:w="60" w:type="dxa"/>
+                          <w:right w:w="60" w:type="dxa"/>
                         </w:tcMar>
                         <w:shd w:val="clear" w:color="auto" w:fill="EAF3FA"/>
                       </w:tcPr>
@@ -1512,7 +1512,7 @@
                           <w:rPr>
                             <w:rFonts w:ascii="Arial" w:hAnsi="Arial" w:cs="Arial"/>
                             <w:color w:val="1A1A1A"/>
-                            <w:sz w:val="16"/>
+                            <w:sz w:val="14"/>
                           </w:rPr>
                           <w:t>с 02.07.2025 по 02.10.2026</w:t>
                         </w:r>
@@ -1522,12 +1522,12 @@
                   <w:tr>
                     <w:tc>
                       <w:tcPr>
-                        <w:tcW w:type="dxa" w:w="1587"/>
+                        <w:tcW w:type="dxa" w:w="1360"/>
                         <w:tcMar>
-                          <w:top w:w="20" w:type="dxa"/>
-                          <w:bottom w:w="20" w:type="dxa"/>
-                          <w:left w:w="80" w:type="dxa"/>
-                          <w:right w:w="80" w:type="dxa"/>
+                          <w:top w:w="15" w:type="dxa"/>
+                          <w:bottom w:w="15" w:type="dxa"/>
+                          <w:left w:w="60" w:type="dxa"/>
+                          <w:right w:w="60" w:type="dxa"/>
                         </w:tcMar>
                         <w:shd w:val="clear" w:color="auto" w:fill="EAF3FA"/>
                       </w:tcPr>
@@ -1539,7 +1539,7 @@
                           <w:rPr>
                             <w:rFonts w:ascii="Arial" w:hAnsi="Arial" w:cs="Arial"/>
                             <w:color w:val="296FCE"/>
-                            <w:sz w:val="16"/>
+                            <w:sz w:val="14"/>
                           </w:rPr>
                           <w:t>Дата подписи:</w:t>
                         </w:r>
@@ -1547,12 +1547,12 @@
                     </w:tc>
                     <w:tc>
                       <w:tcPr>
-                        <w:tcW w:type="dxa" w:w="4081"/>
+                        <w:tcW w:type="dxa" w:w="3174"/>
                         <w:tcMar>
-                          <w:top w:w="20" w:type="dxa"/>
-                          <w:bottom w:w="20" w:type="dxa"/>
-                          <w:left w:w="80" w:type="dxa"/>
-                          <w:right w:w="80" w:type="dxa"/>
+                          <w:top w:w="15" w:type="dxa"/>
+                          <w:bottom w:w="15" w:type="dxa"/>
+                          <w:left w:w="60" w:type="dxa"/>
+                          <w:right w:w="60" w:type="dxa"/>
                         </w:tcMar>
                         <w:shd w:val="clear" w:color="auto" w:fill="EAF3FA"/>
                       </w:tcPr>
@@ -1564,7 +1564,7 @@
                           <w:rPr>
                             <w:rFonts w:ascii="Arial" w:hAnsi="Arial" w:cs="Arial"/>
                             <w:color w:val="1A1A1A"/>
-                            <w:sz w:val="16"/>
+                            <w:sz w:val="14"/>
                           </w:rPr>
                           <w:t>{{ bank.statement_date_formatted }}</w:t>
                         </w:r>
@@ -1732,7 +1732,7 @@
     <w:pPr>
       <w:pStyle w:val="Header"/>
       <w:tabs>
-        <w:tab w:val="right" w:pos="9355"/>
+        <w:tab w:val="right" w:pos="10206"/>
       </w:tabs>
     </w:pPr>
     <w:r>
@@ -1756,12 +1756,27 @@
       <w:t xml:space="preserve">Страница </w:t>
     </w:r>
     <w:r>
+      <w:rPr>
+        <w:rFonts w:ascii="Arial" w:hAnsi="Arial" w:cs="Arial"/>
+        <w:color w:val="1A1A1A"/>
+        <w:sz w:val="16"/>
+      </w:rPr>
       <w:fldChar w:fldCharType="begin"/>
     </w:r>
     <w:r>
-      <w:instrText>PAGE</w:instrText>
+      <w:rPr>
+        <w:rFonts w:ascii="Arial" w:hAnsi="Arial" w:cs="Arial"/>
+        <w:color w:val="1A1A1A"/>
+        <w:sz w:val="16"/>
+      </w:rPr>
+      <w:instrText xml:space="preserve"> PAGE </w:instrText>
     </w:r>
     <w:r>
+      <w:rPr>
+        <w:rFonts w:ascii="Arial" w:hAnsi="Arial" w:cs="Arial"/>
+        <w:color w:val="1A1A1A"/>
+        <w:sz w:val="16"/>
+      </w:rPr>
       <w:fldChar w:fldCharType="end"/>
     </w:r>
     <w:r>
@@ -1773,12 +1788,27 @@
       <w:t xml:space="preserve"> из </w:t>
     </w:r>
     <w:r>
+      <w:rPr>
+        <w:rFonts w:ascii="Arial" w:hAnsi="Arial" w:cs="Arial"/>
+        <w:color w:val="1A1A1A"/>
+        <w:sz w:val="16"/>
+      </w:rPr>
       <w:fldChar w:fldCharType="begin"/>
     </w:r>
     <w:r>
-      <w:instrText>NUMPAGES</w:instrText>
+      <w:rPr>
+        <w:rFonts w:ascii="Arial" w:hAnsi="Arial" w:cs="Arial"/>
+        <w:color w:val="1A1A1A"/>
+        <w:sz w:val="16"/>
+      </w:rPr>
+      <w:instrText xml:space="preserve"> NUMPAGES </w:instrText>
     </w:r>
     <w:r>
+      <w:rPr>
+        <w:rFonts w:ascii="Arial" w:hAnsi="Arial" w:cs="Arial"/>
+        <w:color w:val="1A1A1A"/>
+        <w:sz w:val="16"/>
+      </w:rPr>
       <w:fldChar w:fldCharType="end"/>
     </w:r>
   </w:p>

</xml_diff>

<commit_message>
Pack 47.5: Sber statement v6 - compact cards (wrapper 1x3 architecture)
</commit_message>
<xml_diff>
--- a/templates/docx/bank_statement_template_044525225.docx
+++ b/templates/docx/bank_statement_template_044525225.docx
@@ -53,7 +53,7 @@
                           <pic:cNvPicPr/>
                         </pic:nvPicPr>
                         <pic:blipFill>
-                          <a:blip r:embed="rId11"/>
+                          <a:blip r:embed="rId9"/>
                           <a:stretch>
                             <a:fillRect/>
                           </a:stretch>
@@ -170,10 +170,12 @@
     <w:tbl>
       <w:tblGrid>
         <w:gridCol w:w="5385"/>
-        <w:gridCol w:w="4818"/>
+        <w:gridCol w:w="283"/>
+        <w:gridCol w:w="4535"/>
       </w:tblGrid>
       <w:tblPr>
         <w:tblW w:type="auto" w:w="0"/>
+        <w:tblLayout w:type="fixed"/>
         <w:tblLook w:firstColumn="1" w:firstRow="1" w:lastColumn="0" w:lastRow="0" w:noHBand="0" w:noVBand="1" w:val="04A0"/>
         <w:tblBorders>
           <w:top w:val="nil"/>
@@ -183,208 +185,22 @@
           <w:insideH w:val="nil"/>
           <w:insideV w:val="nil"/>
         </w:tblBorders>
-        <w:tblLayout w:type="fixed"/>
       </w:tblPr>
       <w:tr>
-        <w:trPr>
-          <w:trHeight w:val="4800" w:hRule="atLeast"/>
-        </w:trPr>
         <w:tc>
           <w:tcPr>
             <w:tcW w:type="dxa" w:w="5385"/>
             <w:tcMar>
-              <w:top w:w="120" w:type="dxa"/>
-              <w:bottom w:w="120" w:type="dxa"/>
-              <w:left w:w="160" w:type="dxa"/>
-              <w:right w:w="160" w:type="dxa"/>
+              <w:top w:w="0" w:type="dxa"/>
+              <w:bottom w:w="0" w:type="dxa"/>
+              <w:left w:w="0" w:type="dxa"/>
+              <w:right w:w="0" w:type="dxa"/>
             </w:tcMar>
-            <w:shd w:val="clear" w:color="auto" w:fill="F5F5F5"/>
-            <w:tcBorders>
-              <w:top w:val="single" w:sz="4" w:color="D8D8D8" w:space="0"/>
-              <w:bottom w:val="single" w:sz="4" w:color="D8D8D8" w:space="0"/>
-              <w:left w:val="single" w:sz="4" w:color="D8D8D8" w:space="0"/>
-              <w:right w:val="single" w:sz="4" w:color="D8D8D8" w:space="0"/>
-            </w:tcBorders>
-            <w:vAlign w:val="top"/>
           </w:tcPr>
-          <w:p>
-            <w:pPr>
-              <w:spacing w:before="0" w:after="40"/>
-            </w:pPr>
-            <w:r>
-              <w:rPr>
-                <w:rFonts w:ascii="Arial" w:hAnsi="Arial" w:cs="Arial"/>
-                <w:color w:val="808080"/>
-                <w:sz w:val="16"/>
-              </w:rPr>
-              <w:t>Владелец счёта</w:t>
-            </w:r>
-          </w:p>
-          <w:p>
-            <w:pPr>
-              <w:spacing w:before="0" w:after="120"/>
-            </w:pPr>
-            <w:r>
-              <w:rPr>
-                <w:rFonts w:ascii="Arial" w:hAnsi="Arial" w:cs="Arial"/>
-                <w:b/>
-                <w:color w:val="1A1A1A"/>
-                <w:sz w:val="18"/>
-              </w:rPr>
-              <w:t>{{ applicant.full_name_native }}</w:t>
-            </w:r>
-          </w:p>
-          <w:p>
-            <w:pPr>
-              <w:spacing w:before="0" w:after="200"/>
-              <w:pBdr>
-                <w:bottom w:val="dashed" w:sz="4" w:space="1" w:color="808080"/>
-              </w:pBdr>
-            </w:pPr>
-          </w:p>
-          <w:p>
-            <w:pPr>
-              <w:spacing w:before="0" w:after="40"/>
-            </w:pPr>
-            <w:r>
-              <w:rPr>
-                <w:rFonts w:ascii="Arial" w:hAnsi="Arial" w:cs="Arial"/>
-                <w:color w:val="808080"/>
-                <w:sz w:val="16"/>
-              </w:rPr>
-              <w:t>Номер счёта</w:t>
-            </w:r>
-          </w:p>
-          <w:p>
-            <w:pPr>
-              <w:spacing w:before="0" w:after="120"/>
-            </w:pPr>
-            <w:r>
-              <w:rPr>
-                <w:rFonts w:ascii="Arial" w:hAnsi="Arial" w:cs="Arial"/>
-                <w:b/>
-                <w:color w:val="1A1A1A"/>
-                <w:sz w:val="18"/>
-              </w:rPr>
-              <w:t>{{ applicant.bank_account }}</w:t>
-            </w:r>
-          </w:p>
-          <w:p>
-            <w:pPr>
-              <w:spacing w:before="0" w:after="40"/>
-            </w:pPr>
-            <w:r>
-              <w:rPr>
-                <w:rFonts w:ascii="Arial" w:hAnsi="Arial" w:cs="Arial"/>
-                <w:color w:val="808080"/>
-                <w:sz w:val="16"/>
-              </w:rPr>
-              <w:t>Валюта</w:t>
-            </w:r>
-          </w:p>
-          <w:p>
-            <w:pPr>
-              <w:spacing w:before="0" w:after="120"/>
-            </w:pPr>
-            <w:r>
-              <w:rPr>
-                <w:rFonts w:ascii="Arial" w:hAnsi="Arial" w:cs="Arial"/>
-                <w:color w:val="1A1A1A"/>
-                <w:sz w:val="18"/>
-              </w:rPr>
-              <w:t>Российский рубль</w:t>
-            </w:r>
-          </w:p>
-          <w:p>
-            <w:pPr>
-              <w:spacing w:before="0" w:after="40"/>
-            </w:pPr>
-            <w:r>
-              <w:rPr>
-                <w:rFonts w:ascii="Arial" w:hAnsi="Arial" w:cs="Arial"/>
-                <w:color w:val="808080"/>
-                <w:sz w:val="16"/>
-              </w:rPr>
-              <w:t>Дата открытия счёта</w:t>
-            </w:r>
-          </w:p>
-          <w:p>
-            <w:pPr>
-              <w:spacing w:before="0" w:after="120"/>
-            </w:pPr>
-            <w:r>
-              <w:rPr>
-                <w:rFonts w:ascii="Arial" w:hAnsi="Arial" w:cs="Arial"/>
-                <w:color w:val="1A1A1A"/>
-                <w:sz w:val="18"/>
-              </w:rPr>
-              <w:t>{{ bank.account_open_date_formatted }}</w:t>
-            </w:r>
-          </w:p>
-          <w:p>
-            <w:pPr>
-              <w:spacing w:before="0" w:after="40"/>
-            </w:pPr>
-            <w:r>
-              <w:rPr>
-                <w:rFonts w:ascii="Arial" w:hAnsi="Arial" w:cs="Arial"/>
-                <w:color w:val="808080"/>
-                <w:sz w:val="16"/>
-              </w:rPr>
-              <w:t>Дата закрытия счёта</w:t>
-            </w:r>
-          </w:p>
-          <w:p>
-            <w:pPr>
-              <w:spacing w:before="0" w:after="120"/>
-            </w:pPr>
-            <w:r>
-              <w:rPr>
-                <w:rFonts w:ascii="Arial" w:hAnsi="Arial" w:cs="Arial"/>
-                <w:color w:val="1A1A1A"/>
-                <w:sz w:val="18"/>
-              </w:rPr>
-              <w:t>-</w:t>
-            </w:r>
-          </w:p>
-        </w:tc>
-        <w:tc>
-          <w:tcPr>
-            <w:tcW w:type="dxa" w:w="4818"/>
-            <w:tcMar>
-              <w:top w:w="120" w:type="dxa"/>
-              <w:bottom w:w="120" w:type="dxa"/>
-              <w:left w:w="160" w:type="dxa"/>
-              <w:right w:w="160" w:type="dxa"/>
-            </w:tcMar>
-            <w:vAlign w:val="top"/>
-          </w:tcPr>
-          <w:p>
-            <w:pPr>
-              <w:spacing w:before="0" w:after="80"/>
-            </w:pPr>
-            <w:r>
-              <w:rPr>
-                <w:rFonts w:ascii="Arial" w:hAnsi="Arial" w:cs="Arial"/>
-                <w:b/>
-                <w:color w:val="808080"/>
-                <w:sz w:val="16"/>
-              </w:rPr>
-              <w:t>ИТОГО ПО ОПЕРАЦИЯМ ЗА ПЕРИОД:</w:t>
-            </w:r>
-          </w:p>
-          <w:p>
-            <w:pPr>
-              <w:spacing w:before="0" w:after="120"/>
-              <w:pBdr>
-                <w:bottom w:val="single" w:sz="6" w:space="1" w:color="21A038"/>
-              </w:pBdr>
-            </w:pPr>
-          </w:p>
+          <w:p/>
           <w:tbl>
             <w:tblGrid>
-              <w:gridCol w:w="2834"/>
-              <w:gridCol w:w="1700"/>
+              <w:gridCol w:w="5385"/>
             </w:tblGrid>
             <w:tblPr>
               <w:tblW w:type="auto" w:w="0"/>
@@ -402,17 +218,37 @@
             <w:tr>
               <w:tc>
                 <w:tcPr>
-                  <w:tcW w:type="dxa" w:w="2834"/>
+                  <w:tcW w:type="dxa" w:w="5385"/>
                   <w:tcMar>
-                    <w:top w:w="0" w:type="dxa"/>
-                    <w:bottom w:w="0" w:type="dxa"/>
-                    <w:left w:w="0" w:type="dxa"/>
-                    <w:right w:w="0" w:type="dxa"/>
+                    <w:top w:w="80" w:type="dxa"/>
+                    <w:bottom w:w="80" w:type="dxa"/>
+                    <w:left w:w="120" w:type="dxa"/>
+                    <w:right w:w="120" w:type="dxa"/>
                   </w:tcMar>
+                  <w:shd w:val="clear" w:color="auto" w:fill="F5F5F5"/>
+                  <w:tcBorders>
+                    <w:top w:val="single" w:sz="4" w:color="D8D8D8" w:space="0"/>
+                    <w:bottom w:val="single" w:sz="4" w:color="D8D8D8" w:space="0"/>
+                    <w:left w:val="single" w:sz="4" w:color="D8D8D8" w:space="0"/>
+                    <w:right w:val="single" w:sz="4" w:color="D8D8D8" w:space="0"/>
+                  </w:tcBorders>
                 </w:tcPr>
                 <w:p>
                   <w:pPr>
-                    <w:spacing w:before="40" w:after="40"/>
+                    <w:spacing w:before="0" w:after="20"/>
+                  </w:pPr>
+                  <w:r>
+                    <w:rPr>
+                      <w:rFonts w:ascii="Arial" w:hAnsi="Arial" w:cs="Arial"/>
+                      <w:color w:val="808080"/>
+                      <w:sz w:val="16"/>
+                    </w:rPr>
+                    <w:t>Владелец счёта</w:t>
+                  </w:r>
+                </w:p>
+                <w:p>
+                  <w:pPr>
+                    <w:spacing w:before="0" w:after="80"/>
                   </w:pPr>
                   <w:r>
                     <w:rPr>
@@ -421,24 +257,33 @@
                       <w:color w:val="1A1A1A"/>
                       <w:sz w:val="18"/>
                     </w:rPr>
-                    <w:t>Остаток на {{ bank.period_start_formatted }}</w:t>
+                    <w:t>{{ applicant.full_name_native }}</w:t>
                   </w:r>
                 </w:p>
-              </w:tc>
-              <w:tc>
-                <w:tcPr>
-                  <w:tcW w:type="dxa" w:w="1700"/>
-                  <w:tcMar>
-                    <w:top w:w="0" w:type="dxa"/>
-                    <w:bottom w:w="0" w:type="dxa"/>
-                    <w:left w:w="0" w:type="dxa"/>
-                    <w:right w:w="0" w:type="dxa"/>
-                  </w:tcMar>
-                </w:tcPr>
                 <w:p>
                   <w:pPr>
-                    <w:jc w:val="right"/>
-                    <w:spacing w:before="40" w:after="40"/>
+                    <w:spacing w:before="0" w:after="120"/>
+                    <w:pBdr>
+                      <w:bottom w:val="dashed" w:sz="4" w:space="1" w:color="808080"/>
+                    </w:pBdr>
+                  </w:pPr>
+                </w:p>
+                <w:p>
+                  <w:pPr>
+                    <w:spacing w:before="0" w:after="20"/>
+                  </w:pPr>
+                  <w:r>
+                    <w:rPr>
+                      <w:rFonts w:ascii="Arial" w:hAnsi="Arial" w:cs="Arial"/>
+                      <w:color w:val="808080"/>
+                      <w:sz w:val="16"/>
+                    </w:rPr>
+                    <w:t>Номер счёта</w:t>
+                  </w:r>
+                </w:p>
+                <w:p>
+                  <w:pPr>
+                    <w:spacing w:before="0" w:after="80"/>
                   </w:pPr>
                   <w:r>
                     <w:rPr>
@@ -447,17 +292,118 @@
                       <w:color w:val="1A1A1A"/>
                       <w:sz w:val="18"/>
                     </w:rPr>
-                    <w:t>{{ bank.opening_balance_formatted }}</w:t>
+                    <w:t>{{ applicant.bank_account }}</w:t>
+                  </w:r>
+                </w:p>
+                <w:p>
+                  <w:pPr>
+                    <w:spacing w:before="0" w:after="20"/>
+                  </w:pPr>
+                  <w:r>
+                    <w:rPr>
+                      <w:rFonts w:ascii="Arial" w:hAnsi="Arial" w:cs="Arial"/>
+                      <w:color w:val="808080"/>
+                      <w:sz w:val="16"/>
+                    </w:rPr>
+                    <w:t>Валюта</w:t>
+                  </w:r>
+                </w:p>
+                <w:p>
+                  <w:pPr>
+                    <w:spacing w:before="0" w:after="80"/>
+                  </w:pPr>
+                  <w:r>
+                    <w:rPr>
+                      <w:rFonts w:ascii="Arial" w:hAnsi="Arial" w:cs="Arial"/>
+                      <w:color w:val="1A1A1A"/>
+                      <w:sz w:val="18"/>
+                    </w:rPr>
+                    <w:t>Российский рубль</w:t>
+                  </w:r>
+                </w:p>
+                <w:p>
+                  <w:pPr>
+                    <w:spacing w:before="0" w:after="20"/>
+                  </w:pPr>
+                  <w:r>
+                    <w:rPr>
+                      <w:rFonts w:ascii="Arial" w:hAnsi="Arial" w:cs="Arial"/>
+                      <w:color w:val="808080"/>
+                      <w:sz w:val="16"/>
+                    </w:rPr>
+                    <w:t>Дата открытия счёта</w:t>
+                  </w:r>
+                </w:p>
+                <w:p>
+                  <w:pPr>
+                    <w:spacing w:before="0" w:after="80"/>
+                  </w:pPr>
+                  <w:r>
+                    <w:rPr>
+                      <w:rFonts w:ascii="Arial" w:hAnsi="Arial" w:cs="Arial"/>
+                      <w:color w:val="1A1A1A"/>
+                      <w:sz w:val="18"/>
+                    </w:rPr>
+                    <w:t>{{ bank.account_open_date_formatted }}</w:t>
+                  </w:r>
+                </w:p>
+                <w:p>
+                  <w:pPr>
+                    <w:spacing w:before="0" w:after="20"/>
+                  </w:pPr>
+                  <w:r>
+                    <w:rPr>
+                      <w:rFonts w:ascii="Arial" w:hAnsi="Arial" w:cs="Arial"/>
+                      <w:color w:val="808080"/>
+                      <w:sz w:val="16"/>
+                    </w:rPr>
+                    <w:t>Дата закрытия счёта</w:t>
+                  </w:r>
+                </w:p>
+                <w:p>
+                  <w:pPr>
+                    <w:spacing w:before="0" w:after="80"/>
+                  </w:pPr>
+                  <w:r>
+                    <w:rPr>
+                      <w:rFonts w:ascii="Arial" w:hAnsi="Arial" w:cs="Arial"/>
+                      <w:color w:val="1A1A1A"/>
+                      <w:sz w:val="18"/>
+                    </w:rPr>
+                    <w:t>-</w:t>
                   </w:r>
                 </w:p>
               </w:tc>
             </w:tr>
           </w:tbl>
           <w:p/>
+        </w:tc>
+        <w:tc>
+          <w:tcPr>
+            <w:tcW w:type="dxa" w:w="283"/>
+            <w:tcMar>
+              <w:top w:w="0" w:type="dxa"/>
+              <w:bottom w:w="0" w:type="dxa"/>
+              <w:left w:w="0" w:type="dxa"/>
+              <w:right w:w="0" w:type="dxa"/>
+            </w:tcMar>
+          </w:tcPr>
+          <w:p/>
+        </w:tc>
+        <w:tc>
+          <w:tcPr>
+            <w:tcW w:type="dxa" w:w="4535"/>
+            <w:tcMar>
+              <w:top w:w="0" w:type="dxa"/>
+              <w:bottom w:w="0" w:type="dxa"/>
+              <w:left w:w="0" w:type="dxa"/>
+              <w:right w:w="0" w:type="dxa"/>
+            </w:tcMar>
+          </w:tcPr>
+          <w:p/>
           <w:tbl>
             <w:tblGrid>
-              <w:gridCol w:w="2834"/>
-              <w:gridCol w:w="1700"/>
+              <w:gridCol w:w="4535"/>
             </w:tblGrid>
             <w:tblPr>
               <w:tblW w:type="auto" w:w="0"/>
@@ -475,206 +421,330 @@
             <w:tr>
               <w:tc>
                 <w:tcPr>
-                  <w:tcW w:type="dxa" w:w="2834"/>
+                  <w:tcW w:type="dxa" w:w="4535"/>
                   <w:tcMar>
-                    <w:top w:w="0" w:type="dxa"/>
-                    <w:bottom w:w="0" w:type="dxa"/>
-                    <w:left w:w="0" w:type="dxa"/>
-                    <w:right w:w="0" w:type="dxa"/>
+                    <w:top w:w="80" w:type="dxa"/>
+                    <w:bottom w:w="80" w:type="dxa"/>
+                    <w:left w:w="80" w:type="dxa"/>
+                    <w:right w:w="80" w:type="dxa"/>
                   </w:tcMar>
                 </w:tcPr>
                 <w:p>
                   <w:pPr>
-                    <w:spacing w:before="40" w:after="40"/>
-                  </w:pPr>
-                  <w:r>
-                    <w:rPr>
-                      <w:rFonts w:ascii="Arial" w:hAnsi="Arial" w:cs="Arial"/>
-                      <w:color w:val="1A1A1A"/>
-                      <w:sz w:val="18"/>
-                    </w:rPr>
-                    <w:t>Пополнение</w:t>
-                  </w:r>
-                </w:p>
-              </w:tc>
-              <w:tc>
-                <w:tcPr>
-                  <w:tcW w:type="dxa" w:w="1700"/>
-                  <w:tcMar>
-                    <w:top w:w="0" w:type="dxa"/>
-                    <w:bottom w:w="0" w:type="dxa"/>
-                    <w:left w:w="0" w:type="dxa"/>
-                    <w:right w:w="0" w:type="dxa"/>
-                  </w:tcMar>
-                </w:tcPr>
-                <w:p>
-                  <w:pPr>
-                    <w:jc w:val="right"/>
-                    <w:spacing w:before="40" w:after="40"/>
+                    <w:spacing w:before="0" w:after="40"/>
                   </w:pPr>
                   <w:r>
                     <w:rPr>
                       <w:rFonts w:ascii="Arial" w:hAnsi="Arial" w:cs="Arial"/>
                       <w:b/>
-                      <w:color w:val="1A1A1A"/>
-                      <w:sz w:val="18"/>
+                      <w:color w:val="808080"/>
+                      <w:sz w:val="16"/>
                     </w:rPr>
-                    <w:t>{{ bank.total_income_formatted }}</w:t>
+                    <w:t>ИТОГО ПО ОПЕРАЦИЯМ ЗА ПЕРИОД:</w:t>
                   </w:r>
                 </w:p>
-              </w:tc>
-            </w:tr>
-          </w:tbl>
-          <w:p/>
-          <w:tbl>
-            <w:tblGrid>
-              <w:gridCol w:w="2834"/>
-              <w:gridCol w:w="1700"/>
-            </w:tblGrid>
-            <w:tblPr>
-              <w:tblW w:type="auto" w:w="0"/>
-              <w:tblLayout w:type="fixed"/>
-              <w:tblLook w:firstColumn="1" w:firstRow="1" w:lastColumn="0" w:lastRow="0" w:noHBand="0" w:noVBand="1" w:val="04A0"/>
-              <w:tblBorders>
-                <w:top w:val="nil"/>
-                <w:left w:val="nil"/>
-                <w:bottom w:val="nil"/>
-                <w:right w:val="nil"/>
-                <w:insideH w:val="nil"/>
-                <w:insideV w:val="nil"/>
-              </w:tblBorders>
-            </w:tblPr>
-            <w:tr>
-              <w:tc>
-                <w:tcPr>
-                  <w:tcW w:type="dxa" w:w="2834"/>
-                  <w:tcMar>
-                    <w:top w:w="0" w:type="dxa"/>
-                    <w:bottom w:w="0" w:type="dxa"/>
-                    <w:left w:w="0" w:type="dxa"/>
-                    <w:right w:w="0" w:type="dxa"/>
-                  </w:tcMar>
-                </w:tcPr>
+                <w:p>
+                  <w:pPr>
+                    <w:spacing w:before="0" w:after="60"/>
+                    <w:pBdr>
+                      <w:bottom w:val="single" w:sz="6" w:space="1" w:color="21A038"/>
+                    </w:pBdr>
+                  </w:pPr>
+                </w:p>
+                <w:tbl>
+                  <w:tblGrid>
+                    <w:gridCol w:w="2834"/>
+                    <w:gridCol w:w="1700"/>
+                  </w:tblGrid>
+                  <w:tblPr>
+                    <w:tblW w:type="auto" w:w="0"/>
+                    <w:tblLayout w:type="fixed"/>
+                    <w:tblLook w:firstColumn="1" w:firstRow="1" w:lastColumn="0" w:lastRow="0" w:noHBand="0" w:noVBand="1" w:val="04A0"/>
+                    <w:tblBorders>
+                      <w:top w:val="nil"/>
+                      <w:left w:val="nil"/>
+                      <w:bottom w:val="nil"/>
+                      <w:right w:val="nil"/>
+                      <w:insideH w:val="nil"/>
+                      <w:insideV w:val="nil"/>
+                    </w:tblBorders>
+                  </w:tblPr>
+                  <w:tr>
+                    <w:tc>
+                      <w:tcPr>
+                        <w:tcW w:type="dxa" w:w="2834"/>
+                        <w:tcMar>
+                          <w:top w:w="60" w:type="dxa"/>
+                          <w:bottom w:w="60" w:type="dxa"/>
+                          <w:left w:w="0" w:type="dxa"/>
+                          <w:right w:w="0" w:type="dxa"/>
+                        </w:tcMar>
+                      </w:tcPr>
+                      <w:p>
+                        <w:pPr>
+                          <w:spacing w:before="0" w:after="0"/>
+                        </w:pPr>
+                        <w:r>
+                          <w:rPr>
+                            <w:rFonts w:ascii="Arial" w:hAnsi="Arial" w:cs="Arial"/>
+                            <w:b/>
+                            <w:color w:val="1A1A1A"/>
+                            <w:sz w:val="18"/>
+                          </w:rPr>
+                          <w:t>Остаток на {{ bank.period_start_formatted }}</w:t>
+                        </w:r>
+                      </w:p>
+                    </w:tc>
+                    <w:tc>
+                      <w:tcPr>
+                        <w:tcW w:type="dxa" w:w="1700"/>
+                        <w:tcMar>
+                          <w:top w:w="60" w:type="dxa"/>
+                          <w:bottom w:w="60" w:type="dxa"/>
+                          <w:left w:w="0" w:type="dxa"/>
+                          <w:right w:w="0" w:type="dxa"/>
+                        </w:tcMar>
+                      </w:tcPr>
+                      <w:p>
+                        <w:pPr>
+                          <w:jc w:val="right"/>
+                          <w:spacing w:before="0" w:after="0"/>
+                        </w:pPr>
+                        <w:r>
+                          <w:rPr>
+                            <w:rFonts w:ascii="Arial" w:hAnsi="Arial" w:cs="Arial"/>
+                            <w:b/>
+                            <w:color w:val="1A1A1A"/>
+                            <w:sz w:val="18"/>
+                          </w:rPr>
+                          <w:t>{{ bank.opening_balance_formatted }}</w:t>
+                        </w:r>
+                      </w:p>
+                    </w:tc>
+                  </w:tr>
+                </w:tbl>
+                <w:tbl>
+                  <w:tblGrid>
+                    <w:gridCol w:w="2834"/>
+                    <w:gridCol w:w="1700"/>
+                  </w:tblGrid>
+                  <w:tblPr>
+                    <w:tblW w:type="auto" w:w="0"/>
+                    <w:tblLayout w:type="fixed"/>
+                    <w:tblLook w:firstColumn="1" w:firstRow="1" w:lastColumn="0" w:lastRow="0" w:noHBand="0" w:noVBand="1" w:val="04A0"/>
+                    <w:tblBorders>
+                      <w:top w:val="nil"/>
+                      <w:left w:val="nil"/>
+                      <w:bottom w:val="nil"/>
+                      <w:right w:val="nil"/>
+                      <w:insideH w:val="nil"/>
+                      <w:insideV w:val="nil"/>
+                    </w:tblBorders>
+                  </w:tblPr>
+                  <w:tr>
+                    <w:tc>
+                      <w:tcPr>
+                        <w:tcW w:type="dxa" w:w="2834"/>
+                        <w:tcMar>
+                          <w:top w:w="60" w:type="dxa"/>
+                          <w:bottom w:w="60" w:type="dxa"/>
+                          <w:left w:w="0" w:type="dxa"/>
+                          <w:right w:w="0" w:type="dxa"/>
+                        </w:tcMar>
+                      </w:tcPr>
+                      <w:p>
+                        <w:pPr>
+                          <w:spacing w:before="0" w:after="0"/>
+                        </w:pPr>
+                        <w:r>
+                          <w:rPr>
+                            <w:rFonts w:ascii="Arial" w:hAnsi="Arial" w:cs="Arial"/>
+                            <w:color w:val="1A1A1A"/>
+                            <w:sz w:val="18"/>
+                          </w:rPr>
+                          <w:t>Пополнение</w:t>
+                        </w:r>
+                      </w:p>
+                    </w:tc>
+                    <w:tc>
+                      <w:tcPr>
+                        <w:tcW w:type="dxa" w:w="1700"/>
+                        <w:tcMar>
+                          <w:top w:w="60" w:type="dxa"/>
+                          <w:bottom w:w="60" w:type="dxa"/>
+                          <w:left w:w="0" w:type="dxa"/>
+                          <w:right w:w="0" w:type="dxa"/>
+                        </w:tcMar>
+                      </w:tcPr>
+                      <w:p>
+                        <w:pPr>
+                          <w:jc w:val="right"/>
+                          <w:spacing w:before="0" w:after="0"/>
+                        </w:pPr>
+                        <w:r>
+                          <w:rPr>
+                            <w:rFonts w:ascii="Arial" w:hAnsi="Arial" w:cs="Arial"/>
+                            <w:b/>
+                            <w:color w:val="1A1A1A"/>
+                            <w:sz w:val="18"/>
+                          </w:rPr>
+                          <w:t>{{ bank.total_income_formatted }}</w:t>
+                        </w:r>
+                      </w:p>
+                    </w:tc>
+                  </w:tr>
+                </w:tbl>
+                <w:tbl>
+                  <w:tblGrid>
+                    <w:gridCol w:w="2834"/>
+                    <w:gridCol w:w="1700"/>
+                  </w:tblGrid>
+                  <w:tblPr>
+                    <w:tblW w:type="auto" w:w="0"/>
+                    <w:tblLayout w:type="fixed"/>
+                    <w:tblLook w:firstColumn="1" w:firstRow="1" w:lastColumn="0" w:lastRow="0" w:noHBand="0" w:noVBand="1" w:val="04A0"/>
+                    <w:tblBorders>
+                      <w:top w:val="nil"/>
+                      <w:left w:val="nil"/>
+                      <w:bottom w:val="nil"/>
+                      <w:right w:val="nil"/>
+                      <w:insideH w:val="nil"/>
+                      <w:insideV w:val="nil"/>
+                    </w:tblBorders>
+                  </w:tblPr>
+                  <w:tr>
+                    <w:tc>
+                      <w:tcPr>
+                        <w:tcW w:type="dxa" w:w="2834"/>
+                        <w:tcMar>
+                          <w:top w:w="60" w:type="dxa"/>
+                          <w:bottom w:w="60" w:type="dxa"/>
+                          <w:left w:w="0" w:type="dxa"/>
+                          <w:right w:w="0" w:type="dxa"/>
+                        </w:tcMar>
+                      </w:tcPr>
+                      <w:p>
+                        <w:pPr>
+                          <w:spacing w:before="0" w:after="0"/>
+                        </w:pPr>
+                        <w:r>
+                          <w:rPr>
+                            <w:rFonts w:ascii="Arial" w:hAnsi="Arial" w:cs="Arial"/>
+                            <w:color w:val="1A1A1A"/>
+                            <w:sz w:val="18"/>
+                          </w:rPr>
+                          <w:t>Списание</w:t>
+                        </w:r>
+                      </w:p>
+                    </w:tc>
+                    <w:tc>
+                      <w:tcPr>
+                        <w:tcW w:type="dxa" w:w="1700"/>
+                        <w:tcMar>
+                          <w:top w:w="60" w:type="dxa"/>
+                          <w:bottom w:w="60" w:type="dxa"/>
+                          <w:left w:w="0" w:type="dxa"/>
+                          <w:right w:w="0" w:type="dxa"/>
+                        </w:tcMar>
+                      </w:tcPr>
+                      <w:p>
+                        <w:pPr>
+                          <w:jc w:val="right"/>
+                          <w:spacing w:before="0" w:after="0"/>
+                        </w:pPr>
+                        <w:r>
+                          <w:rPr>
+                            <w:rFonts w:ascii="Arial" w:hAnsi="Arial" w:cs="Arial"/>
+                            <w:b/>
+                            <w:color w:val="1A1A1A"/>
+                            <w:sz w:val="18"/>
+                          </w:rPr>
+                          <w:t>{{ bank.total_expense_formatted }}</w:t>
+                        </w:r>
+                      </w:p>
+                    </w:tc>
+                  </w:tr>
+                </w:tbl>
                 <w:p>
                   <w:pPr>
                     <w:spacing w:before="40" w:after="40"/>
+                    <w:pBdr>
+                      <w:bottom w:val="single" w:sz="4" w:space="1" w:color="BDBDBD"/>
+                    </w:pBdr>
                   </w:pPr>
-                  <w:r>
-                    <w:rPr>
-                      <w:rFonts w:ascii="Arial" w:hAnsi="Arial" w:cs="Arial"/>
-                      <w:color w:val="1A1A1A"/>
-                      <w:sz w:val="18"/>
-                    </w:rPr>
-                    <w:t>Списание</w:t>
-                  </w:r>
                 </w:p>
-              </w:tc>
-              <w:tc>
-                <w:tcPr>
-                  <w:tcW w:type="dxa" w:w="1700"/>
-                  <w:tcMar>
-                    <w:top w:w="0" w:type="dxa"/>
-                    <w:bottom w:w="0" w:type="dxa"/>
-                    <w:left w:w="0" w:type="dxa"/>
-                    <w:right w:w="0" w:type="dxa"/>
-                  </w:tcMar>
-                </w:tcPr>
-                <w:p>
-                  <w:pPr>
-                    <w:jc w:val="right"/>
-                    <w:spacing w:before="40" w:after="40"/>
-                  </w:pPr>
-                  <w:r>
-                    <w:rPr>
-                      <w:rFonts w:ascii="Arial" w:hAnsi="Arial" w:cs="Arial"/>
-                      <w:b/>
-                      <w:color w:val="1A1A1A"/>
-                      <w:sz w:val="18"/>
-                    </w:rPr>
-                    <w:t>{{ bank.total_expense_formatted }}</w:t>
-                  </w:r>
-                </w:p>
-              </w:tc>
-            </w:tr>
-          </w:tbl>
-          <w:p/>
-          <w:p>
-            <w:pPr>
-              <w:spacing w:before="40" w:after="40"/>
-              <w:pBdr>
-                <w:bottom w:val="single" w:sz="4" w:space="1" w:color="BDBDBD"/>
-              </w:pBdr>
-            </w:pPr>
-          </w:p>
-          <w:tbl>
-            <w:tblGrid>
-              <w:gridCol w:w="2834"/>
-              <w:gridCol w:w="1700"/>
-            </w:tblGrid>
-            <w:tblPr>
-              <w:tblW w:type="auto" w:w="0"/>
-              <w:tblLayout w:type="fixed"/>
-              <w:tblLook w:firstColumn="1" w:firstRow="1" w:lastColumn="0" w:lastRow="0" w:noHBand="0" w:noVBand="1" w:val="04A0"/>
-              <w:tblBorders>
-                <w:top w:val="nil"/>
-                <w:left w:val="nil"/>
-                <w:bottom w:val="nil"/>
-                <w:right w:val="nil"/>
-                <w:insideH w:val="nil"/>
-                <w:insideV w:val="nil"/>
-              </w:tblBorders>
-            </w:tblPr>
-            <w:tr>
-              <w:tc>
-                <w:tcPr>
-                  <w:tcW w:type="dxa" w:w="2834"/>
-                  <w:tcMar>
-                    <w:top w:w="0" w:type="dxa"/>
-                    <w:bottom w:w="0" w:type="dxa"/>
-                    <w:left w:w="0" w:type="dxa"/>
-                    <w:right w:w="0" w:type="dxa"/>
-                  </w:tcMar>
-                </w:tcPr>
-                <w:p>
-                  <w:pPr>
-                    <w:spacing w:before="40" w:after="40"/>
-                  </w:pPr>
-                  <w:r>
-                    <w:rPr>
-                      <w:rFonts w:ascii="Arial" w:hAnsi="Arial" w:cs="Arial"/>
-                      <w:b/>
-                      <w:color w:val="1A1A1A"/>
-                      <w:sz w:val="18"/>
-                    </w:rPr>
-                    <w:t>Остаток на {{ bank.period_end_formatted }}</w:t>
-                  </w:r>
-                </w:p>
-              </w:tc>
-              <w:tc>
-                <w:tcPr>
-                  <w:tcW w:type="dxa" w:w="1700"/>
-                  <w:tcMar>
-                    <w:top w:w="0" w:type="dxa"/>
-                    <w:bottom w:w="0" w:type="dxa"/>
-                    <w:left w:w="0" w:type="dxa"/>
-                    <w:right w:w="0" w:type="dxa"/>
-                  </w:tcMar>
-                </w:tcPr>
-                <w:p>
-                  <w:pPr>
-                    <w:jc w:val="right"/>
-                    <w:spacing w:before="40" w:after="40"/>
-                  </w:pPr>
-                  <w:r>
-                    <w:rPr>
-                      <w:rFonts w:ascii="Arial" w:hAnsi="Arial" w:cs="Arial"/>
-                      <w:b/>
-                      <w:color w:val="1A1A1A"/>
-                      <w:sz w:val="18"/>
-                    </w:rPr>
-                    <w:t>{{ bank.closing_balance_formatted }}</w:t>
-                  </w:r>
-                </w:p>
+                <w:tbl>
+                  <w:tblGrid>
+                    <w:gridCol w:w="2834"/>
+                    <w:gridCol w:w="1700"/>
+                  </w:tblGrid>
+                  <w:tblPr>
+                    <w:tblW w:type="auto" w:w="0"/>
+                    <w:tblLayout w:type="fixed"/>
+                    <w:tblLook w:firstColumn="1" w:firstRow="1" w:lastColumn="0" w:lastRow="0" w:noHBand="0" w:noVBand="1" w:val="04A0"/>
+                    <w:tblBorders>
+                      <w:top w:val="nil"/>
+                      <w:left w:val="nil"/>
+                      <w:bottom w:val="nil"/>
+                      <w:right w:val="nil"/>
+                      <w:insideH w:val="nil"/>
+                      <w:insideV w:val="nil"/>
+                    </w:tblBorders>
+                  </w:tblPr>
+                  <w:tr>
+                    <w:tc>
+                      <w:tcPr>
+                        <w:tcW w:type="dxa" w:w="2834"/>
+                        <w:tcMar>
+                          <w:top w:w="60" w:type="dxa"/>
+                          <w:bottom w:w="60" w:type="dxa"/>
+                          <w:left w:w="0" w:type="dxa"/>
+                          <w:right w:w="0" w:type="dxa"/>
+                        </w:tcMar>
+                      </w:tcPr>
+                      <w:p>
+                        <w:pPr>
+                          <w:spacing w:before="0" w:after="0"/>
+                        </w:pPr>
+                        <w:r>
+                          <w:rPr>
+                            <w:rFonts w:ascii="Arial" w:hAnsi="Arial" w:cs="Arial"/>
+                            <w:b/>
+                            <w:color w:val="1A1A1A"/>
+                            <w:sz w:val="18"/>
+                          </w:rPr>
+                          <w:t>Остаток на {{ bank.period_end_formatted }}</w:t>
+                        </w:r>
+                      </w:p>
+                    </w:tc>
+                    <w:tc>
+                      <w:tcPr>
+                        <w:tcW w:type="dxa" w:w="1700"/>
+                        <w:tcMar>
+                          <w:top w:w="60" w:type="dxa"/>
+                          <w:bottom w:w="60" w:type="dxa"/>
+                          <w:left w:w="0" w:type="dxa"/>
+                          <w:right w:w="0" w:type="dxa"/>
+                        </w:tcMar>
+                      </w:tcPr>
+                      <w:p>
+                        <w:pPr>
+                          <w:jc w:val="right"/>
+                          <w:spacing w:before="0" w:after="0"/>
+                        </w:pPr>
+                        <w:r>
+                          <w:rPr>
+                            <w:rFonts w:ascii="Arial" w:hAnsi="Arial" w:cs="Arial"/>
+                            <w:b/>
+                            <w:color w:val="1A1A1A"/>
+                            <w:sz w:val="18"/>
+                          </w:rPr>
+                          <w:t>{{ bank.closing_balance_formatted }}</w:t>
+                        </w:r>
+                      </w:p>
+                    </w:tc>
+                  </w:tr>
+                </w:tbl>
               </w:tc>
             </w:tr>
           </w:tbl>
@@ -1196,8 +1266,8 @@
                         <w:tcW w:type="dxa" w:w="1020"/>
                         <w:shd w:val="clear" w:color="auto" w:fill="EAF3FA"/>
                         <w:tcMar>
-                          <w:top w:w="40" w:type="dxa"/>
-                          <w:bottom w:w="40" w:type="dxa"/>
+                          <w:top w:w="20" w:type="dxa"/>
+                          <w:bottom w:w="20" w:type="dxa"/>
                           <w:left w:w="60" w:type="dxa"/>
                           <w:right w:w="20" w:type="dxa"/>
                         </w:tcMar>
@@ -1223,7 +1293,7 @@
                                       <pic:cNvPicPr/>
                                     </pic:nvPicPr>
                                     <pic:blipFill>
-                                      <a:blip r:embed="rId11"/>
+                                      <a:blip r:embed="rId9"/>
                                       <a:stretch>
                                         <a:fillRect/>
                                       </a:stretch>
@@ -1248,8 +1318,8 @@
                         <w:tcW w:type="dxa" w:w="3514"/>
                         <w:shd w:val="clear" w:color="auto" w:fill="EAF3FA"/>
                         <w:tcMar>
-                          <w:top w:w="40" w:type="dxa"/>
-                          <w:bottom w:w="40" w:type="dxa"/>
+                          <w:top w:w="20" w:type="dxa"/>
+                          <w:bottom w:w="20" w:type="dxa"/>
                           <w:left w:w="20" w:type="dxa"/>
                           <w:right w:w="60" w:type="dxa"/>
                         </w:tcMar>
@@ -1319,8 +1389,8 @@
                         <w:tcW w:type="dxa" w:w="4535"/>
                         <w:shd w:val="clear" w:color="auto" w:fill="296FCE"/>
                         <w:tcMar>
-                          <w:top w:w="30" w:type="dxa"/>
-                          <w:bottom w:w="30" w:type="dxa"/>
+                          <w:top w:w="20" w:type="dxa"/>
+                          <w:bottom w:w="20" w:type="dxa"/>
                           <w:left w:w="60" w:type="dxa"/>
                           <w:right w:w="60" w:type="dxa"/>
                         </w:tcMar>
@@ -1367,8 +1437,8 @@
                       <w:tcPr>
                         <w:tcW w:type="dxa" w:w="1360"/>
                         <w:tcMar>
-                          <w:top w:w="15" w:type="dxa"/>
-                          <w:bottom w:w="15" w:type="dxa"/>
+                          <w:top w:w="10" w:type="dxa"/>
+                          <w:bottom w:w="10" w:type="dxa"/>
                           <w:left w:w="60" w:type="dxa"/>
                           <w:right w:w="60" w:type="dxa"/>
                         </w:tcMar>
@@ -1392,8 +1462,8 @@
                       <w:tcPr>
                         <w:tcW w:type="dxa" w:w="3174"/>
                         <w:tcMar>
-                          <w:top w:w="15" w:type="dxa"/>
-                          <w:bottom w:w="15" w:type="dxa"/>
+                          <w:top w:w="10" w:type="dxa"/>
+                          <w:bottom w:w="10" w:type="dxa"/>
                           <w:left w:w="60" w:type="dxa"/>
                           <w:right w:w="60" w:type="dxa"/>
                         </w:tcMar>
@@ -1419,8 +1489,8 @@
                       <w:tcPr>
                         <w:tcW w:type="dxa" w:w="1360"/>
                         <w:tcMar>
-                          <w:top w:w="15" w:type="dxa"/>
-                          <w:bottom w:w="15" w:type="dxa"/>
+                          <w:top w:w="10" w:type="dxa"/>
+                          <w:bottom w:w="10" w:type="dxa"/>
                           <w:left w:w="60" w:type="dxa"/>
                           <w:right w:w="60" w:type="dxa"/>
                         </w:tcMar>
@@ -1444,8 +1514,8 @@
                       <w:tcPr>
                         <w:tcW w:type="dxa" w:w="3174"/>
                         <w:tcMar>
-                          <w:top w:w="15" w:type="dxa"/>
-                          <w:bottom w:w="15" w:type="dxa"/>
+                          <w:top w:w="10" w:type="dxa"/>
+                          <w:bottom w:w="10" w:type="dxa"/>
                           <w:left w:w="60" w:type="dxa"/>
                           <w:right w:w="60" w:type="dxa"/>
                         </w:tcMar>
@@ -1472,8 +1542,8 @@
                       <w:tcPr>
                         <w:tcW w:type="dxa" w:w="1360"/>
                         <w:tcMar>
-                          <w:top w:w="15" w:type="dxa"/>
-                          <w:bottom w:w="15" w:type="dxa"/>
+                          <w:top w:w="10" w:type="dxa"/>
+                          <w:bottom w:w="10" w:type="dxa"/>
                           <w:left w:w="60" w:type="dxa"/>
                           <w:right w:w="60" w:type="dxa"/>
                         </w:tcMar>
@@ -1497,8 +1567,8 @@
                       <w:tcPr>
                         <w:tcW w:type="dxa" w:w="3174"/>
                         <w:tcMar>
-                          <w:top w:w="15" w:type="dxa"/>
-                          <w:bottom w:w="15" w:type="dxa"/>
+                          <w:top w:w="10" w:type="dxa"/>
+                          <w:bottom w:w="10" w:type="dxa"/>
                           <w:left w:w="60" w:type="dxa"/>
                           <w:right w:w="60" w:type="dxa"/>
                         </w:tcMar>
@@ -1524,8 +1594,8 @@
                       <w:tcPr>
                         <w:tcW w:type="dxa" w:w="1360"/>
                         <w:tcMar>
-                          <w:top w:w="15" w:type="dxa"/>
-                          <w:bottom w:w="15" w:type="dxa"/>
+                          <w:top w:w="10" w:type="dxa"/>
+                          <w:bottom w:w="10" w:type="dxa"/>
                           <w:left w:w="60" w:type="dxa"/>
                           <w:right w:w="60" w:type="dxa"/>
                         </w:tcMar>
@@ -1549,8 +1619,8 @@
                       <w:tcPr>
                         <w:tcW w:type="dxa" w:w="3174"/>
                         <w:tcMar>
-                          <w:top w:w="15" w:type="dxa"/>
-                          <w:bottom w:w="15" w:type="dxa"/>
+                          <w:top w:w="10" w:type="dxa"/>
+                          <w:bottom w:w="10" w:type="dxa"/>
                           <w:left w:w="60" w:type="dxa"/>
                           <w:right w:w="60" w:type="dxa"/>
                         </w:tcMar>
@@ -1703,116 +1773,13 @@
       </w:r>
     </w:p>
     <w:sectPr>
-      <w:headerReference w:type="first" r:id="rId9"/>
-      <w:headerReference w:type="default" r:id="rId10"/>
       <w:pgSz w:w="11906" w:h="16838"/>
       <w:pgMar w:top="850" w:right="850" w:bottom="850" w:left="850" w:header="720" w:footer="720" w:gutter="0"/>
       <w:cols w:space="720"/>
-      <w:titlePg/>
       <w:docGrid w:linePitch="360"/>
     </w:sectPr>
   </w:body>
 </w:document>
-</file>
-
-<file path=word/header1.xml><?xml version="1.0" encoding="utf-8"?>
-<w:hdr xmlns:m="http://schemas.openxmlformats.org/officeDocument/2006/math" xmlns:mc="http://schemas.openxmlformats.org/markup-compatibility/2006" xmlns:mo="http://schemas.microsoft.com/office/mac/office/2008/main" xmlns:mv="urn:schemas-microsoft-com:mac:vml" xmlns:o="urn:schemas-microsoft-com:office:office" xmlns:r="http://schemas.openxmlformats.org/officeDocument/2006/relationships" xmlns:v="urn:schemas-microsoft-com:vml" xmlns:w10="urn:schemas-microsoft-com:office:word" xmlns:w14="http://schemas.microsoft.com/office/word/2010/wordml" xmlns:w="http://schemas.openxmlformats.org/wordprocessingml/2006/main" xmlns:wne="http://schemas.microsoft.com/office/word/2006/wordml" xmlns:wp14="http://schemas.microsoft.com/office/word/2010/wordprocessingDrawing" xmlns:wp="http://schemas.openxmlformats.org/drawingml/2006/wordprocessingDrawing" xmlns:wpc="http://schemas.microsoft.com/office/word/2010/wordprocessingCanvas" xmlns:wpg="http://schemas.microsoft.com/office/word/2010/wordprocessingGroup" xmlns:wpi="http://schemas.microsoft.com/office/word/2010/wordprocessingInk" xmlns:wps="http://schemas.microsoft.com/office/word/2010/wordprocessingShape" mc:Ignorable="w14 wp14">
-  <w:p>
-    <w:pPr>
-      <w:pStyle w:val="Header"/>
-    </w:pPr>
-    <w:r/>
-  </w:p>
-</w:hdr>
-</file>
-
-<file path=word/header2.xml><?xml version="1.0" encoding="utf-8"?>
-<w:hdr xmlns:m="http://schemas.openxmlformats.org/officeDocument/2006/math" xmlns:mc="http://schemas.openxmlformats.org/markup-compatibility/2006" xmlns:mo="http://schemas.microsoft.com/office/mac/office/2008/main" xmlns:mv="urn:schemas-microsoft-com:mac:vml" xmlns:o="urn:schemas-microsoft-com:office:office" xmlns:r="http://schemas.openxmlformats.org/officeDocument/2006/relationships" xmlns:v="urn:schemas-microsoft-com:vml" xmlns:w10="urn:schemas-microsoft-com:office:word" xmlns:w14="http://schemas.microsoft.com/office/word/2010/wordml" xmlns:w="http://schemas.openxmlformats.org/wordprocessingml/2006/main" xmlns:wne="http://schemas.microsoft.com/office/word/2006/wordml" xmlns:wp14="http://schemas.microsoft.com/office/word/2010/wordprocessingDrawing" xmlns:wp="http://schemas.openxmlformats.org/drawingml/2006/wordprocessingDrawing" xmlns:wpc="http://schemas.microsoft.com/office/word/2010/wordprocessingCanvas" xmlns:wpg="http://schemas.microsoft.com/office/word/2010/wordprocessingGroup" xmlns:wpi="http://schemas.microsoft.com/office/word/2010/wordprocessingInk" xmlns:wps="http://schemas.microsoft.com/office/word/2010/wordprocessingShape" mc:Ignorable="w14 wp14">
-  <w:p>
-    <w:pPr>
-      <w:pStyle w:val="Header"/>
-      <w:tabs>
-        <w:tab w:val="right" w:pos="10206"/>
-      </w:tabs>
-    </w:pPr>
-    <w:r>
-      <w:rPr>
-        <w:rFonts w:ascii="Arial" w:hAnsi="Arial" w:cs="Arial"/>
-        <w:b/>
-        <w:color w:val="1A1A1A"/>
-        <w:sz w:val="16"/>
-      </w:rPr>
-      <w:t>Выписка по платёжному счёту</w:t>
-    </w:r>
-    <w:r>
-      <w:tab/>
-    </w:r>
-    <w:r>
-      <w:rPr>
-        <w:rFonts w:ascii="Arial" w:hAnsi="Arial" w:cs="Arial"/>
-        <w:color w:val="1A1A1A"/>
-        <w:sz w:val="16"/>
-      </w:rPr>
-      <w:t xml:space="preserve">Страница </w:t>
-    </w:r>
-    <w:r>
-      <w:rPr>
-        <w:rFonts w:ascii="Arial" w:hAnsi="Arial" w:cs="Arial"/>
-        <w:color w:val="1A1A1A"/>
-        <w:sz w:val="16"/>
-      </w:rPr>
-      <w:fldChar w:fldCharType="begin"/>
-    </w:r>
-    <w:r>
-      <w:rPr>
-        <w:rFonts w:ascii="Arial" w:hAnsi="Arial" w:cs="Arial"/>
-        <w:color w:val="1A1A1A"/>
-        <w:sz w:val="16"/>
-      </w:rPr>
-      <w:instrText xml:space="preserve"> PAGE </w:instrText>
-    </w:r>
-    <w:r>
-      <w:rPr>
-        <w:rFonts w:ascii="Arial" w:hAnsi="Arial" w:cs="Arial"/>
-        <w:color w:val="1A1A1A"/>
-        <w:sz w:val="16"/>
-      </w:rPr>
-      <w:fldChar w:fldCharType="end"/>
-    </w:r>
-    <w:r>
-      <w:rPr>
-        <w:rFonts w:ascii="Arial" w:hAnsi="Arial" w:cs="Arial"/>
-        <w:color w:val="1A1A1A"/>
-        <w:sz w:val="16"/>
-      </w:rPr>
-      <w:t xml:space="preserve"> из </w:t>
-    </w:r>
-    <w:r>
-      <w:rPr>
-        <w:rFonts w:ascii="Arial" w:hAnsi="Arial" w:cs="Arial"/>
-        <w:color w:val="1A1A1A"/>
-        <w:sz w:val="16"/>
-      </w:rPr>
-      <w:fldChar w:fldCharType="begin"/>
-    </w:r>
-    <w:r>
-      <w:rPr>
-        <w:rFonts w:ascii="Arial" w:hAnsi="Arial" w:cs="Arial"/>
-        <w:color w:val="1A1A1A"/>
-        <w:sz w:val="16"/>
-      </w:rPr>
-      <w:instrText xml:space="preserve"> NUMPAGES </w:instrText>
-    </w:r>
-    <w:r>
-      <w:rPr>
-        <w:rFonts w:ascii="Arial" w:hAnsi="Arial" w:cs="Arial"/>
-        <w:color w:val="1A1A1A"/>
-        <w:sz w:val="16"/>
-      </w:rPr>
-      <w:fldChar w:fldCharType="end"/>
-    </w:r>
-  </w:p>
-</w:hdr>
 </file>
 
 <file path=word/numbering.xml><?xml version="1.0" encoding="utf-8"?>

</xml_diff>

<commit_message>
Pack 47.6: Sber statement v8 - horizontal label/value, green ITOGO, dashed closer, no line above closing balance
</commit_message>
<xml_diff>
--- a/templates/docx/bank_statement_template_044525225.docx
+++ b/templates/docx/bank_statement_template_044525225.docx
@@ -200,17 +200,18 @@
           <w:p/>
           <w:tbl>
             <w:tblGrid>
-              <w:gridCol w:w="5385"/>
+              <w:gridCol w:w="2267"/>
+              <w:gridCol w:w="3118"/>
             </w:tblGrid>
             <w:tblPr>
               <w:tblW w:type="auto" w:w="0"/>
               <w:tblLayout w:type="fixed"/>
               <w:tblLook w:firstColumn="1" w:firstRow="1" w:lastColumn="0" w:lastRow="0" w:noHBand="0" w:noVBand="1" w:val="04A0"/>
               <w:tblBorders>
-                <w:top w:val="nil"/>
-                <w:left w:val="nil"/>
-                <w:bottom w:val="nil"/>
-                <w:right w:val="nil"/>
+                <w:top w:val="single" w:sz="4" w:space="0" w:color="D8D8D8"/>
+                <w:left w:val="single" w:sz="4" w:space="0" w:color="D8D8D8"/>
+                <w:bottom w:val="single" w:sz="4" w:space="0" w:color="D8D8D8"/>
+                <w:right w:val="single" w:sz="4" w:space="0" w:color="D8D8D8"/>
                 <w:insideH w:val="nil"/>
                 <w:insideV w:val="nil"/>
               </w:tblBorders>
@@ -219,23 +220,18 @@
               <w:tc>
                 <w:tcPr>
                   <w:tcW w:type="dxa" w:w="5385"/>
+                  <w:gridSpan w:val="2"/>
+                  <w:shd w:val="clear" w:color="auto" w:fill="F5F5F5"/>
                   <w:tcMar>
                     <w:top w:w="80" w:type="dxa"/>
-                    <w:bottom w:w="80" w:type="dxa"/>
+                    <w:bottom w:w="20" w:type="dxa"/>
                     <w:left w:w="120" w:type="dxa"/>
                     <w:right w:w="120" w:type="dxa"/>
                   </w:tcMar>
-                  <w:shd w:val="clear" w:color="auto" w:fill="F5F5F5"/>
-                  <w:tcBorders>
-                    <w:top w:val="single" w:sz="4" w:color="D8D8D8" w:space="0"/>
-                    <w:bottom w:val="single" w:sz="4" w:color="D8D8D8" w:space="0"/>
-                    <w:left w:val="single" w:sz="4" w:color="D8D8D8" w:space="0"/>
-                    <w:right w:val="single" w:sz="4" w:color="D8D8D8" w:space="0"/>
-                  </w:tcBorders>
                 </w:tcPr>
                 <w:p>
                   <w:pPr>
-                    <w:spacing w:before="0" w:after="20"/>
+                    <w:spacing w:before="0" w:after="0"/>
                   </w:pPr>
                   <w:r>
                     <w:rPr>
@@ -246,9 +242,24 @@
                     <w:t>Владелец счёта</w:t>
                   </w:r>
                 </w:p>
+              </w:tc>
+            </w:tr>
+            <w:tr>
+              <w:tc>
+                <w:tcPr>
+                  <w:tcW w:type="dxa" w:w="5385"/>
+                  <w:gridSpan w:val="2"/>
+                  <w:shd w:val="clear" w:color="auto" w:fill="F5F5F5"/>
+                  <w:tcMar>
+                    <w:top w:w="0" w:type="dxa"/>
+                    <w:bottom w:w="80" w:type="dxa"/>
+                    <w:left w:w="120" w:type="dxa"/>
+                    <w:right w:w="120" w:type="dxa"/>
+                  </w:tcMar>
+                </w:tcPr>
                 <w:p>
                   <w:pPr>
-                    <w:spacing w:before="0" w:after="80"/>
+                    <w:spacing w:before="0" w:after="0"/>
                   </w:pPr>
                   <w:r>
                     <w:rPr>
@@ -260,17 +271,46 @@
                     <w:t>{{ applicant.full_name_native }}</w:t>
                   </w:r>
                 </w:p>
+              </w:tc>
+            </w:tr>
+            <w:tr>
+              <w:tc>
+                <w:tcPr>
+                  <w:tcW w:type="dxa" w:w="5385"/>
+                  <w:gridSpan w:val="2"/>
+                  <w:shd w:val="clear" w:color="auto" w:fill="F5F5F5"/>
+                  <w:tcMar>
+                    <w:top w:w="0" w:type="dxa"/>
+                    <w:bottom w:w="60" w:type="dxa"/>
+                    <w:left w:w="120" w:type="dxa"/>
+                    <w:right w:w="120" w:type="dxa"/>
+                  </w:tcMar>
+                </w:tcPr>
                 <w:p>
                   <w:pPr>
-                    <w:spacing w:before="0" w:after="120"/>
+                    <w:spacing w:before="0" w:after="0"/>
                     <w:pBdr>
                       <w:bottom w:val="dashed" w:sz="4" w:space="1" w:color="808080"/>
                     </w:pBdr>
                   </w:pPr>
                 </w:p>
+              </w:tc>
+            </w:tr>
+            <w:tr>
+              <w:tc>
+                <w:tcPr>
+                  <w:tcW w:type="dxa" w:w="2267"/>
+                  <w:tcMar>
+                    <w:top w:w="40" w:type="dxa"/>
+                    <w:bottom w:w="40" w:type="dxa"/>
+                    <w:left w:w="120" w:type="dxa"/>
+                    <w:right w:w="120" w:type="dxa"/>
+                  </w:tcMar>
+                  <w:shd w:val="clear" w:color="auto" w:fill="F5F5F5"/>
+                </w:tcPr>
                 <w:p>
                   <w:pPr>
-                    <w:spacing w:before="0" w:after="20"/>
+                    <w:spacing w:before="0" w:after="0"/>
                   </w:pPr>
                   <w:r>
                     <w:rPr>
@@ -281,9 +321,22 @@
                     <w:t>Номер счёта</w:t>
                   </w:r>
                 </w:p>
+              </w:tc>
+              <w:tc>
+                <w:tcPr>
+                  <w:tcW w:type="dxa" w:w="3118"/>
+                  <w:tcMar>
+                    <w:top w:w="40" w:type="dxa"/>
+                    <w:bottom w:w="40" w:type="dxa"/>
+                    <w:left w:w="120" w:type="dxa"/>
+                    <w:right w:w="120" w:type="dxa"/>
+                  </w:tcMar>
+                  <w:shd w:val="clear" w:color="auto" w:fill="F5F5F5"/>
+                </w:tcPr>
                 <w:p>
                   <w:pPr>
-                    <w:spacing w:before="0" w:after="80"/>
+                    <w:jc w:val="right"/>
+                    <w:spacing w:before="0" w:after="0"/>
                   </w:pPr>
                   <w:r>
                     <w:rPr>
@@ -295,9 +348,23 @@
                     <w:t>{{ applicant.bank_account }}</w:t>
                   </w:r>
                 </w:p>
+              </w:tc>
+            </w:tr>
+            <w:tr>
+              <w:tc>
+                <w:tcPr>
+                  <w:tcW w:type="dxa" w:w="2267"/>
+                  <w:tcMar>
+                    <w:top w:w="40" w:type="dxa"/>
+                    <w:bottom w:w="40" w:type="dxa"/>
+                    <w:left w:w="120" w:type="dxa"/>
+                    <w:right w:w="120" w:type="dxa"/>
+                  </w:tcMar>
+                  <w:shd w:val="clear" w:color="auto" w:fill="F5F5F5"/>
+                </w:tcPr>
                 <w:p>
                   <w:pPr>
-                    <w:spacing w:before="0" w:after="20"/>
+                    <w:spacing w:before="0" w:after="0"/>
                   </w:pPr>
                   <w:r>
                     <w:rPr>
@@ -308,9 +375,22 @@
                     <w:t>Валюта</w:t>
                   </w:r>
                 </w:p>
+              </w:tc>
+              <w:tc>
+                <w:tcPr>
+                  <w:tcW w:type="dxa" w:w="3118"/>
+                  <w:tcMar>
+                    <w:top w:w="40" w:type="dxa"/>
+                    <w:bottom w:w="40" w:type="dxa"/>
+                    <w:left w:w="120" w:type="dxa"/>
+                    <w:right w:w="120" w:type="dxa"/>
+                  </w:tcMar>
+                  <w:shd w:val="clear" w:color="auto" w:fill="F5F5F5"/>
+                </w:tcPr>
                 <w:p>
                   <w:pPr>
-                    <w:spacing w:before="0" w:after="80"/>
+                    <w:jc w:val="right"/>
+                    <w:spacing w:before="0" w:after="0"/>
                   </w:pPr>
                   <w:r>
                     <w:rPr>
@@ -321,9 +401,23 @@
                     <w:t>Российский рубль</w:t>
                   </w:r>
                 </w:p>
+              </w:tc>
+            </w:tr>
+            <w:tr>
+              <w:tc>
+                <w:tcPr>
+                  <w:tcW w:type="dxa" w:w="2267"/>
+                  <w:tcMar>
+                    <w:top w:w="40" w:type="dxa"/>
+                    <w:bottom w:w="40" w:type="dxa"/>
+                    <w:left w:w="120" w:type="dxa"/>
+                    <w:right w:w="120" w:type="dxa"/>
+                  </w:tcMar>
+                  <w:shd w:val="clear" w:color="auto" w:fill="F5F5F5"/>
+                </w:tcPr>
                 <w:p>
                   <w:pPr>
-                    <w:spacing w:before="0" w:after="20"/>
+                    <w:spacing w:before="0" w:after="0"/>
                   </w:pPr>
                   <w:r>
                     <w:rPr>
@@ -334,9 +428,22 @@
                     <w:t>Дата открытия счёта</w:t>
                   </w:r>
                 </w:p>
+              </w:tc>
+              <w:tc>
+                <w:tcPr>
+                  <w:tcW w:type="dxa" w:w="3118"/>
+                  <w:tcMar>
+                    <w:top w:w="40" w:type="dxa"/>
+                    <w:bottom w:w="40" w:type="dxa"/>
+                    <w:left w:w="120" w:type="dxa"/>
+                    <w:right w:w="120" w:type="dxa"/>
+                  </w:tcMar>
+                  <w:shd w:val="clear" w:color="auto" w:fill="F5F5F5"/>
+                </w:tcPr>
                 <w:p>
                   <w:pPr>
-                    <w:spacing w:before="0" w:after="80"/>
+                    <w:jc w:val="right"/>
+                    <w:spacing w:before="0" w:after="0"/>
                   </w:pPr>
                   <w:r>
                     <w:rPr>
@@ -347,9 +454,23 @@
                     <w:t>{{ bank.account_open_date_formatted }}</w:t>
                   </w:r>
                 </w:p>
+              </w:tc>
+            </w:tr>
+            <w:tr>
+              <w:tc>
+                <w:tcPr>
+                  <w:tcW w:type="dxa" w:w="2267"/>
+                  <w:tcMar>
+                    <w:top w:w="40" w:type="dxa"/>
+                    <w:bottom w:w="40" w:type="dxa"/>
+                    <w:left w:w="120" w:type="dxa"/>
+                    <w:right w:w="120" w:type="dxa"/>
+                  </w:tcMar>
+                  <w:shd w:val="clear" w:color="auto" w:fill="F5F5F5"/>
+                </w:tcPr>
                 <w:p>
                   <w:pPr>
-                    <w:spacing w:before="0" w:after="20"/>
+                    <w:spacing w:before="0" w:after="0"/>
                   </w:pPr>
                   <w:r>
                     <w:rPr>
@@ -360,9 +481,22 @@
                     <w:t>Дата закрытия счёта</w:t>
                   </w:r>
                 </w:p>
+              </w:tc>
+              <w:tc>
+                <w:tcPr>
+                  <w:tcW w:type="dxa" w:w="3118"/>
+                  <w:tcMar>
+                    <w:top w:w="40" w:type="dxa"/>
+                    <w:bottom w:w="40" w:type="dxa"/>
+                    <w:left w:w="120" w:type="dxa"/>
+                    <w:right w:w="120" w:type="dxa"/>
+                  </w:tcMar>
+                  <w:shd w:val="clear" w:color="auto" w:fill="F5F5F5"/>
+                </w:tcPr>
                 <w:p>
                   <w:pPr>
-                    <w:spacing w:before="0" w:after="80"/>
+                    <w:jc w:val="right"/>
+                    <w:spacing w:before="0" w:after="0"/>
                   </w:pPr>
                   <w:r>
                     <w:rPr>
@@ -437,7 +571,7 @@
                     <w:rPr>
                       <w:rFonts w:ascii="Arial" w:hAnsi="Arial" w:cs="Arial"/>
                       <w:b/>
-                      <w:color w:val="808080"/>
+                      <w:color w:val="21A038"/>
                       <w:sz w:val="16"/>
                     </w:rPr>
                     <w:t>ИТОГО ПО ОПЕРАЦИЯМ ЗА ПЕРИОД:</w:t>
@@ -667,10 +801,7 @@
                 </w:tbl>
                 <w:p>
                   <w:pPr>
-                    <w:spacing w:before="40" w:after="40"/>
-                    <w:pBdr>
-                      <w:bottom w:val="single" w:sz="4" w:space="1" w:color="BDBDBD"/>
-                    </w:pBdr>
+                    <w:spacing w:before="0" w:after="0" w:line="200" w:lineRule="exact"/>
                   </w:pPr>
                 </w:p>
                 <w:tbl>

</xml_diff>

<commit_message>
Pack 47.10: Sber statement v12 - strip empty p before tables in cell_right (compact ITOGO)
</commit_message>
<xml_diff>
--- a/templates/docx/bank_statement_template_044525225.docx
+++ b/templates/docx/bank_statement_template_044525225.docx
@@ -297,7 +297,7 @@
           </w:tcPr>
           <w:tbl>
             <w:tblPr>
-              <w:tblW w:w="5385" w:type="dxa"/>
+              <w:tblW w:w="0" w:type="auto"/>
               <w:tblBorders>
                 <w:top w:val="single" w:sz="4" w:space="0" w:color="D8D8D8"/>
                 <w:left w:val="single" w:sz="4" w:space="0" w:color="D8D8D8"/>
@@ -330,34 +330,14 @@
                   <w:pPr>
                     <w:spacing w:after="0"/>
                   </w:pPr>
-                  <w:proofErr w:type="spellStart"/>
                   <w:r>
                     <w:rPr>
                       <w:rFonts w:ascii="Arial" w:hAnsi="Arial" w:cs="Arial"/>
                       <w:color w:val="808080"/>
                       <w:sz w:val="16"/>
                     </w:rPr>
-                    <w:t>Владелец</w:t>
+                    <w:t>Владелец счёта</w:t>
                   </w:r>
-                  <w:proofErr w:type="spellEnd"/>
-                  <w:r>
-                    <w:rPr>
-                      <w:rFonts w:ascii="Arial" w:hAnsi="Arial" w:cs="Arial"/>
-                      <w:color w:val="808080"/>
-                      <w:sz w:val="16"/>
-                    </w:rPr>
-                    <w:t xml:space="preserve"> </w:t>
-                  </w:r>
-                  <w:proofErr w:type="spellStart"/>
-                  <w:r>
-                    <w:rPr>
-                      <w:rFonts w:ascii="Arial" w:hAnsi="Arial" w:cs="Arial"/>
-                      <w:color w:val="808080"/>
-                      <w:sz w:val="16"/>
-                    </w:rPr>
-                    <w:t>счёта</w:t>
-                  </w:r>
-                  <w:proofErr w:type="spellEnd"/>
                 </w:p>
               </w:tc>
             </w:tr>
@@ -697,7 +677,7 @@
                 </w:tcPr>
                 <w:p>
                   <w:pPr>
-                    <w:spacing w:after="40"/>
+                    <w:spacing w:after="0"/>
                     <w:rPr>
                       <w:lang w:val="ru-RU"/>
                     </w:rPr>
@@ -718,7 +698,7 @@
                     <w:pBdr>
                       <w:bottom w:val="single" w:sz="6" w:space="1" w:color="21A038"/>
                     </w:pBdr>
-                    <w:spacing w:after="0"/>
+                    <w:spacing w:after="0" w:line="72" w:lineRule="auto"/>
                     <w:rPr>
                       <w:lang w:val="ru-RU"/>
                     </w:rPr>
@@ -739,13 +719,13 @@
                     <w:tblLook w:val="04A0" w:firstRow="1" w:lastRow="0" w:firstColumn="1" w:lastColumn="0" w:noHBand="0" w:noVBand="1"/>
                   </w:tblPr>
                   <w:tblGrid>
-                    <w:gridCol w:w="2834"/>
-                    <w:gridCol w:w="1700"/>
+                    <w:gridCol w:w="2551"/>
+                    <w:gridCol w:w="1587"/>
                   </w:tblGrid>
                   <w:tr>
                     <w:tc>
                       <w:tcPr>
-                        <w:tcW w:w="2834" w:type="dxa"/>
+                        <w:tcW w:w="2551" w:type="dxa"/>
                         <w:tcMar>
                           <w:top w:w="60" w:type="dxa"/>
                           <w:left w:w="0" w:type="dxa"/>
@@ -841,7 +821,7 @@
                     </w:tc>
                     <w:tc>
                       <w:tcPr>
-                        <w:tcW w:w="1700" w:type="dxa"/>
+                        <w:tcW w:w="1587" w:type="dxa"/>
                         <w:tcMar>
                           <w:top w:w="60" w:type="dxa"/>
                           <w:left w:w="0" w:type="dxa"/>
@@ -878,7 +858,7 @@
                   <w:tr>
                     <w:tc>
                       <w:tcPr>
-                        <w:tcW w:w="2834" w:type="dxa"/>
+                        <w:tcW w:w="2551" w:type="dxa"/>
                         <w:tcMar>
                           <w:top w:w="60" w:type="dxa"/>
                           <w:left w:w="0" w:type="dxa"/>
@@ -902,7 +882,7 @@
                     </w:tc>
                     <w:tc>
                       <w:tcPr>
-                        <w:tcW w:w="1700" w:type="dxa"/>
+                        <w:tcW w:w="1587" w:type="dxa"/>
                         <w:tcMar>
                           <w:top w:w="60" w:type="dxa"/>
                           <w:left w:w="0" w:type="dxa"/>
@@ -930,7 +910,7 @@
                   <w:tr>
                     <w:tc>
                       <w:tcPr>
-                        <w:tcW w:w="2834" w:type="dxa"/>
+                        <w:tcW w:w="2551" w:type="dxa"/>
                         <w:tcMar>
                           <w:top w:w="60" w:type="dxa"/>
                           <w:left w:w="0" w:type="dxa"/>
@@ -954,7 +934,7 @@
                     </w:tc>
                     <w:tc>
                       <w:tcPr>
-                        <w:tcW w:w="1700" w:type="dxa"/>
+                        <w:tcW w:w="1587" w:type="dxa"/>
                         <w:tcMar>
                           <w:top w:w="60" w:type="dxa"/>
                           <w:left w:w="0" w:type="dxa"/>
@@ -979,34 +959,10 @@
                       </w:p>
                     </w:tc>
                   </w:tr>
-                </w:tbl>
-                <w:p>
-                  <w:pPr>
-                    <w:spacing w:after="0" w:line="160" w:lineRule="exact"/>
-                  </w:pPr>
-                </w:p>
-                <w:tbl>
-                  <w:tblPr>
-                    <w:tblW w:w="0" w:type="auto"/>
-                    <w:tblBorders>
-                      <w:top w:val="nil"/>
-                      <w:left w:val="nil"/>
-                      <w:bottom w:val="nil"/>
-                      <w:right w:val="nil"/>
-                      <w:insideH w:val="nil"/>
-                      <w:insideV w:val="nil"/>
-                    </w:tblBorders>
-                    <w:tblLayout w:type="fixed"/>
-                    <w:tblLook w:val="04A0" w:firstRow="1" w:lastRow="0" w:firstColumn="1" w:lastColumn="0" w:noHBand="0" w:noVBand="1"/>
-                  </w:tblPr>
-                  <w:tblGrid>
-                    <w:gridCol w:w="2834"/>
-                    <w:gridCol w:w="1700"/>
-                  </w:tblGrid>
                   <w:tr>
                     <w:tc>
                       <w:tcPr>
-                        <w:tcW w:w="2834" w:type="dxa"/>
+                        <w:tcW w:w="2551" w:type="dxa"/>
                         <w:tcMar>
                           <w:top w:w="60" w:type="dxa"/>
                           <w:left w:w="0" w:type="dxa"/>
@@ -1031,7 +987,7 @@
                     </w:tc>
                     <w:tc>
                       <w:tcPr>
-                        <w:tcW w:w="1700" w:type="dxa"/>
+                        <w:tcW w:w="1587" w:type="dxa"/>
                         <w:tcMar>
                           <w:top w:w="60" w:type="dxa"/>
                           <w:left w:w="0" w:type="dxa"/>
@@ -1149,7 +1105,16 @@
                 <w:sz w:val="16"/>
                 <w:lang w:val="ru-RU"/>
               </w:rPr>
-              <w:t>Дата обработки</w:t>
+              <w:t>Дата</w:t>
+            </w:r>
+            <w:r>
+              <w:rPr>
+                <w:rFonts w:ascii="Arial" w:hAnsi="Arial" w:cs="Arial"/>
+                <w:color w:val="808080"/>
+                <w:sz w:val="16"/>
+                <w:lang w:val="ru-RU"/>
+              </w:rPr>
+              <w:t xml:space="preserve"> обработки</w:t>
             </w:r>
             <w:r>
               <w:rPr>
@@ -2128,7 +2093,6 @@
           <w:vertAlign w:val="superscript"/>
           <w:lang w:val="ru-RU"/>
         </w:rPr>
-        <w:lastRenderedPageBreak/>
         <w:t>*</w:t>
       </w:r>
       <w:r>
@@ -2184,6 +2148,7 @@
           <w:sz w:val="16"/>
           <w:lang w:val="ru-RU"/>
         </w:rPr>
+        <w:lastRenderedPageBreak/>
         <w:t xml:space="preserve">Скачать электронный формат подписи можно в веб-версии </w:t>
       </w:r>
       <w:proofErr w:type="spellStart"/>
@@ -2232,10 +2197,19 @@
           <w:sz w:val="16"/>
           <w:lang w:val="ru-RU"/>
         </w:rPr>
-        <w:t>Проверить подпись можно в сервисе порта</w:t>
+        <w:t xml:space="preserve">Проверить подпись </w:t>
       </w:r>
       <w:bookmarkStart w:id="0" w:name="_GoBack"/>
       <w:bookmarkEnd w:id="0"/>
+      <w:r>
+        <w:rPr>
+          <w:rFonts w:ascii="Arial" w:hAnsi="Arial" w:cs="Arial"/>
+          <w:color w:val="1A1A1A"/>
+          <w:sz w:val="16"/>
+          <w:lang w:val="ru-RU"/>
+        </w:rPr>
+        <w:t>можно в сервисе порта</w:t>
+      </w:r>
       <w:r>
         <w:rPr>
           <w:rFonts w:ascii="Arial" w:hAnsi="Arial" w:cs="Arial"/>
@@ -14170,7 +14144,7 @@
 </file>
 
 <file path=customXml/itemProps1.xml><?xml version="1.0" encoding="utf-8"?>
-<ds:datastoreItem xmlns:ds="http://schemas.openxmlformats.org/officeDocument/2006/customXml" ds:itemID="{0B5CEC78-B232-4D11-94DE-21E3F496DC72}">
+<ds:datastoreItem xmlns:ds="http://schemas.openxmlformats.org/officeDocument/2006/customXml" ds:itemID="{EDB732C6-87B5-479A-8385-2CE758723389}">
   <ds:schemaRefs>
     <ds:schemaRef ds:uri="http://schemas.openxmlformats.org/officeDocument/2006/bibliography"/>
   </ds:schemaRefs>

</xml_diff>

<commit_message>
Pack 47.12: Sber statement v14 - line height for ITOGO, split header line, dashed sz=2, green line thicker
</commit_message>
<xml_diff>
--- a/templates/docx/bank_statement_template_044525225.docx
+++ b/templates/docx/bank_statement_template_044525225.docx
@@ -289,7 +289,7 @@
                   <w:pPr>
                     <w:spacing w:before="0" w:after="0" w:line="120" w:lineRule="exact"/>
                     <w:pBdr>
-                      <w:bottom w:val="dotted" w:sz="4" w:space="1" w:color="808080"/>
+                      <w:bottom w:val="dashed" w:sz="2" w:space="1" w:color="808080"/>
                     </w:pBdr>
                   </w:pPr>
                   <w:r>
@@ -571,7 +571,7 @@
                 </w:tcPr>
                 <w:p>
                   <w:pPr>
-                    <w:spacing w:before="0" w:after="0"/>
+                    <w:spacing w:before="0" w:after="0" w:line="200" w:lineRule="exact"/>
                   </w:pPr>
                   <w:r>
                     <w:rPr>
@@ -587,7 +587,7 @@
                   <w:pPr>
                     <w:spacing w:before="0" w:after="0"/>
                     <w:pBdr>
-                      <w:bottom w:val="single" w:sz="6" w:space="1" w:color="21A038"/>
+                      <w:bottom w:val="single" w:sz="12" w:space="1" w:color="21A038"/>
                     </w:pBdr>
                   </w:pPr>
                 </w:p>
@@ -925,9 +925,6 @@
               <w:left w:w="0" w:type="dxa"/>
               <w:right w:w="60" w:type="dxa"/>
             </w:tcMar>
-            <w:tcBorders>
-              <w:bottom w:val="single" w:sz="4" w:color="BDBDBD" w:space="0"/>
-            </w:tcBorders>
           </w:tcPr>
           <w:p>
             <w:pPr>
@@ -968,6 +965,9 @@
           <w:p>
             <w:pPr>
               <w:spacing w:before="0" w:after="0"/>
+              <w:pBdr>
+                <w:bottom w:val="single" w:sz="4" w:space="1" w:color="BDBDBD"/>
+              </w:pBdr>
             </w:pPr>
             <w:r>
               <w:rPr>
@@ -988,9 +988,6 @@
               <w:left w:w="0" w:type="dxa"/>
               <w:right w:w="60" w:type="dxa"/>
             </w:tcMar>
-            <w:tcBorders>
-              <w:bottom w:val="single" w:sz="4" w:color="BDBDBD" w:space="0"/>
-            </w:tcBorders>
           </w:tcPr>
           <w:p>
             <w:pPr>
@@ -1009,6 +1006,9 @@
           <w:p>
             <w:pPr>
               <w:spacing w:before="0" w:after="0"/>
+              <w:pBdr>
+                <w:bottom w:val="single" w:sz="4" w:space="1" w:color="BDBDBD"/>
+              </w:pBdr>
             </w:pPr>
             <w:r>
               <w:rPr>
@@ -1029,9 +1029,6 @@
               <w:left w:w="0" w:type="dxa"/>
               <w:right w:w="60" w:type="dxa"/>
             </w:tcMar>
-            <w:tcBorders>
-              <w:bottom w:val="single" w:sz="4" w:color="BDBDBD" w:space="0"/>
-            </w:tcBorders>
           </w:tcPr>
           <w:p>
             <w:pPr>
@@ -1066,6 +1063,9 @@
             <w:pPr>
               <w:jc w:val="right"/>
               <w:spacing w:before="0" w:after="0"/>
+              <w:pBdr>
+                <w:bottom w:val="single" w:sz="4" w:space="1" w:color="BDBDBD"/>
+              </w:pBdr>
             </w:pPr>
             <w:r>
               <w:rPr>
@@ -1095,9 +1095,6 @@
               <w:left w:w="0" w:type="dxa"/>
               <w:right w:w="60" w:type="dxa"/>
             </w:tcMar>
-            <w:tcBorders>
-              <w:bottom w:val="single" w:sz="4" w:color="BDBDBD" w:space="0"/>
-            </w:tcBorders>
           </w:tcPr>
           <w:p>
             <w:pPr>
@@ -1118,6 +1115,9 @@
             <w:pPr>
               <w:jc w:val="right"/>
               <w:spacing w:before="0" w:after="0"/>
+              <w:pBdr>
+                <w:bottom w:val="single" w:sz="4" w:space="1" w:color="BDBDBD"/>
+              </w:pBdr>
             </w:pPr>
             <w:r>
               <w:rPr>

</xml_diff>

<commit_message>
Pack 47.15: Sber statement v17 - runtime PNG EP badge
</commit_message>
<xml_diff>
--- a/templates/docx/bank_statement_template_044525225.docx
+++ b/templates/docx/bank_statement_template_044525225.docx
@@ -897,10 +897,10 @@
     </w:p>
     <w:tbl>
       <w:tblGrid>
-        <w:gridCol w:w="1587"/>
-        <w:gridCol w:w="4535"/>
-        <w:gridCol w:w="2040"/>
-        <w:gridCol w:w="2040"/>
+        <w:gridCol w:w="2154"/>
+        <w:gridCol w:w="3118"/>
+        <w:gridCol w:w="2834"/>
+        <w:gridCol w:w="2097"/>
       </w:tblGrid>
       <w:tblPr>
         <w:tblW w:type="auto" w:w="0"/>
@@ -916,15 +916,22 @@
         </w:tblBorders>
       </w:tblPr>
       <w:tr>
+        <w:trPr>
+          <w:trHeight w:val="1100" w:hRule="exact"/>
+        </w:trPr>
         <w:tc>
           <w:tcPr>
-            <w:tcW w:type="dxa" w:w="1587"/>
+            <w:tcW w:type="dxa" w:w="2154"/>
             <w:tcMar>
               <w:top w:w="40" w:type="dxa"/>
               <w:bottom w:w="60" w:type="dxa"/>
               <w:left w:w="0" w:type="dxa"/>
               <w:right w:w="60" w:type="dxa"/>
             </w:tcMar>
+            <w:tcBorders>
+              <w:bottom w:val="single" w:sz="4" w:color="BDBDBD" w:space="0"/>
+              <w:right w:val="single" w:sz="8" w:color="FFFFFF" w:space="0"/>
+            </w:tcBorders>
           </w:tcPr>
           <w:p>
             <w:pPr>
@@ -965,9 +972,6 @@
           <w:p>
             <w:pPr>
               <w:spacing w:before="0" w:after="0"/>
-              <w:pBdr>
-                <w:bottom w:val="single" w:sz="4" w:space="1" w:color="BDBDBD"/>
-              </w:pBdr>
             </w:pPr>
             <w:r>
               <w:rPr>
@@ -981,13 +985,17 @@
         </w:tc>
         <w:tc>
           <w:tcPr>
-            <w:tcW w:type="dxa" w:w="4535"/>
+            <w:tcW w:type="dxa" w:w="3118"/>
             <w:tcMar>
               <w:top w:w="40" w:type="dxa"/>
               <w:bottom w:w="60" w:type="dxa"/>
               <w:left w:w="0" w:type="dxa"/>
               <w:right w:w="60" w:type="dxa"/>
             </w:tcMar>
+            <w:tcBorders>
+              <w:bottom w:val="single" w:sz="4" w:color="BDBDBD" w:space="0"/>
+              <w:right w:val="single" w:sz="8" w:color="FFFFFF" w:space="0"/>
+            </w:tcBorders>
           </w:tcPr>
           <w:p>
             <w:pPr>
@@ -1006,9 +1014,6 @@
           <w:p>
             <w:pPr>
               <w:spacing w:before="0" w:after="0"/>
-              <w:pBdr>
-                <w:bottom w:val="single" w:sz="4" w:space="1" w:color="BDBDBD"/>
-              </w:pBdr>
             </w:pPr>
             <w:r>
               <w:rPr>
@@ -1022,13 +1027,17 @@
         </w:tc>
         <w:tc>
           <w:tcPr>
-            <w:tcW w:type="dxa" w:w="2040"/>
+            <w:tcW w:type="dxa" w:w="2834"/>
             <w:tcMar>
               <w:top w:w="40" w:type="dxa"/>
               <w:bottom w:w="60" w:type="dxa"/>
               <w:left w:w="0" w:type="dxa"/>
               <w:right w:w="60" w:type="dxa"/>
             </w:tcMar>
+            <w:tcBorders>
+              <w:bottom w:val="single" w:sz="4" w:color="BDBDBD" w:space="0"/>
+              <w:right w:val="single" w:sz="8" w:color="FFFFFF" w:space="0"/>
+            </w:tcBorders>
           </w:tcPr>
           <w:p>
             <w:pPr>
@@ -1063,9 +1072,6 @@
             <w:pPr>
               <w:jc w:val="right"/>
               <w:spacing w:before="0" w:after="0"/>
-              <w:pBdr>
-                <w:bottom w:val="single" w:sz="4" w:space="1" w:color="BDBDBD"/>
-              </w:pBdr>
             </w:pPr>
             <w:r>
               <w:rPr>
@@ -1088,13 +1094,16 @@
         </w:tc>
         <w:tc>
           <w:tcPr>
-            <w:tcW w:type="dxa" w:w="2040"/>
+            <w:tcW w:type="dxa" w:w="2097"/>
             <w:tcMar>
               <w:top w:w="40" w:type="dxa"/>
               <w:bottom w:w="60" w:type="dxa"/>
               <w:left w:w="0" w:type="dxa"/>
               <w:right w:w="60" w:type="dxa"/>
             </w:tcMar>
+            <w:tcBorders>
+              <w:bottom w:val="single" w:sz="4" w:color="BDBDBD" w:space="0"/>
+            </w:tcBorders>
           </w:tcPr>
           <w:p>
             <w:pPr>
@@ -1115,9 +1124,6 @@
             <w:pPr>
               <w:jc w:val="right"/>
               <w:spacing w:before="0" w:after="0"/>
-              <w:pBdr>
-                <w:bottom w:val="single" w:sz="4" w:space="1" w:color="BDBDBD"/>
-              </w:pBdr>
             </w:pPr>
             <w:r>
               <w:rPr>
@@ -1133,7 +1139,7 @@
       <w:tr>
         <w:tc>
           <w:tcPr>
-            <w:tcW w:type="dxa" w:w="1587"/>
+            <w:tcW w:type="dxa" w:w="2154"/>
             <w:tcMar>
               <w:top w:w="140" w:type="dxa"/>
               <w:bottom w:w="140" w:type="dxa"/>
@@ -1171,7 +1177,7 @@
         </w:tc>
         <w:tc>
           <w:tcPr>
-            <w:tcW w:type="dxa" w:w="4535"/>
+            <w:tcW w:type="dxa" w:w="3118"/>
             <w:tcMar>
               <w:top w:w="140" w:type="dxa"/>
               <w:bottom w:w="140" w:type="dxa"/>
@@ -1209,7 +1215,7 @@
         </w:tc>
         <w:tc>
           <w:tcPr>
-            <w:tcW w:type="dxa" w:w="2040"/>
+            <w:tcW w:type="dxa" w:w="2834"/>
             <w:tcMar>
               <w:top w:w="140" w:type="dxa"/>
               <w:bottom w:w="140" w:type="dxa"/>
@@ -1234,7 +1240,7 @@
         </w:tc>
         <w:tc>
           <w:tcPr>
-            <w:tcW w:type="dxa" w:w="2040"/>
+            <w:tcW w:type="dxa" w:w="2097"/>
             <w:tcMar>
               <w:top w:w="140" w:type="dxa"/>
               <w:bottom w:w="140" w:type="dxa"/>
@@ -1340,441 +1346,19 @@
             </w:tcMar>
             <w:vAlign w:val="top"/>
           </w:tcPr>
-          <w:p/>
-          <w:tbl>
-            <w:tblGrid>
-              <w:gridCol w:w="4535"/>
-            </w:tblGrid>
-            <w:tblPr>
-              <w:tblW w:type="auto" w:w="0"/>
-              <w:tblLayout w:type="fixed"/>
-              <w:tblLook w:firstColumn="1" w:firstRow="1" w:lastColumn="0" w:lastRow="0" w:noHBand="0" w:noVBand="1" w:val="04A0"/>
-              <w:tblBorders>
-                <w:top w:val="single" w:sz="6" w:space="0" w:color="296FCE"/>
-                <w:left w:val="single" w:sz="6" w:space="0" w:color="296FCE"/>
-                <w:bottom w:val="single" w:sz="6" w:space="0" w:color="296FCE"/>
-                <w:right w:val="single" w:sz="6" w:space="0" w:color="296FCE"/>
-                <w:insideH w:val="nil"/>
-                <w:insideV w:val="nil"/>
-              </w:tblBorders>
-            </w:tblPr>
-            <w:tr>
-              <w:tc>
-                <w:tcPr>
-                  <w:tcW w:type="dxa" w:w="4535"/>
-                  <w:tcMar>
-                    <w:top w:w="0" w:type="dxa"/>
-                    <w:bottom w:w="0" w:type="dxa"/>
-                    <w:left w:w="0" w:type="dxa"/>
-                    <w:right w:w="0" w:type="dxa"/>
-                  </w:tcMar>
-                </w:tcPr>
-                <w:p/>
-                <w:tbl>
-                  <w:tblGrid>
-                    <w:gridCol w:w="1020"/>
-                    <w:gridCol w:w="3514"/>
-                  </w:tblGrid>
-                  <w:tblPr>
-                    <w:tblW w:type="auto" w:w="0"/>
-                    <w:tblLayout w:type="fixed"/>
-                    <w:tblLook w:firstColumn="1" w:firstRow="1" w:lastColumn="0" w:lastRow="0" w:noHBand="0" w:noVBand="1" w:val="04A0"/>
-                    <w:tblBorders>
-                      <w:top w:val="nil"/>
-                      <w:left w:val="nil"/>
-                      <w:bottom w:val="nil"/>
-                      <w:right w:val="nil"/>
-                      <w:insideH w:val="nil"/>
-                      <w:insideV w:val="nil"/>
-                    </w:tblBorders>
-                  </w:tblPr>
-                  <w:tr>
-                    <w:tc>
-                      <w:tcPr>
-                        <w:tcW w:type="dxa" w:w="1020"/>
-                        <w:shd w:val="clear" w:color="auto" w:fill="EAF3FA"/>
-                        <w:tcMar>
-                          <w:top w:w="20" w:type="dxa"/>
-                          <w:bottom w:w="20" w:type="dxa"/>
-                          <w:left w:w="60" w:type="dxa"/>
-                          <w:right w:w="20" w:type="dxa"/>
-                        </w:tcMar>
-                        <w:vAlign w:val="center"/>
-                      </w:tcPr>
-                      <w:p>
-                        <w:pPr>
-                          <w:spacing w:before="0" w:after="0"/>
-                        </w:pPr>
-                        <w:r>
-                          <w:drawing>
-                            <wp:inline xmlns:a="http://schemas.openxmlformats.org/drawingml/2006/main" xmlns:pic="http://schemas.openxmlformats.org/drawingml/2006/picture">
-                              <wp:extent cx="468000" cy="127275"/>
-                              <wp:docPr id="2" name="Picture 2"/>
-                              <wp:cNvGraphicFramePr>
-                                <a:graphicFrameLocks noChangeAspect="1"/>
-                              </wp:cNvGraphicFramePr>
-                              <a:graphic>
-                                <a:graphicData uri="http://schemas.openxmlformats.org/drawingml/2006/picture">
-                                  <pic:pic>
-                                    <pic:nvPicPr>
-                                      <pic:cNvPr id="0" name="sber_logo.png"/>
-                                      <pic:cNvPicPr/>
-                                    </pic:nvPicPr>
-                                    <pic:blipFill>
-                                      <a:blip r:embed="rId9"/>
-                                      <a:stretch>
-                                        <a:fillRect/>
-                                      </a:stretch>
-                                    </pic:blipFill>
-                                    <pic:spPr>
-                                      <a:xfrm>
-                                        <a:off x="0" y="0"/>
-                                        <a:ext cx="468000" cy="127275"/>
-                                      </a:xfrm>
-                                      <a:prstGeom prst="rect"/>
-                                    </pic:spPr>
-                                  </pic:pic>
-                                </a:graphicData>
-                              </a:graphic>
-                            </wp:inline>
-                          </w:drawing>
-                        </w:r>
-                      </w:p>
-                    </w:tc>
-                    <w:tc>
-                      <w:tcPr>
-                        <w:tcW w:type="dxa" w:w="3514"/>
-                        <w:shd w:val="clear" w:color="auto" w:fill="EAF3FA"/>
-                        <w:tcMar>
-                          <w:top w:w="20" w:type="dxa"/>
-                          <w:bottom w:w="20" w:type="dxa"/>
-                          <w:left w:w="20" w:type="dxa"/>
-                          <w:right w:w="60" w:type="dxa"/>
-                        </w:tcMar>
-                        <w:vAlign w:val="center"/>
-                      </w:tcPr>
-                      <w:p>
-                        <w:pPr>
-                          <w:spacing w:before="0" w:after="0"/>
-                        </w:pPr>
-                        <w:r>
-                          <w:rPr>
-                            <w:rFonts w:ascii="Arial" w:hAnsi="Arial" w:cs="Arial"/>
-                            <w:b/>
-                            <w:color w:val="296FCE"/>
-                            <w:sz w:val="14"/>
-                          </w:rPr>
-                          <w:t>Документ подписан</w:t>
-                        </w:r>
-                      </w:p>
-                      <w:p>
-                        <w:pPr>
-                          <w:spacing w:before="0" w:after="0"/>
-                        </w:pPr>
-                        <w:r>
-                          <w:rPr>
-                            <w:rFonts w:ascii="Arial" w:hAnsi="Arial" w:cs="Arial"/>
-                            <w:b/>
-                            <w:color w:val="296FCE"/>
-                            <w:sz w:val="14"/>
-                          </w:rPr>
-                          <w:t>электронной подписью</w:t>
-                        </w:r>
-                        <w:r>
-                          <w:rPr>
-                            <w:rFonts w:ascii="Arial" w:hAnsi="Arial" w:cs="Arial"/>
-                            <w:color w:val="296FCE"/>
-                            <w:sz w:val="10"/>
-                            <w:vertAlign w:val="superscript"/>
-                          </w:rPr>
-                          <w:t>*</w:t>
-                        </w:r>
-                      </w:p>
-                    </w:tc>
-                  </w:tr>
-                </w:tbl>
-                <w:p/>
-                <w:tbl>
-                  <w:tblGrid>
-                    <w:gridCol w:w="4535"/>
-                  </w:tblGrid>
-                  <w:tblPr>
-                    <w:tblW w:type="auto" w:w="0"/>
-                    <w:tblLayout w:type="fixed"/>
-                    <w:tblLook w:firstColumn="1" w:firstRow="1" w:lastColumn="0" w:lastRow="0" w:noHBand="0" w:noVBand="1" w:val="04A0"/>
-                    <w:tblBorders>
-                      <w:top w:val="nil"/>
-                      <w:left w:val="nil"/>
-                      <w:bottom w:val="nil"/>
-                      <w:right w:val="nil"/>
-                      <w:insideH w:val="nil"/>
-                      <w:insideV w:val="nil"/>
-                    </w:tblBorders>
-                  </w:tblPr>
-                  <w:tr>
-                    <w:tc>
-                      <w:tcPr>
-                        <w:tcW w:type="dxa" w:w="4535"/>
-                        <w:shd w:val="clear" w:color="auto" w:fill="296FCE"/>
-                        <w:tcMar>
-                          <w:top w:w="20" w:type="dxa"/>
-                          <w:bottom w:w="20" w:type="dxa"/>
-                          <w:left w:w="60" w:type="dxa"/>
-                          <w:right w:w="60" w:type="dxa"/>
-                        </w:tcMar>
-                      </w:tcPr>
-                      <w:p>
-                        <w:pPr>
-                          <w:jc w:val="center"/>
-                          <w:spacing w:before="0" w:after="0"/>
-                        </w:pPr>
-                        <w:r>
-                          <w:rPr>
-                            <w:rFonts w:ascii="Arial" w:hAnsi="Arial" w:cs="Arial"/>
-                            <w:b/>
-                            <w:color w:val="FFFFFF"/>
-                            <w:sz w:val="14"/>
-                          </w:rPr>
-                          <w:t>СВЕДЕНИЯ О СЕРТИФИКАТЕ ЭП</w:t>
-                        </w:r>
-                      </w:p>
-                    </w:tc>
-                  </w:tr>
-                </w:tbl>
-                <w:p/>
-                <w:tbl>
-                  <w:tblGrid>
-                    <w:gridCol w:w="1360"/>
-                    <w:gridCol w:w="3174"/>
-                  </w:tblGrid>
-                  <w:tblPr>
-                    <w:tblW w:type="auto" w:w="0"/>
-                    <w:tblLayout w:type="fixed"/>
-                    <w:tblLook w:firstColumn="1" w:firstRow="1" w:lastColumn="0" w:lastRow="0" w:noHBand="0" w:noVBand="1" w:val="04A0"/>
-                    <w:tblBorders>
-                      <w:top w:val="nil"/>
-                      <w:left w:val="nil"/>
-                      <w:bottom w:val="nil"/>
-                      <w:right w:val="nil"/>
-                      <w:insideH w:val="nil"/>
-                      <w:insideV w:val="nil"/>
-                    </w:tblBorders>
-                  </w:tblPr>
-                  <w:tr>
-                    <w:tc>
-                      <w:tcPr>
-                        <w:tcW w:type="dxa" w:w="1360"/>
-                        <w:tcMar>
-                          <w:top w:w="10" w:type="dxa"/>
-                          <w:bottom w:w="10" w:type="dxa"/>
-                          <w:left w:w="60" w:type="dxa"/>
-                          <w:right w:w="60" w:type="dxa"/>
-                        </w:tcMar>
-                        <w:shd w:val="clear" w:color="auto" w:fill="EAF3FA"/>
-                      </w:tcPr>
-                      <w:p>
-                        <w:pPr>
-                          <w:spacing w:before="0" w:after="0"/>
-                        </w:pPr>
-                        <w:r>
-                          <w:rPr>
-                            <w:rFonts w:ascii="Arial" w:hAnsi="Arial" w:cs="Arial"/>
-                            <w:color w:val="296FCE"/>
-                            <w:sz w:val="14"/>
-                          </w:rPr>
-                          <w:t>Сертификат:</w:t>
-                        </w:r>
-                      </w:p>
-                    </w:tc>
-                    <w:tc>
-                      <w:tcPr>
-                        <w:tcW w:type="dxa" w:w="3174"/>
-                        <w:tcMar>
-                          <w:top w:w="10" w:type="dxa"/>
-                          <w:bottom w:w="10" w:type="dxa"/>
-                          <w:left w:w="60" w:type="dxa"/>
-                          <w:right w:w="60" w:type="dxa"/>
-                        </w:tcMar>
-                        <w:shd w:val="clear" w:color="auto" w:fill="EAF3FA"/>
-                      </w:tcPr>
-                      <w:p>
-                        <w:pPr>
-                          <w:spacing w:before="0" w:after="0"/>
-                        </w:pPr>
-                        <w:r>
-                          <w:rPr>
-                            <w:rFonts w:ascii="Arial" w:hAnsi="Arial" w:cs="Arial"/>
-                            <w:color w:val="1A1A1A"/>
-                            <w:sz w:val="14"/>
-                          </w:rPr>
-                          <w:t>40601D00C08FCE2CD999F93A68651986</w:t>
-                        </w:r>
-                      </w:p>
-                    </w:tc>
-                  </w:tr>
-                  <w:tr>
-                    <w:tc>
-                      <w:tcPr>
-                        <w:tcW w:type="dxa" w:w="1360"/>
-                        <w:tcMar>
-                          <w:top w:w="10" w:type="dxa"/>
-                          <w:bottom w:w="10" w:type="dxa"/>
-                          <w:left w:w="60" w:type="dxa"/>
-                          <w:right w:w="60" w:type="dxa"/>
-                        </w:tcMar>
-                        <w:shd w:val="clear" w:color="auto" w:fill="EAF3FA"/>
-                      </w:tcPr>
-                      <w:p>
-                        <w:pPr>
-                          <w:spacing w:before="0" w:after="0"/>
-                        </w:pPr>
-                        <w:r>
-                          <w:rPr>
-                            <w:rFonts w:ascii="Arial" w:hAnsi="Arial" w:cs="Arial"/>
-                            <w:color w:val="296FCE"/>
-                            <w:sz w:val="14"/>
-                          </w:rPr>
-                          <w:t>Владелец:</w:t>
-                        </w:r>
-                      </w:p>
-                    </w:tc>
-                    <w:tc>
-                      <w:tcPr>
-                        <w:tcW w:type="dxa" w:w="3174"/>
-                        <w:tcMar>
-                          <w:top w:w="10" w:type="dxa"/>
-                          <w:bottom w:w="10" w:type="dxa"/>
-                          <w:left w:w="60" w:type="dxa"/>
-                          <w:right w:w="60" w:type="dxa"/>
-                        </w:tcMar>
-                        <w:shd w:val="clear" w:color="auto" w:fill="EAF3FA"/>
-                      </w:tcPr>
-                      <w:p>
-                        <w:pPr>
-                          <w:spacing w:before="0" w:after="0"/>
-                        </w:pPr>
-                        <w:r>
-                          <w:rPr>
-                            <w:rFonts w:ascii="Arial" w:hAnsi="Arial" w:cs="Arial"/>
-                            <w:b/>
-                            <w:color w:val="1A1A1A"/>
-                            <w:sz w:val="14"/>
-                          </w:rPr>
-                          <w:t>ПАО Сбербанк России</w:t>
-                        </w:r>
-                      </w:p>
-                    </w:tc>
-                  </w:tr>
-                  <w:tr>
-                    <w:tc>
-                      <w:tcPr>
-                        <w:tcW w:type="dxa" w:w="1360"/>
-                        <w:tcMar>
-                          <w:top w:w="10" w:type="dxa"/>
-                          <w:bottom w:w="10" w:type="dxa"/>
-                          <w:left w:w="60" w:type="dxa"/>
-                          <w:right w:w="60" w:type="dxa"/>
-                        </w:tcMar>
-                        <w:shd w:val="clear" w:color="auto" w:fill="EAF3FA"/>
-                      </w:tcPr>
-                      <w:p>
-                        <w:pPr>
-                          <w:spacing w:before="0" w:after="0"/>
-                        </w:pPr>
-                        <w:r>
-                          <w:rPr>
-                            <w:rFonts w:ascii="Arial" w:hAnsi="Arial" w:cs="Arial"/>
-                            <w:color w:val="296FCE"/>
-                            <w:sz w:val="14"/>
-                          </w:rPr>
-                          <w:t>Действителен:</w:t>
-                        </w:r>
-                      </w:p>
-                    </w:tc>
-                    <w:tc>
-                      <w:tcPr>
-                        <w:tcW w:type="dxa" w:w="3174"/>
-                        <w:tcMar>
-                          <w:top w:w="10" w:type="dxa"/>
-                          <w:bottom w:w="10" w:type="dxa"/>
-                          <w:left w:w="60" w:type="dxa"/>
-                          <w:right w:w="60" w:type="dxa"/>
-                        </w:tcMar>
-                        <w:shd w:val="clear" w:color="auto" w:fill="EAF3FA"/>
-                      </w:tcPr>
-                      <w:p>
-                        <w:pPr>
-                          <w:spacing w:before="0" w:after="0"/>
-                        </w:pPr>
-                        <w:r>
-                          <w:rPr>
-                            <w:rFonts w:ascii="Arial" w:hAnsi="Arial" w:cs="Arial"/>
-                            <w:color w:val="1A1A1A"/>
-                            <w:sz w:val="14"/>
-                          </w:rPr>
-                          <w:t>с 02.07.2025 по 02.10.2026</w:t>
-                        </w:r>
-                      </w:p>
-                    </w:tc>
-                  </w:tr>
-                  <w:tr>
-                    <w:tc>
-                      <w:tcPr>
-                        <w:tcW w:type="dxa" w:w="1360"/>
-                        <w:tcMar>
-                          <w:top w:w="10" w:type="dxa"/>
-                          <w:bottom w:w="10" w:type="dxa"/>
-                          <w:left w:w="60" w:type="dxa"/>
-                          <w:right w:w="60" w:type="dxa"/>
-                        </w:tcMar>
-                        <w:shd w:val="clear" w:color="auto" w:fill="EAF3FA"/>
-                      </w:tcPr>
-                      <w:p>
-                        <w:pPr>
-                          <w:spacing w:before="0" w:after="0"/>
-                        </w:pPr>
-                        <w:r>
-                          <w:rPr>
-                            <w:rFonts w:ascii="Arial" w:hAnsi="Arial" w:cs="Arial"/>
-                            <w:color w:val="296FCE"/>
-                            <w:sz w:val="14"/>
-                          </w:rPr>
-                          <w:t>Дата подписи:</w:t>
-                        </w:r>
-                      </w:p>
-                    </w:tc>
-                    <w:tc>
-                      <w:tcPr>
-                        <w:tcW w:type="dxa" w:w="3174"/>
-                        <w:tcMar>
-                          <w:top w:w="10" w:type="dxa"/>
-                          <w:bottom w:w="10" w:type="dxa"/>
-                          <w:left w:w="60" w:type="dxa"/>
-                          <w:right w:w="60" w:type="dxa"/>
-                        </w:tcMar>
-                        <w:shd w:val="clear" w:color="auto" w:fill="EAF3FA"/>
-                      </w:tcPr>
-                      <w:p>
-                        <w:pPr>
-                          <w:spacing w:before="0" w:after="0"/>
-                        </w:pPr>
-                        <w:r>
-                          <w:rPr>
-                            <w:rFonts w:ascii="Arial" w:hAnsi="Arial" w:cs="Arial"/>
-                            <w:color w:val="1A1A1A"/>
-                            <w:sz w:val="14"/>
-                          </w:rPr>
-                          <w:t>{{ bank.statement_date_formatted }}</w:t>
-                        </w:r>
-                      </w:p>
-                    </w:tc>
-                  </w:tr>
-                </w:tbl>
-                <w:p/>
-              </w:tc>
-            </w:tr>
-          </w:tbl>
-          <w:p/>
+          <w:p>
+            <w:pPr>
+              <w:spacing w:before="0" w:after="0"/>
+            </w:pPr>
+            <w:r>
+              <w:rPr>
+                <w:rFonts w:ascii="Arial" w:hAnsi="Arial" w:cs="Arial"/>
+                <w:color w:val="1A1A1A"/>
+                <w:sz w:val="16"/>
+              </w:rPr>
+              <w:t>__EP_BADGE__</w:t>
+            </w:r>
+          </w:p>
         </w:tc>
       </w:tr>
     </w:tbl>

</xml_diff>

<commit_message>
Pack 47.22: info-block values left-aligned (match Sber etalon)
</commit_message>
<xml_diff>
--- a/templates/docx/bank_statement_template_044525225.docx
+++ b/templates/docx/bank_statement_template_044525225.docx
@@ -336,13 +336,13 @@
                   <w:tcMar>
                     <w:top w:w="60" w:type="dxa"/>
                     <w:bottom w:w="60" w:type="dxa"/>
-                    <w:left w:w="0" w:type="dxa"/>
+                    <w:left w:w="200" w:type="dxa"/>
                     <w:right w:w="400" w:type="dxa"/>
                   </w:tcMar>
                 </w:tcPr>
                 <w:p>
                   <w:pPr>
-                    <w:jc w:val="right"/>
+                    <w:jc w:val="left"/>
                     <w:spacing w:before="0" w:after="0"/>
                   </w:pPr>
                   <w:r>
@@ -390,13 +390,13 @@
                   <w:tcMar>
                     <w:top w:w="60" w:type="dxa"/>
                     <w:bottom w:w="60" w:type="dxa"/>
-                    <w:left w:w="0" w:type="dxa"/>
+                    <w:left w:w="200" w:type="dxa"/>
                     <w:right w:w="400" w:type="dxa"/>
                   </w:tcMar>
                 </w:tcPr>
                 <w:p>
                   <w:pPr>
-                    <w:jc w:val="right"/>
+                    <w:jc w:val="left"/>
                     <w:spacing w:before="0" w:after="0"/>
                   </w:pPr>
                   <w:r>
@@ -443,13 +443,13 @@
                   <w:tcMar>
                     <w:top w:w="60" w:type="dxa"/>
                     <w:bottom w:w="60" w:type="dxa"/>
-                    <w:left w:w="0" w:type="dxa"/>
+                    <w:left w:w="200" w:type="dxa"/>
                     <w:right w:w="400" w:type="dxa"/>
                   </w:tcMar>
                 </w:tcPr>
                 <w:p>
                   <w:pPr>
-                    <w:jc w:val="right"/>
+                    <w:jc w:val="left"/>
                     <w:spacing w:before="0" w:after="0"/>
                   </w:pPr>
                   <w:r>
@@ -496,13 +496,13 @@
                   <w:tcMar>
                     <w:top w:w="60" w:type="dxa"/>
                     <w:bottom w:w="60" w:type="dxa"/>
-                    <w:left w:w="0" w:type="dxa"/>
+                    <w:left w:w="200" w:type="dxa"/>
                     <w:right w:w="400" w:type="dxa"/>
                   </w:tcMar>
                 </w:tcPr>
                 <w:p>
                   <w:pPr>
-                    <w:jc w:val="right"/>
+                    <w:jc w:val="left"/>
                     <w:spacing w:before="0" w:after="0"/>
                   </w:pPr>
                   <w:r>
@@ -1380,15 +1380,7 @@
           <w:color w:val="1A1A1A"/>
           <w:sz w:val="16"/>
         </w:rPr>
-        <w:t>ПАО Сбербанк. Генеральная лицензия Банка России на осуществление банковских операций № 1481 от 11.08.2015.</w:t>
-      </w:r>
-      <w:r>
-        <w:rPr>
-          <w:rFonts w:ascii="Arial" w:hAnsi="Arial" w:cs="Arial"/>
-          <w:color w:val="1A1A1A"/>
-          <w:sz w:val="16"/>
-        </w:rPr>
-        <w:t xml:space="preserve"> Денежные средства списываются после получения банком подтверждения о проведении финансовой операции. В выписке отображаются только обработанные в заданном периоде операции. Срок обработки операций до 4 дней, но в редких случаях до 30 дней.</w:t>
+        <w:t>ПАО Сбербанк. Генеральная лицензия Банка России на осуществление банковских операций № 1481 от 11.08.2015. Денежные средства списываются после получения банком подтверждения о проведении финансовой операции. В выписке отображаются только обработанные в заданном периоде операции. Срок обработки операций до 4 дней, но в редких случаях до 30 дней.</w:t>
       </w:r>
     </w:p>
     <w:p>

</xml_diff>

<commit_message>
Pack 49.1: Sber continuation footer via IF-field
</commit_message>
<xml_diff>
--- a/templates/docx/bank_statement_template_044525225.docx
+++ b/templates/docx/bank_statement_template_044525225.docx
@@ -1266,23 +1266,6 @@
         </w:tc>
       </w:tr>
     </w:tbl>
-    <w:p>
-      <w:pPr>
-        <w:jc w:val="center"/>
-        <w:spacing w:before="240" w:after="160"/>
-        <w:pBdr>
-          <w:bottom w:val="single" w:sz="4" w:space="1" w:color="D8D8D8"/>
-        </w:pBdr>
-      </w:pPr>
-      <w:r>
-        <w:rPr>
-          <w:rFonts w:ascii="Arial" w:hAnsi="Arial" w:cs="Arial"/>
-          <w:color w:val="808080"/>
-          <w:sz w:val="16"/>
-        </w:rPr>
-        <w:t>Продолжение на следующей странице</w:t>
-      </w:r>
-    </w:p>
     <w:tbl>
       <w:tblGrid>
         <w:gridCol w:w="5669"/>
@@ -1478,6 +1461,7 @@
       </w:r>
     </w:p>
     <w:sectPr>
+      <w:footerReference w:type="default" r:id="rId10"/>
       <w:pgSz w:w="11906" w:h="16838"/>
       <w:pgMar w:top="850" w:right="850" w:bottom="850" w:left="850" w:header="720" w:footer="720" w:gutter="0"/>
       <w:cols w:space="720"/>
@@ -1485,6 +1469,152 @@
     </w:sectPr>
   </w:body>
 </w:document>
+</file>
+
+<file path=word/footer1.xml><?xml version="1.0" encoding="utf-8"?>
+<w:ftr xmlns:m="http://schemas.openxmlformats.org/officeDocument/2006/math" xmlns:mc="http://schemas.openxmlformats.org/markup-compatibility/2006" xmlns:mo="http://schemas.microsoft.com/office/mac/office/2008/main" xmlns:mv="urn:schemas-microsoft-com:mac:vml" xmlns:o="urn:schemas-microsoft-com:office:office" xmlns:r="http://schemas.openxmlformats.org/officeDocument/2006/relationships" xmlns:v="urn:schemas-microsoft-com:vml" xmlns:w10="urn:schemas-microsoft-com:office:word" xmlns:w14="http://schemas.microsoft.com/office/word/2010/wordml" xmlns:w="http://schemas.openxmlformats.org/wordprocessingml/2006/main" xmlns:wne="http://schemas.microsoft.com/office/word/2006/wordml" xmlns:wp14="http://schemas.microsoft.com/office/word/2010/wordprocessingDrawing" xmlns:wp="http://schemas.openxmlformats.org/drawingml/2006/wordprocessingDrawing" xmlns:wpc="http://schemas.microsoft.com/office/word/2010/wordprocessingCanvas" xmlns:wpg="http://schemas.microsoft.com/office/word/2010/wordprocessingGroup" xmlns:wpi="http://schemas.microsoft.com/office/word/2010/wordprocessingInk" xmlns:wps="http://schemas.microsoft.com/office/word/2010/wordprocessingShape" mc:Ignorable="w14 wp14">
+  <w:p>
+    <w:pPr>
+      <w:pStyle w:val="Footer"/>
+    </w:pPr>
+    <w:r>
+      <w:rPr>
+        <w:rFonts w:ascii="Arial" w:hAnsi="Arial" w:cs="Arial"/>
+        <w:color w:val="808080"/>
+        <w:sz w:val="16"/>
+      </w:rPr>
+      <w:fldChar w:fldCharType="begin"/>
+    </w:r>
+    <w:r>
+      <w:rPr>
+        <w:rFonts w:ascii="Arial" w:hAnsi="Arial" w:cs="Arial"/>
+        <w:color w:val="808080"/>
+        <w:sz w:val="16"/>
+      </w:rPr>
+      <w:instrText xml:space="preserve"> IF </w:instrText>
+    </w:r>
+    <w:r>
+      <w:rPr>
+        <w:rFonts w:ascii="Arial" w:hAnsi="Arial" w:cs="Arial"/>
+        <w:color w:val="808080"/>
+        <w:sz w:val="16"/>
+      </w:rPr>
+      <w:fldChar w:fldCharType="begin"/>
+    </w:r>
+    <w:r>
+      <w:rPr>
+        <w:rFonts w:ascii="Arial" w:hAnsi="Arial" w:cs="Arial"/>
+        <w:color w:val="808080"/>
+        <w:sz w:val="16"/>
+      </w:rPr>
+      <w:instrText xml:space="preserve"> PAGE </w:instrText>
+    </w:r>
+    <w:r>
+      <w:rPr>
+        <w:rFonts w:ascii="Arial" w:hAnsi="Arial" w:cs="Arial"/>
+        <w:color w:val="808080"/>
+        <w:sz w:val="16"/>
+      </w:rPr>
+      <w:fldChar w:fldCharType="separate"/>
+    </w:r>
+    <w:r>
+      <w:rPr>
+        <w:rFonts w:ascii="Arial" w:hAnsi="Arial" w:cs="Arial"/>
+        <w:color w:val="808080"/>
+        <w:sz w:val="16"/>
+      </w:rPr>
+      <w:t xml:space="preserve"/>
+    </w:r>
+    <w:r>
+      <w:rPr>
+        <w:rFonts w:ascii="Arial" w:hAnsi="Arial" w:cs="Arial"/>
+        <w:color w:val="808080"/>
+        <w:sz w:val="16"/>
+      </w:rPr>
+      <w:fldChar w:fldCharType="end"/>
+    </w:r>
+    <w:r>
+      <w:rPr>
+        <w:rFonts w:ascii="Arial" w:hAnsi="Arial" w:cs="Arial"/>
+        <w:color w:val="808080"/>
+        <w:sz w:val="16"/>
+      </w:rPr>
+      <w:instrText xml:space="preserve"> = </w:instrText>
+    </w:r>
+    <w:r>
+      <w:rPr>
+        <w:rFonts w:ascii="Arial" w:hAnsi="Arial" w:cs="Arial"/>
+        <w:color w:val="808080"/>
+        <w:sz w:val="16"/>
+      </w:rPr>
+      <w:fldChar w:fldCharType="begin"/>
+    </w:r>
+    <w:r>
+      <w:rPr>
+        <w:rFonts w:ascii="Arial" w:hAnsi="Arial" w:cs="Arial"/>
+        <w:color w:val="808080"/>
+        <w:sz w:val="16"/>
+      </w:rPr>
+      <w:instrText xml:space="preserve"> NUMPAGES </w:instrText>
+    </w:r>
+    <w:r>
+      <w:rPr>
+        <w:rFonts w:ascii="Arial" w:hAnsi="Arial" w:cs="Arial"/>
+        <w:color w:val="808080"/>
+        <w:sz w:val="16"/>
+      </w:rPr>
+      <w:fldChar w:fldCharType="separate"/>
+    </w:r>
+    <w:r>
+      <w:rPr>
+        <w:rFonts w:ascii="Arial" w:hAnsi="Arial" w:cs="Arial"/>
+        <w:color w:val="808080"/>
+        <w:sz w:val="16"/>
+      </w:rPr>
+      <w:t xml:space="preserve"/>
+    </w:r>
+    <w:r>
+      <w:rPr>
+        <w:rFonts w:ascii="Arial" w:hAnsi="Arial" w:cs="Arial"/>
+        <w:color w:val="808080"/>
+        <w:sz w:val="16"/>
+      </w:rPr>
+      <w:fldChar w:fldCharType="end"/>
+    </w:r>
+    <w:r>
+      <w:rPr>
+        <w:rFonts w:ascii="Arial" w:hAnsi="Arial" w:cs="Arial"/>
+        <w:color w:val="808080"/>
+        <w:sz w:val="16"/>
+      </w:rPr>
+      <w:instrText xml:space="preserve"> "" "Продолжение на следующей странице"</w:instrText>
+    </w:r>
+    <w:r>
+      <w:rPr>
+        <w:rFonts w:ascii="Arial" w:hAnsi="Arial" w:cs="Arial"/>
+        <w:color w:val="808080"/>
+        <w:sz w:val="16"/>
+      </w:rPr>
+      <w:fldChar w:fldCharType="separate"/>
+    </w:r>
+    <w:r>
+      <w:rPr>
+        <w:rFonts w:ascii="Arial" w:hAnsi="Arial" w:cs="Arial"/>
+        <w:color w:val="808080"/>
+        <w:sz w:val="16"/>
+      </w:rPr>
+      <w:t xml:space="preserve"/>
+    </w:r>
+    <w:r>
+      <w:rPr>
+        <w:rFonts w:ascii="Arial" w:hAnsi="Arial" w:cs="Arial"/>
+        <w:color w:val="808080"/>
+        <w:sz w:val="16"/>
+      </w:rPr>
+      <w:fldChar w:fldCharType="end"/>
+    </w:r>
+  </w:p>
+</w:ftr>
 </file>
 
 <file path=word/numbering.xml><?xml version="1.0" encoding="utf-8"?>

</xml_diff>